<commit_message>
23/7 Add asset owner name to the ticket form
The form only captured asset_owner, which is the owning unit/department. There
was no way to record the individual responsible for the asset, so the report
could not name them and there was nothing to follow up against.

Adds asset_owner_name alongside it - free text by design, since this names an
employee for reporting and tracking and that person is not expected to hold an
account in this system. It is deliberately not the dormant system_owner FK.

Wired through the create form, the ticket edit form, the per-target rows of the
project incident (bundle) form, the ticket detail page, and both places the
NCSA report shows the owning unit. Report template regenerated from the build
script so its placeholders stay in step with the export context.

Co-Authored-By: Claude Opus 4.8 <noreply@anthropic.com>
</commit_message>
<xml_diff>
--- a/apps/incidents/report_templates/report_template_v2.docx
+++ b/apps/incidents/report_templates/report_template_v2.docx
@@ -1217,6 +1217,61 @@
                 <w:color w:val="404040"/>
                 <w:sz w:val="28"/>
               </w:rPr>
+              <w:t>ชื่อเจ้าของทรัพย์สิน</w:t>
+            </w:r>
+          </w:p>
+        </w:tc>
+        <w:tc>
+          <w:tcPr>
+            <w:tcW w:type="dxa" w:w="6192"/>
+            <w:vAlign w:val="center"/>
+            <w:tcMar>
+              <w:top w:w="60" w:type="dxa"/>
+              <w:start w:w="120" w:type="dxa"/>
+              <w:bottom w:w="60" w:type="dxa"/>
+              <w:end w:w="120" w:type="dxa"/>
+            </w:tcMar>
+          </w:tcPr>
+          <w:p>
+            <w:pPr>
+              <w:spacing w:after="0" w:before="0"/>
+            </w:pPr>
+            <w:r>
+              <w:rPr>
+                <w:rFonts w:ascii="TH Sarabun New" w:hAnsi="TH Sarabun New" w:cs="TH Sarabun New"/>
+                <w:b w:val="0"/>
+                <w:color w:val="404040"/>
+                <w:sz w:val="28"/>
+              </w:rPr>
+              <w:t>{{asset_owner_name}}</w:t>
+            </w:r>
+          </w:p>
+        </w:tc>
+      </w:tr>
+      <w:tr>
+        <w:tc>
+          <w:tcPr>
+            <w:tcW w:type="dxa" w:w="3312"/>
+            <w:vAlign w:val="center"/>
+            <w:tcMar>
+              <w:top w:w="60" w:type="dxa"/>
+              <w:start w:w="120" w:type="dxa"/>
+              <w:bottom w:w="60" w:type="dxa"/>
+              <w:end w:w="120" w:type="dxa"/>
+            </w:tcMar>
+            <w:shd w:val="clear" w:fill="F2F2F2"/>
+          </w:tcPr>
+          <w:p>
+            <w:pPr>
+              <w:spacing w:after="0" w:before="0"/>
+            </w:pPr>
+            <w:r>
+              <w:rPr>
+                <w:rFonts w:ascii="TH Sarabun New" w:hAnsi="TH Sarabun New" w:cs="TH Sarabun New"/>
+                <w:b/>
+                <w:color w:val="404040"/>
+                <w:sz w:val="28"/>
+              </w:rPr>
               <w:t>ระบบที่ได้รับผลกระทบ</w:t>
             </w:r>
           </w:p>
@@ -1804,6 +1859,61 @@
                 <w:sz w:val="28"/>
               </w:rPr>
               <w:t>{{asset_owner}}</w:t>
+            </w:r>
+          </w:p>
+        </w:tc>
+      </w:tr>
+      <w:tr>
+        <w:tc>
+          <w:tcPr>
+            <w:tcW w:type="dxa" w:w="3312"/>
+            <w:vAlign w:val="center"/>
+            <w:tcMar>
+              <w:top w:w="60" w:type="dxa"/>
+              <w:start w:w="120" w:type="dxa"/>
+              <w:bottom w:w="60" w:type="dxa"/>
+              <w:end w:w="120" w:type="dxa"/>
+            </w:tcMar>
+            <w:shd w:val="clear" w:fill="F2F2F2"/>
+          </w:tcPr>
+          <w:p>
+            <w:pPr>
+              <w:spacing w:after="0" w:before="0"/>
+            </w:pPr>
+            <w:r>
+              <w:rPr>
+                <w:rFonts w:ascii="TH Sarabun New" w:hAnsi="TH Sarabun New" w:cs="TH Sarabun New"/>
+                <w:b/>
+                <w:color w:val="404040"/>
+                <w:sz w:val="28"/>
+              </w:rPr>
+              <w:t>ชื่อเจ้าของทรัพย์สิน</w:t>
+            </w:r>
+          </w:p>
+        </w:tc>
+        <w:tc>
+          <w:tcPr>
+            <w:tcW w:type="dxa" w:w="6192"/>
+            <w:vAlign w:val="center"/>
+            <w:tcMar>
+              <w:top w:w="60" w:type="dxa"/>
+              <w:start w:w="120" w:type="dxa"/>
+              <w:bottom w:w="60" w:type="dxa"/>
+              <w:end w:w="120" w:type="dxa"/>
+            </w:tcMar>
+          </w:tcPr>
+          <w:p>
+            <w:pPr>
+              <w:spacing w:after="0" w:before="0"/>
+            </w:pPr>
+            <w:r>
+              <w:rPr>
+                <w:rFonts w:ascii="TH Sarabun New" w:hAnsi="TH Sarabun New" w:cs="TH Sarabun New"/>
+                <w:b w:val="0"/>
+                <w:color w:val="404040"/>
+                <w:sz w:val="28"/>
+              </w:rPr>
+              <w:t>{{asset_owner_name}}</w:t>
             </w:r>
           </w:p>
         </w:tc>
@@ -2897,12 +3007,21 @@
             </w:pPr>
             <w:r>
               <w:rPr>
+                <w:rFonts w:ascii="DejaVu Sans" w:hAnsi="DejaVu Sans" w:cs="DejaVu Sans"/>
+                <w:b w:val="0"/>
+                <w:color w:val="404040"/>
+                <w:sz w:val="28"/>
+              </w:rPr>
+              <w:t>☐</w:t>
+            </w:r>
+            <w:r>
+              <w:rPr>
                 <w:rFonts w:ascii="TH Sarabun New" w:hAnsi="TH Sarabun New" w:cs="TH Sarabun New"/>
                 <w:b w:val="0"/>
                 <w:color w:val="404040"/>
                 <w:sz w:val="28"/>
               </w:rPr>
-              <w:t>Isolate เครื่อง – แยกเครื่องที่ได้รับผลกระทบออกจากเครือข่าย</w:t>
+              <w:t xml:space="preserve"> Isolate เครื่อง – แยกเครื่องที่ได้รับผลกระทบออกจากเครือข่าย</w:t>
             </w:r>
           </w:p>
           <w:p>
@@ -2911,12 +3030,21 @@
             </w:pPr>
             <w:r>
               <w:rPr>
+                <w:rFonts w:ascii="DejaVu Sans" w:hAnsi="DejaVu Sans" w:cs="DejaVu Sans"/>
+                <w:b w:val="0"/>
+                <w:color w:val="404040"/>
+                <w:sz w:val="28"/>
+              </w:rPr>
+              <w:t>☐</w:t>
+            </w:r>
+            <w:r>
+              <w:rPr>
                 <w:rFonts w:ascii="TH Sarabun New" w:hAnsi="TH Sarabun New" w:cs="TH Sarabun New"/>
                 <w:b w:val="0"/>
                 <w:color w:val="404040"/>
                 <w:sz w:val="28"/>
               </w:rPr>
-              <w:t>Close Service ที่ไม่จำเป็น – ปิดบริการหรือพอร์ตที่เปิดเผยและมีความเสี่ยง</w:t>
+              <w:t xml:space="preserve"> Close Service ที่ไม่จำเป็น – ปิดบริการหรือพอร์ตที่เปิดเผยและมีความเสี่ยง</w:t>
             </w:r>
           </w:p>
           <w:p>
@@ -2925,12 +3053,21 @@
             </w:pPr>
             <w:r>
               <w:rPr>
+                <w:rFonts w:ascii="DejaVu Sans" w:hAnsi="DejaVu Sans" w:cs="DejaVu Sans"/>
+                <w:b w:val="0"/>
+                <w:color w:val="404040"/>
+                <w:sz w:val="28"/>
+              </w:rPr>
+              <w:t>☐</w:t>
+            </w:r>
+            <w:r>
+              <w:rPr>
                 <w:rFonts w:ascii="TH Sarabun New" w:hAnsi="TH Sarabun New" w:cs="TH Sarabun New"/>
                 <w:b w:val="0"/>
                 <w:color w:val="404040"/>
                 <w:sz w:val="28"/>
               </w:rPr>
-              <w:t>Block IoC – บล็อกตัวบ่งชี้การโจมตี (IP, Domain, URL, Hash)</w:t>
+              <w:t xml:space="preserve"> Block IoC – บล็อกตัวบ่งชี้การโจมตี (IP, Domain, URL, Hash)</w:t>
             </w:r>
           </w:p>
           <w:p>
@@ -2939,12 +3076,21 @@
             </w:pPr>
             <w:r>
               <w:rPr>
+                <w:rFonts w:ascii="DejaVu Sans" w:hAnsi="DejaVu Sans" w:cs="DejaVu Sans"/>
+                <w:b w:val="0"/>
+                <w:color w:val="404040"/>
+                <w:sz w:val="28"/>
+              </w:rPr>
+              <w:t>☐</w:t>
+            </w:r>
+            <w:r>
+              <w:rPr>
                 <w:rFonts w:ascii="TH Sarabun New" w:hAnsi="TH Sarabun New" w:cs="TH Sarabun New"/>
                 <w:b w:val="0"/>
                 <w:color w:val="404040"/>
                 <w:sz w:val="28"/>
               </w:rPr>
-              <w:t>Dump memory ของเครื่อง Server</w:t>
+              <w:t xml:space="preserve"> Dump memory ของเครื่อง Server</w:t>
             </w:r>
           </w:p>
           <w:p>
@@ -2953,12 +3099,21 @@
             </w:pPr>
             <w:r>
               <w:rPr>
+                <w:rFonts w:ascii="DejaVu Sans" w:hAnsi="DejaVu Sans" w:cs="DejaVu Sans"/>
+                <w:b w:val="0"/>
+                <w:color w:val="404040"/>
+                <w:sz w:val="28"/>
+              </w:rPr>
+              <w:t>☐</w:t>
+            </w:r>
+            <w:r>
+              <w:rPr>
                 <w:rFonts w:ascii="TH Sarabun New" w:hAnsi="TH Sarabun New" w:cs="TH Sarabun New"/>
                 <w:b w:val="0"/>
                 <w:color w:val="404040"/>
                 <w:sz w:val="28"/>
               </w:rPr>
-              <w:t>รวบรวม Event Logs เพื่อส่งต่อ ปปกก.</w:t>
+              <w:t xml:space="preserve"> รวบรวม Event Logs เพื่อส่งต่อ ปปกก.</w:t>
             </w:r>
           </w:p>
           <w:p>
@@ -2967,12 +3122,21 @@
             </w:pPr>
             <w:r>
               <w:rPr>
+                <w:rFonts w:ascii="DejaVu Sans" w:hAnsi="DejaVu Sans" w:cs="DejaVu Sans"/>
+                <w:b w:val="0"/>
+                <w:color w:val="404040"/>
+                <w:sz w:val="28"/>
+              </w:rPr>
+              <w:t>☐</w:t>
+            </w:r>
+            <w:r>
+              <w:rPr>
                 <w:rFonts w:ascii="TH Sarabun New" w:hAnsi="TH Sarabun New" w:cs="TH Sarabun New"/>
                 <w:b w:val="0"/>
                 <w:color w:val="404040"/>
                 <w:sz w:val="28"/>
               </w:rPr>
-              <w:t>Disable/Reset Account – ปิดการใช้งานหรือรีเซ็ตรหัสผ่านบัญชีที่ได้รับผลกระทบ</w:t>
+              <w:t xml:space="preserve"> Disable/Reset Account – ปิดการใช้งานหรือรีเซ็ตรหัสผ่านบัญชีที่ได้รับผลกระทบ</w:t>
             </w:r>
           </w:p>
           <w:p>
@@ -2981,12 +3145,21 @@
             </w:pPr>
             <w:r>
               <w:rPr>
+                <w:rFonts w:ascii="DejaVu Sans" w:hAnsi="DejaVu Sans" w:cs="DejaVu Sans"/>
+                <w:b w:val="0"/>
+                <w:color w:val="404040"/>
+                <w:sz w:val="28"/>
+              </w:rPr>
+              <w:t>☐</w:t>
+            </w:r>
+            <w:r>
+              <w:rPr>
                 <w:rFonts w:ascii="TH Sarabun New" w:hAnsi="TH Sarabun New" w:cs="TH Sarabun New"/>
                 <w:b w:val="0"/>
                 <w:color w:val="404040"/>
                 <w:sz w:val="28"/>
               </w:rPr>
-              <w:t>เปลี่ยนรหัสผ่าน</w:t>
+              <w:t xml:space="preserve"> เปลี่ยนรหัสผ่าน</w:t>
             </w:r>
           </w:p>
           <w:p>
@@ -2995,12 +3168,21 @@
             </w:pPr>
             <w:r>
               <w:rPr>
+                <w:rFonts w:ascii="DejaVu Sans" w:hAnsi="DejaVu Sans" w:cs="DejaVu Sans"/>
+                <w:b w:val="0"/>
+                <w:color w:val="404040"/>
+                <w:sz w:val="28"/>
+              </w:rPr>
+              <w:t>☐</w:t>
+            </w:r>
+            <w:r>
+              <w:rPr>
                 <w:rFonts w:ascii="TH Sarabun New" w:hAnsi="TH Sarabun New" w:cs="TH Sarabun New"/>
                 <w:b w:val="0"/>
                 <w:color w:val="404040"/>
                 <w:sz w:val="28"/>
               </w:rPr>
-              <w:t>Remove Malware – กำจัดมัลแวร์ออกจากระบบ</w:t>
+              <w:t xml:space="preserve"> Remove Malware – กำจัดมัลแวร์ออกจากระบบ</w:t>
             </w:r>
           </w:p>
           <w:p>
@@ -3009,12 +3191,21 @@
             </w:pPr>
             <w:r>
               <w:rPr>
+                <w:rFonts w:ascii="DejaVu Sans" w:hAnsi="DejaVu Sans" w:cs="DejaVu Sans"/>
+                <w:b w:val="0"/>
+                <w:color w:val="404040"/>
+                <w:sz w:val="28"/>
+              </w:rPr>
+              <w:t>☐</w:t>
+            </w:r>
+            <w:r>
+              <w:rPr>
                 <w:rFonts w:ascii="TH Sarabun New" w:hAnsi="TH Sarabun New" w:cs="TH Sarabun New"/>
                 <w:b w:val="0"/>
                 <w:color w:val="404040"/>
                 <w:sz w:val="28"/>
               </w:rPr>
-              <w:t>ลบไฟล์ และ Path ที่ต้องสงสัย</w:t>
+              <w:t xml:space="preserve"> ลบไฟล์ และ Path ที่ต้องสงสัย</w:t>
             </w:r>
           </w:p>
           <w:p>
@@ -3023,12 +3214,21 @@
             </w:pPr>
             <w:r>
               <w:rPr>
+                <w:rFonts w:ascii="DejaVu Sans" w:hAnsi="DejaVu Sans" w:cs="DejaVu Sans"/>
+                <w:b w:val="0"/>
+                <w:color w:val="404040"/>
+                <w:sz w:val="28"/>
+              </w:rPr>
+              <w:t>☐</w:t>
+            </w:r>
+            <w:r>
+              <w:rPr>
                 <w:rFonts w:ascii="TH Sarabun New" w:hAnsi="TH Sarabun New" w:cs="TH Sarabun New"/>
                 <w:b w:val="0"/>
                 <w:color w:val="404040"/>
                 <w:sz w:val="28"/>
               </w:rPr>
-              <w:t>Patch Vulnerability – ติดตั้งแพตช์แก้ไขช่องโหว่ที่เกี่ยวข้อง</w:t>
+              <w:t xml:space="preserve"> Patch Vulnerability – ติดตั้งแพตช์แก้ไขช่องโหว่ที่เกี่ยวข้อง</w:t>
             </w:r>
           </w:p>
           <w:p>
@@ -3037,12 +3237,21 @@
             </w:pPr>
             <w:r>
               <w:rPr>
+                <w:rFonts w:ascii="DejaVu Sans" w:hAnsi="DejaVu Sans" w:cs="DejaVu Sans"/>
+                <w:b w:val="0"/>
+                <w:color w:val="404040"/>
+                <w:sz w:val="28"/>
+              </w:rPr>
+              <w:t>☐</w:t>
+            </w:r>
+            <w:r>
+              <w:rPr>
                 <w:rFonts w:ascii="TH Sarabun New" w:hAnsi="TH Sarabun New" w:cs="TH Sarabun New"/>
                 <w:b w:val="0"/>
                 <w:color w:val="404040"/>
                 <w:sz w:val="28"/>
               </w:rPr>
-              <w:t>Update Software/OS – อัปเดตซอฟต์แวร์หรือระบบปฏิบัติการให้เป็นเวอร์ชันล่าสุด</w:t>
+              <w:t xml:space="preserve"> Update Software/OS – อัปเดตซอฟต์แวร์หรือระบบปฏิบัติการให้เป็นเวอร์ชันล่าสุด</w:t>
             </w:r>
           </w:p>
           <w:p>
@@ -3051,12 +3260,21 @@
             </w:pPr>
             <w:r>
               <w:rPr>
+                <w:rFonts w:ascii="DejaVu Sans" w:hAnsi="DejaVu Sans" w:cs="DejaVu Sans"/>
+                <w:b w:val="0"/>
+                <w:color w:val="404040"/>
+                <w:sz w:val="28"/>
+              </w:rPr>
+              <w:t>☐</w:t>
+            </w:r>
+            <w:r>
+              <w:rPr>
                 <w:rFonts w:ascii="TH Sarabun New" w:hAnsi="TH Sarabun New" w:cs="TH Sarabun New"/>
                 <w:b w:val="0"/>
                 <w:color w:val="404040"/>
                 <w:sz w:val="28"/>
               </w:rPr>
-              <w:t>Harden Configuration – ปรับแต่งการตั้งค่าความปลอดภัยของระบบให้รัดกุมมากขึ้น</w:t>
+              <w:t xml:space="preserve"> Harden Configuration – ปรับแต่งการตั้งค่าความปลอดภัยของระบบให้รัดกุมมากขึ้น</w:t>
             </w:r>
           </w:p>
           <w:p>
@@ -3065,12 +3283,21 @@
             </w:pPr>
             <w:r>
               <w:rPr>
+                <w:rFonts w:ascii="DejaVu Sans" w:hAnsi="DejaVu Sans" w:cs="DejaVu Sans"/>
+                <w:b w:val="0"/>
+                <w:color w:val="404040"/>
+                <w:sz w:val="28"/>
+              </w:rPr>
+              <w:t>☐</w:t>
+            </w:r>
+            <w:r>
+              <w:rPr>
                 <w:rFonts w:ascii="TH Sarabun New" w:hAnsi="TH Sarabun New" w:cs="TH Sarabun New"/>
                 <w:b w:val="0"/>
                 <w:color w:val="404040"/>
                 <w:sz w:val="28"/>
               </w:rPr>
-              <w:t>ตรวจสอบการทำงานของภัยคุกคามยังทำงานอยู่หรือไม่</w:t>
+              <w:t xml:space="preserve"> ตรวจสอบการทำงานของภัยคุกคามยังทำงานอยู่หรือไม่</w:t>
             </w:r>
           </w:p>
           <w:p>
@@ -3079,12 +3306,21 @@
             </w:pPr>
             <w:r>
               <w:rPr>
+                <w:rFonts w:ascii="DejaVu Sans" w:hAnsi="DejaVu Sans" w:cs="DejaVu Sans"/>
+                <w:b w:val="0"/>
+                <w:color w:val="404040"/>
+                <w:sz w:val="28"/>
+              </w:rPr>
+              <w:t>☐</w:t>
+            </w:r>
+            <w:r>
+              <w:rPr>
                 <w:rFonts w:ascii="TH Sarabun New" w:hAnsi="TH Sarabun New" w:cs="TH Sarabun New"/>
                 <w:b w:val="0"/>
                 <w:color w:val="404040"/>
                 <w:sz w:val="28"/>
               </w:rPr>
-              <w:t>ติดตั้ง Sysmon</w:t>
+              <w:t xml:space="preserve"> ติดตั้ง Sysmon</w:t>
             </w:r>
           </w:p>
           <w:p>
@@ -3093,12 +3329,21 @@
             </w:pPr>
             <w:r>
               <w:rPr>
+                <w:rFonts w:ascii="DejaVu Sans" w:hAnsi="DejaVu Sans" w:cs="DejaVu Sans"/>
+                <w:b w:val="0"/>
+                <w:color w:val="404040"/>
+                <w:sz w:val="28"/>
+              </w:rPr>
+              <w:t>☐</w:t>
+            </w:r>
+            <w:r>
+              <w:rPr>
                 <w:rFonts w:ascii="TH Sarabun New" w:hAnsi="TH Sarabun New" w:cs="TH Sarabun New"/>
                 <w:b w:val="0"/>
                 <w:color w:val="404040"/>
                 <w:sz w:val="28"/>
               </w:rPr>
-              <w:t>ติดตั้ง Agent Wazuh</w:t>
+              <w:t xml:space="preserve"> ติดตั้ง Agent Wazuh</w:t>
             </w:r>
           </w:p>
           <w:p>

</xml_diff>

<commit_message>
6/8 Incident Report Fixing
</commit_message>
<xml_diff>
--- a/apps/incidents/report_templates/report_template_v2.docx
+++ b/apps/incidents/report_templates/report_template_v2.docx
@@ -45,7 +45,7 @@
                 <w:color w:val="1F2933"/>
                 <w:sz w:val="44"/>
               </w:rPr>
-              <w:t>INCIDENT REPORT</w:t>
+              <w:t>INCIDENT REPORT: Containment</w:t>
             </w:r>
           </w:p>
           <w:p>
@@ -178,7 +178,7 @@
                 <w:color w:val="404040"/>
                 <w:sz w:val="28"/>
               </w:rPr>
-              <w:t>หมายเลข Incident</w:t>
+              <w:t>1.1 หมายเลข Incident</w:t>
             </w:r>
           </w:p>
         </w:tc>
@@ -233,7 +233,7 @@
                 <w:color w:val="404040"/>
                 <w:sz w:val="28"/>
               </w:rPr>
-              <w:t>วันที่ เวลา ที่พบเหตุ</w:t>
+              <w:t>1.2 วันที่ เวลา ที่พบเหตุ</w:t>
             </w:r>
           </w:p>
         </w:tc>
@@ -288,7 +288,7 @@
                 <w:color w:val="404040"/>
                 <w:sz w:val="28"/>
               </w:rPr>
-              <w:t>วันที่ เวลา ที่เกิดเหตุ</w:t>
+              <w:t>1.3 วันที่ เวลา ที่เกิดเหตุ</w:t>
             </w:r>
           </w:p>
         </w:tc>
@@ -343,7 +343,7 @@
                 <w:color w:val="404040"/>
                 <w:sz w:val="28"/>
               </w:rPr>
-              <w:t>ชื่อ incident/event</w:t>
+              <w:t>1.4 ชื่อ incident/event</w:t>
             </w:r>
           </w:p>
         </w:tc>
@@ -398,7 +398,7 @@
                 <w:color w:val="404040"/>
                 <w:sz w:val="28"/>
               </w:rPr>
-              <w:t>ประเภท: event หรือ incident</w:t>
+              <w:t>1.5 ประเภท: event หรือ incident</w:t>
             </w:r>
           </w:p>
         </w:tc>
@@ -424,7 +424,7 @@
                 <w:color w:val="404040"/>
                 <w:sz w:val="28"/>
               </w:rPr>
-              <w:t>{{chk_class_event}}</w:t>
+              <w:t>{{chk_class_incident}}</w:t>
             </w:r>
             <w:r>
               <w:rPr>
@@ -433,7 +433,7 @@
                 <w:color w:val="404040"/>
                 <w:sz w:val="28"/>
               </w:rPr>
-              <w:t xml:space="preserve"> Event</w:t>
+              <w:t xml:space="preserve"> Incident</w:t>
             </w:r>
             <w:r>
               <w:rPr>
@@ -451,7 +451,7 @@
                 <w:color w:val="404040"/>
                 <w:sz w:val="28"/>
               </w:rPr>
-              <w:t>{{chk_class_incident}}</w:t>
+              <w:t>{{chk_class_event}}</w:t>
             </w:r>
             <w:r>
               <w:rPr>
@@ -460,7 +460,7 @@
                 <w:color w:val="404040"/>
                 <w:sz w:val="28"/>
               </w:rPr>
-              <w:t xml:space="preserve"> Incident</w:t>
+              <w:t xml:space="preserve"> Event</w:t>
             </w:r>
           </w:p>
         </w:tc>
@@ -489,7 +489,7 @@
                 <w:color w:val="404040"/>
                 <w:sz w:val="28"/>
               </w:rPr>
-              <w:t>ระดับความรุนแรง (อ้างอิงตามระบบ SIEM)</w:t>
+              <w:t>1.6 ระดับความรุนแรง (อ้างอิงตามระบบ SIEM)</w:t>
             </w:r>
           </w:p>
         </w:tc>
@@ -515,7 +515,7 @@
                 <w:color w:val="404040"/>
                 <w:sz w:val="28"/>
               </w:rPr>
-              <w:t>{{chk_sev_critical}}</w:t>
+              <w:t>{{chk_sev_low}}</w:t>
             </w:r>
             <w:r>
               <w:rPr>
@@ -524,7 +524,34 @@
                 <w:color w:val="404040"/>
                 <w:sz w:val="28"/>
               </w:rPr>
-              <w:t xml:space="preserve"> Critical</w:t>
+              <w:t xml:space="preserve"> Low</w:t>
+            </w:r>
+            <w:r>
+              <w:rPr>
+                <w:rFonts w:ascii="TH Sarabun New" w:hAnsi="TH Sarabun New" w:cs="TH Sarabun New"/>
+                <w:b w:val="0"/>
+                <w:color w:val="404040"/>
+                <w:sz w:val="28"/>
+              </w:rPr>
+              <w:t xml:space="preserve">   </w:t>
+            </w:r>
+            <w:r>
+              <w:rPr>
+                <w:rFonts w:ascii="DejaVu Sans" w:hAnsi="DejaVu Sans" w:cs="DejaVu Sans"/>
+                <w:b w:val="0"/>
+                <w:color w:val="404040"/>
+                <w:sz w:val="28"/>
+              </w:rPr>
+              <w:t>{{chk_sev_medium}}</w:t>
+            </w:r>
+            <w:r>
+              <w:rPr>
+                <w:rFonts w:ascii="TH Sarabun New" w:hAnsi="TH Sarabun New" w:cs="TH Sarabun New"/>
+                <w:b w:val="0"/>
+                <w:color w:val="404040"/>
+                <w:sz w:val="28"/>
+              </w:rPr>
+              <w:t xml:space="preserve"> Medium</w:t>
             </w:r>
             <w:r>
               <w:rPr>
@@ -569,7 +596,7 @@
                 <w:color w:val="404040"/>
                 <w:sz w:val="28"/>
               </w:rPr>
-              <w:t>{{chk_sev_medium}}</w:t>
+              <w:t>{{chk_sev_critical}}</w:t>
             </w:r>
             <w:r>
               <w:rPr>
@@ -578,34 +605,7 @@
                 <w:color w:val="404040"/>
                 <w:sz w:val="28"/>
               </w:rPr>
-              <w:t xml:space="preserve"> Medium</w:t>
-            </w:r>
-            <w:r>
-              <w:rPr>
-                <w:rFonts w:ascii="TH Sarabun New" w:hAnsi="TH Sarabun New" w:cs="TH Sarabun New"/>
-                <w:b w:val="0"/>
-                <w:color w:val="404040"/>
-                <w:sz w:val="28"/>
-              </w:rPr>
-              <w:t xml:space="preserve">   </w:t>
-            </w:r>
-            <w:r>
-              <w:rPr>
-                <w:rFonts w:ascii="DejaVu Sans" w:hAnsi="DejaVu Sans" w:cs="DejaVu Sans"/>
-                <w:b w:val="0"/>
-                <w:color w:val="404040"/>
-                <w:sz w:val="28"/>
-              </w:rPr>
-              <w:t>{{chk_sev_low}}</w:t>
-            </w:r>
-            <w:r>
-              <w:rPr>
-                <w:rFonts w:ascii="TH Sarabun New" w:hAnsi="TH Sarabun New" w:cs="TH Sarabun New"/>
-                <w:b w:val="0"/>
-                <w:color w:val="404040"/>
-                <w:sz w:val="28"/>
-              </w:rPr>
-              <w:t xml:space="preserve"> Low</w:t>
+              <w:t xml:space="preserve"> Critical</w:t>
             </w:r>
           </w:p>
         </w:tc>
@@ -634,7 +634,7 @@
                 <w:color w:val="404040"/>
                 <w:sz w:val="28"/>
               </w:rPr>
-              <w:t>ระดับความสำคัญ</w:t>
+              <w:t>1.7 ระดับความสำคัญ</w:t>
             </w:r>
           </w:p>
         </w:tc>
@@ -725,7 +725,7 @@
                 <w:color w:val="404040"/>
                 <w:sz w:val="28"/>
               </w:rPr>
-              <w:t>มีการกระจายไปยังจุดอื่น</w:t>
+              <w:t>1.8 มีการกระจายไปยังจุดอื่น</w:t>
             </w:r>
           </w:p>
         </w:tc>
@@ -816,7 +816,7 @@
                 <w:color w:val="404040"/>
                 <w:sz w:val="28"/>
               </w:rPr>
-              <w:t>ระดับความรุนแรง (อ้างอิงตาม สกมช.)</w:t>
+              <w:t>1.9 ระดับความรุนแรง (อ้างอิงตาม สกมช.)</w:t>
             </w:r>
           </w:p>
         </w:tc>
@@ -842,7 +842,7 @@
                 <w:color w:val="404040"/>
                 <w:sz w:val="28"/>
               </w:rPr>
-              <w:t>{{chk_ncsa_critical}}</w:t>
+              <w:t>{{chk_ncsa_nonsevere}}</w:t>
             </w:r>
             <w:r>
               <w:rPr>
@@ -851,7 +851,7 @@
                 <w:color w:val="404040"/>
                 <w:sz w:val="28"/>
               </w:rPr>
-              <w:t xml:space="preserve"> วิกฤต</w:t>
+              <w:t xml:space="preserve"> ไม่ร้ายแรง</w:t>
             </w:r>
             <w:r>
               <w:rPr>
@@ -896,7 +896,7 @@
                 <w:color w:val="404040"/>
                 <w:sz w:val="28"/>
               </w:rPr>
-              <w:t>{{chk_ncsa_nonsevere}}</w:t>
+              <w:t>{{chk_ncsa_critical}}</w:t>
             </w:r>
             <w:r>
               <w:rPr>
@@ -905,7 +905,7 @@
                 <w:color w:val="404040"/>
                 <w:sz w:val="28"/>
               </w:rPr>
-              <w:t xml:space="preserve"> ไม่ร้ายแรง</w:t>
+              <w:t xml:space="preserve"> วิกฤต</w:t>
             </w:r>
           </w:p>
         </w:tc>
@@ -934,7 +934,7 @@
                 <w:color w:val="404040"/>
                 <w:sz w:val="28"/>
               </w:rPr>
-              <w:t>*หมวดหมู่ของภัยคุกคามทางไซเบอร์ (Category)</w:t>
+              <w:t>1.10 *หมวดหมู่ของภัยคุกคามทางไซเบอร์ (Category)</w:t>
             </w:r>
           </w:p>
         </w:tc>
@@ -989,7 +989,7 @@
                 <w:color w:val="404040"/>
                 <w:sz w:val="28"/>
               </w:rPr>
-              <w:t>ทรัพย์สินที่ได้รับผลกระทบ</w:t>
+              <w:t>1.11 ทรัพย์สินที่ได้รับผลกระทบ</w:t>
             </w:r>
           </w:p>
         </w:tc>
@@ -1044,7 +1044,7 @@
                 <w:color w:val="404040"/>
                 <w:sz w:val="28"/>
               </w:rPr>
-              <w:t>ประเภททรัพย์สินที่ได้รับผลกระทบ</w:t>
+              <w:t>1.12 ประเภททรัพย์สินที่ได้รับผลกระทบ</w:t>
             </w:r>
           </w:p>
         </w:tc>
@@ -1162,7 +1162,7 @@
                 <w:color w:val="404040"/>
                 <w:sz w:val="28"/>
               </w:rPr>
-              <w:t>ส่วนงานเจ้าของหรือผู้ดูแลทรัพย์สิน</w:t>
+              <w:t>1.13 ส่วนงานเจ้าของหรือผู้ดูแลทรัพย์สิน</w:t>
             </w:r>
           </w:p>
         </w:tc>
@@ -1217,7 +1217,7 @@
                 <w:color w:val="404040"/>
                 <w:sz w:val="28"/>
               </w:rPr>
-              <w:t>ชื่อเจ้าของทรัพย์สิน</w:t>
+              <w:t>1.14 ชื่อเจ้าของทรัพย์สิน</w:t>
             </w:r>
           </w:p>
         </w:tc>
@@ -1272,7 +1272,7 @@
                 <w:color w:val="404040"/>
                 <w:sz w:val="28"/>
               </w:rPr>
-              <w:t>ระบบที่ได้รับผลกระทบ</w:t>
+              <w:t>1.15 ระบบที่ได้รับผลกระทบ</w:t>
             </w:r>
           </w:p>
         </w:tc>
@@ -1327,7 +1327,7 @@
                 <w:color w:val="404040"/>
                 <w:sz w:val="28"/>
               </w:rPr>
-              <w:t>สถานะปัจจุบัน</w:t>
+              <w:t>1.16 สถานะปัจจุบัน</w:t>
             </w:r>
           </w:p>
         </w:tc>
@@ -1382,7 +1382,7 @@
                 <w:color w:val="404040"/>
                 <w:sz w:val="28"/>
               </w:rPr>
-              <w:t>เรื่องที่ดำเนินการแล้ว</w:t>
+              <w:t>1.17 เรื่องที่ดำเนินการแล้ว</w:t>
             </w:r>
           </w:p>
         </w:tc>
@@ -1437,7 +1437,7 @@
                 <w:color w:val="404040"/>
                 <w:sz w:val="28"/>
               </w:rPr>
-              <w:t>การที่จะดำเนินการลำดับถัดไป</w:t>
+              <w:t>1.18 การที่จะดำเนินการลำดับถัดไป</w:t>
             </w:r>
           </w:p>
         </w:tc>
@@ -1492,7 +1492,7 @@
                 <w:color w:val="404040"/>
                 <w:sz w:val="28"/>
               </w:rPr>
-              <w:t>ผู้รายงาน</w:t>
+              <w:t>1.19 ผู้รายงาน</w:t>
             </w:r>
           </w:p>
         </w:tc>
@@ -1547,7 +1547,7 @@
                 <w:color w:val="404040"/>
                 <w:sz w:val="28"/>
               </w:rPr>
-              <w:t>แหล่งข้อมูล</w:t>
+              <w:t>1.20 แหล่งข้อมูล</w:t>
             </w:r>
           </w:p>
         </w:tc>
@@ -2613,6 +2613,61 @@
           </w:p>
         </w:tc>
       </w:tr>
+      <w:tr>
+        <w:tc>
+          <w:tcPr>
+            <w:tcW w:type="dxa" w:w="3312"/>
+            <w:vAlign w:val="center"/>
+            <w:tcMar>
+              <w:top w:w="60" w:type="dxa"/>
+              <w:start w:w="120" w:type="dxa"/>
+              <w:bottom w:w="60" w:type="dxa"/>
+              <w:end w:w="120" w:type="dxa"/>
+            </w:tcMar>
+            <w:shd w:val="clear" w:fill="F2F2F2"/>
+          </w:tcPr>
+          <w:p>
+            <w:pPr>
+              <w:spacing w:after="0" w:before="0"/>
+            </w:pPr>
+            <w:r>
+              <w:rPr>
+                <w:rFonts w:ascii="TH Sarabun New" w:hAnsi="TH Sarabun New" w:cs="TH Sarabun New"/>
+                <w:b/>
+                <w:color w:val="404040"/>
+                <w:sz w:val="28"/>
+              </w:rPr>
+              <w:t>User</w:t>
+            </w:r>
+          </w:p>
+        </w:tc>
+        <w:tc>
+          <w:tcPr>
+            <w:tcW w:type="dxa" w:w="6192"/>
+            <w:vAlign w:val="center"/>
+            <w:tcMar>
+              <w:top w:w="60" w:type="dxa"/>
+              <w:start w:w="120" w:type="dxa"/>
+              <w:bottom w:w="60" w:type="dxa"/>
+              <w:end w:w="120" w:type="dxa"/>
+            </w:tcMar>
+          </w:tcPr>
+          <w:p>
+            <w:pPr>
+              <w:spacing w:after="0" w:before="0"/>
+            </w:pPr>
+            <w:r>
+              <w:rPr>
+                <w:rFonts w:ascii="TH Sarabun New" w:hAnsi="TH Sarabun New" w:cs="TH Sarabun New"/>
+                <w:b w:val="0"/>
+                <w:color w:val="404040"/>
+                <w:sz w:val="28"/>
+              </w:rPr>
+              <w:t>{{ioc_user}}</w:t>
+            </w:r>
+          </w:p>
+        </w:tc>
+      </w:tr>
     </w:tbl>
     <w:p>
       <w:pPr>
@@ -3003,352 +3058,7 @@
           </w:tcPr>
           <w:p>
             <w:pPr>
-              <w:spacing w:after="40" w:before="0"/>
-            </w:pPr>
-            <w:r>
-              <w:rPr>
-                <w:rFonts w:ascii="DejaVu Sans" w:hAnsi="DejaVu Sans" w:cs="DejaVu Sans"/>
-                <w:b w:val="0"/>
-                <w:color w:val="404040"/>
-                <w:sz w:val="28"/>
-              </w:rPr>
-              <w:t>☐</w:t>
-            </w:r>
-            <w:r>
-              <w:rPr>
-                <w:rFonts w:ascii="TH Sarabun New" w:hAnsi="TH Sarabun New" w:cs="TH Sarabun New"/>
-                <w:b w:val="0"/>
-                <w:color w:val="404040"/>
-                <w:sz w:val="28"/>
-              </w:rPr>
-              <w:t xml:space="preserve"> Isolate เครื่อง – แยกเครื่องที่ได้รับผลกระทบออกจากเครือข่าย</w:t>
-            </w:r>
-          </w:p>
-          <w:p>
-            <w:pPr>
-              <w:spacing w:after="40"/>
-            </w:pPr>
-            <w:r>
-              <w:rPr>
-                <w:rFonts w:ascii="DejaVu Sans" w:hAnsi="DejaVu Sans" w:cs="DejaVu Sans"/>
-                <w:b w:val="0"/>
-                <w:color w:val="404040"/>
-                <w:sz w:val="28"/>
-              </w:rPr>
-              <w:t>☐</w:t>
-            </w:r>
-            <w:r>
-              <w:rPr>
-                <w:rFonts w:ascii="TH Sarabun New" w:hAnsi="TH Sarabun New" w:cs="TH Sarabun New"/>
-                <w:b w:val="0"/>
-                <w:color w:val="404040"/>
-                <w:sz w:val="28"/>
-              </w:rPr>
-              <w:t xml:space="preserve"> Close Service ที่ไม่จำเป็น – ปิดบริการหรือพอร์ตที่เปิดเผยและมีความเสี่ยง</w:t>
-            </w:r>
-          </w:p>
-          <w:p>
-            <w:pPr>
-              <w:spacing w:after="40"/>
-            </w:pPr>
-            <w:r>
-              <w:rPr>
-                <w:rFonts w:ascii="DejaVu Sans" w:hAnsi="DejaVu Sans" w:cs="DejaVu Sans"/>
-                <w:b w:val="0"/>
-                <w:color w:val="404040"/>
-                <w:sz w:val="28"/>
-              </w:rPr>
-              <w:t>☐</w:t>
-            </w:r>
-            <w:r>
-              <w:rPr>
-                <w:rFonts w:ascii="TH Sarabun New" w:hAnsi="TH Sarabun New" w:cs="TH Sarabun New"/>
-                <w:b w:val="0"/>
-                <w:color w:val="404040"/>
-                <w:sz w:val="28"/>
-              </w:rPr>
-              <w:t xml:space="preserve"> Block IoC – บล็อกตัวบ่งชี้การโจมตี (IP, Domain, URL, Hash)</w:t>
-            </w:r>
-          </w:p>
-          <w:p>
-            <w:pPr>
-              <w:spacing w:after="40"/>
-            </w:pPr>
-            <w:r>
-              <w:rPr>
-                <w:rFonts w:ascii="DejaVu Sans" w:hAnsi="DejaVu Sans" w:cs="DejaVu Sans"/>
-                <w:b w:val="0"/>
-                <w:color w:val="404040"/>
-                <w:sz w:val="28"/>
-              </w:rPr>
-              <w:t>☐</w:t>
-            </w:r>
-            <w:r>
-              <w:rPr>
-                <w:rFonts w:ascii="TH Sarabun New" w:hAnsi="TH Sarabun New" w:cs="TH Sarabun New"/>
-                <w:b w:val="0"/>
-                <w:color w:val="404040"/>
-                <w:sz w:val="28"/>
-              </w:rPr>
-              <w:t xml:space="preserve"> Dump memory ของเครื่อง Server</w:t>
-            </w:r>
-          </w:p>
-          <w:p>
-            <w:pPr>
-              <w:spacing w:after="40"/>
-            </w:pPr>
-            <w:r>
-              <w:rPr>
-                <w:rFonts w:ascii="DejaVu Sans" w:hAnsi="DejaVu Sans" w:cs="DejaVu Sans"/>
-                <w:b w:val="0"/>
-                <w:color w:val="404040"/>
-                <w:sz w:val="28"/>
-              </w:rPr>
-              <w:t>☐</w:t>
-            </w:r>
-            <w:r>
-              <w:rPr>
-                <w:rFonts w:ascii="TH Sarabun New" w:hAnsi="TH Sarabun New" w:cs="TH Sarabun New"/>
-                <w:b w:val="0"/>
-                <w:color w:val="404040"/>
-                <w:sz w:val="28"/>
-              </w:rPr>
-              <w:t xml:space="preserve"> รวบรวม Event Logs เพื่อส่งต่อ ปปกก.</w:t>
-            </w:r>
-          </w:p>
-          <w:p>
-            <w:pPr>
-              <w:spacing w:after="40"/>
-            </w:pPr>
-            <w:r>
-              <w:rPr>
-                <w:rFonts w:ascii="DejaVu Sans" w:hAnsi="DejaVu Sans" w:cs="DejaVu Sans"/>
-                <w:b w:val="0"/>
-                <w:color w:val="404040"/>
-                <w:sz w:val="28"/>
-              </w:rPr>
-              <w:t>☐</w:t>
-            </w:r>
-            <w:r>
-              <w:rPr>
-                <w:rFonts w:ascii="TH Sarabun New" w:hAnsi="TH Sarabun New" w:cs="TH Sarabun New"/>
-                <w:b w:val="0"/>
-                <w:color w:val="404040"/>
-                <w:sz w:val="28"/>
-              </w:rPr>
-              <w:t xml:space="preserve"> Disable/Reset Account – ปิดการใช้งานหรือรีเซ็ตรหัสผ่านบัญชีที่ได้รับผลกระทบ</w:t>
-            </w:r>
-          </w:p>
-          <w:p>
-            <w:pPr>
-              <w:spacing w:after="40"/>
-            </w:pPr>
-            <w:r>
-              <w:rPr>
-                <w:rFonts w:ascii="DejaVu Sans" w:hAnsi="DejaVu Sans" w:cs="DejaVu Sans"/>
-                <w:b w:val="0"/>
-                <w:color w:val="404040"/>
-                <w:sz w:val="28"/>
-              </w:rPr>
-              <w:t>☐</w:t>
-            </w:r>
-            <w:r>
-              <w:rPr>
-                <w:rFonts w:ascii="TH Sarabun New" w:hAnsi="TH Sarabun New" w:cs="TH Sarabun New"/>
-                <w:b w:val="0"/>
-                <w:color w:val="404040"/>
-                <w:sz w:val="28"/>
-              </w:rPr>
-              <w:t xml:space="preserve"> เปลี่ยนรหัสผ่าน</w:t>
-            </w:r>
-          </w:p>
-          <w:p>
-            <w:pPr>
-              <w:spacing w:after="40"/>
-            </w:pPr>
-            <w:r>
-              <w:rPr>
-                <w:rFonts w:ascii="DejaVu Sans" w:hAnsi="DejaVu Sans" w:cs="DejaVu Sans"/>
-                <w:b w:val="0"/>
-                <w:color w:val="404040"/>
-                <w:sz w:val="28"/>
-              </w:rPr>
-              <w:t>☐</w:t>
-            </w:r>
-            <w:r>
-              <w:rPr>
-                <w:rFonts w:ascii="TH Sarabun New" w:hAnsi="TH Sarabun New" w:cs="TH Sarabun New"/>
-                <w:b w:val="0"/>
-                <w:color w:val="404040"/>
-                <w:sz w:val="28"/>
-              </w:rPr>
-              <w:t xml:space="preserve"> Remove Malware – กำจัดมัลแวร์ออกจากระบบ</w:t>
-            </w:r>
-          </w:p>
-          <w:p>
-            <w:pPr>
-              <w:spacing w:after="40"/>
-            </w:pPr>
-            <w:r>
-              <w:rPr>
-                <w:rFonts w:ascii="DejaVu Sans" w:hAnsi="DejaVu Sans" w:cs="DejaVu Sans"/>
-                <w:b w:val="0"/>
-                <w:color w:val="404040"/>
-                <w:sz w:val="28"/>
-              </w:rPr>
-              <w:t>☐</w:t>
-            </w:r>
-            <w:r>
-              <w:rPr>
-                <w:rFonts w:ascii="TH Sarabun New" w:hAnsi="TH Sarabun New" w:cs="TH Sarabun New"/>
-                <w:b w:val="0"/>
-                <w:color w:val="404040"/>
-                <w:sz w:val="28"/>
-              </w:rPr>
-              <w:t xml:space="preserve"> ลบไฟล์ และ Path ที่ต้องสงสัย</w:t>
-            </w:r>
-          </w:p>
-          <w:p>
-            <w:pPr>
-              <w:spacing w:after="40"/>
-            </w:pPr>
-            <w:r>
-              <w:rPr>
-                <w:rFonts w:ascii="DejaVu Sans" w:hAnsi="DejaVu Sans" w:cs="DejaVu Sans"/>
-                <w:b w:val="0"/>
-                <w:color w:val="404040"/>
-                <w:sz w:val="28"/>
-              </w:rPr>
-              <w:t>☐</w:t>
-            </w:r>
-            <w:r>
-              <w:rPr>
-                <w:rFonts w:ascii="TH Sarabun New" w:hAnsi="TH Sarabun New" w:cs="TH Sarabun New"/>
-                <w:b w:val="0"/>
-                <w:color w:val="404040"/>
-                <w:sz w:val="28"/>
-              </w:rPr>
-              <w:t xml:space="preserve"> Patch Vulnerability – ติดตั้งแพตช์แก้ไขช่องโหว่ที่เกี่ยวข้อง</w:t>
-            </w:r>
-          </w:p>
-          <w:p>
-            <w:pPr>
-              <w:spacing w:after="40"/>
-            </w:pPr>
-            <w:r>
-              <w:rPr>
-                <w:rFonts w:ascii="DejaVu Sans" w:hAnsi="DejaVu Sans" w:cs="DejaVu Sans"/>
-                <w:b w:val="0"/>
-                <w:color w:val="404040"/>
-                <w:sz w:val="28"/>
-              </w:rPr>
-              <w:t>☐</w:t>
-            </w:r>
-            <w:r>
-              <w:rPr>
-                <w:rFonts w:ascii="TH Sarabun New" w:hAnsi="TH Sarabun New" w:cs="TH Sarabun New"/>
-                <w:b w:val="0"/>
-                <w:color w:val="404040"/>
-                <w:sz w:val="28"/>
-              </w:rPr>
-              <w:t xml:space="preserve"> Update Software/OS – อัปเดตซอฟต์แวร์หรือระบบปฏิบัติการให้เป็นเวอร์ชันล่าสุด</w:t>
-            </w:r>
-          </w:p>
-          <w:p>
-            <w:pPr>
-              <w:spacing w:after="40"/>
-            </w:pPr>
-            <w:r>
-              <w:rPr>
-                <w:rFonts w:ascii="DejaVu Sans" w:hAnsi="DejaVu Sans" w:cs="DejaVu Sans"/>
-                <w:b w:val="0"/>
-                <w:color w:val="404040"/>
-                <w:sz w:val="28"/>
-              </w:rPr>
-              <w:t>☐</w:t>
-            </w:r>
-            <w:r>
-              <w:rPr>
-                <w:rFonts w:ascii="TH Sarabun New" w:hAnsi="TH Sarabun New" w:cs="TH Sarabun New"/>
-                <w:b w:val="0"/>
-                <w:color w:val="404040"/>
-                <w:sz w:val="28"/>
-              </w:rPr>
-              <w:t xml:space="preserve"> Harden Configuration – ปรับแต่งการตั้งค่าความปลอดภัยของระบบให้รัดกุมมากขึ้น</w:t>
-            </w:r>
-          </w:p>
-          <w:p>
-            <w:pPr>
-              <w:spacing w:after="40"/>
-            </w:pPr>
-            <w:r>
-              <w:rPr>
-                <w:rFonts w:ascii="DejaVu Sans" w:hAnsi="DejaVu Sans" w:cs="DejaVu Sans"/>
-                <w:b w:val="0"/>
-                <w:color w:val="404040"/>
-                <w:sz w:val="28"/>
-              </w:rPr>
-              <w:t>☐</w:t>
-            </w:r>
-            <w:r>
-              <w:rPr>
-                <w:rFonts w:ascii="TH Sarabun New" w:hAnsi="TH Sarabun New" w:cs="TH Sarabun New"/>
-                <w:b w:val="0"/>
-                <w:color w:val="404040"/>
-                <w:sz w:val="28"/>
-              </w:rPr>
-              <w:t xml:space="preserve"> ตรวจสอบการทำงานของภัยคุกคามยังทำงานอยู่หรือไม่</w:t>
-            </w:r>
-          </w:p>
-          <w:p>
-            <w:pPr>
-              <w:spacing w:after="40"/>
-            </w:pPr>
-            <w:r>
-              <w:rPr>
-                <w:rFonts w:ascii="DejaVu Sans" w:hAnsi="DejaVu Sans" w:cs="DejaVu Sans"/>
-                <w:b w:val="0"/>
-                <w:color w:val="404040"/>
-                <w:sz w:val="28"/>
-              </w:rPr>
-              <w:t>☐</w:t>
-            </w:r>
-            <w:r>
-              <w:rPr>
-                <w:rFonts w:ascii="TH Sarabun New" w:hAnsi="TH Sarabun New" w:cs="TH Sarabun New"/>
-                <w:b w:val="0"/>
-                <w:color w:val="404040"/>
-                <w:sz w:val="28"/>
-              </w:rPr>
-              <w:t xml:space="preserve"> ติดตั้ง Sysmon</w:t>
-            </w:r>
-          </w:p>
-          <w:p>
-            <w:pPr>
-              <w:spacing w:after="40"/>
-            </w:pPr>
-            <w:r>
-              <w:rPr>
-                <w:rFonts w:ascii="DejaVu Sans" w:hAnsi="DejaVu Sans" w:cs="DejaVu Sans"/>
-                <w:b w:val="0"/>
-                <w:color w:val="404040"/>
-                <w:sz w:val="28"/>
-              </w:rPr>
-              <w:t>☐</w:t>
-            </w:r>
-            <w:r>
-              <w:rPr>
-                <w:rFonts w:ascii="TH Sarabun New" w:hAnsi="TH Sarabun New" w:cs="TH Sarabun New"/>
-                <w:b w:val="0"/>
-                <w:color w:val="404040"/>
-                <w:sz w:val="28"/>
-              </w:rPr>
-              <w:t xml:space="preserve"> ติดตั้ง Agent Wazuh</w:t>
-            </w:r>
-          </w:p>
-          <w:p>
-            <w:pPr>
-              <w:spacing w:before="120"/>
+              <w:spacing w:after="0" w:before="0"/>
             </w:pPr>
             <w:r>
               <w:rPr>

</xml_diff>

<commit_message>
1/9 Event Report Form + Report Meta Removal + Role Workflow Guide
Co-Authored-By: Claude Opus 4.8 <noreply@anthropic.com>
</commit_message>
<xml_diff>
--- a/apps/incidents/report_templates/report_template_v2.docx
+++ b/apps/incidents/report_templates/report_template_v2.docx
@@ -70,21 +70,6 @@
       <w:pPr>
         <w:spacing w:after="40"/>
       </w:pPr>
-    </w:p>
-    <w:p>
-      <w:pPr>
-        <w:spacing w:after="80"/>
-        <w:jc w:val="right"/>
-      </w:pPr>
-      <w:r>
-        <w:rPr>
-          <w:rFonts w:ascii="TH Sarabun New" w:hAnsi="TH Sarabun New" w:cs="TH Sarabun New"/>
-          <w:b w:val="0"/>
-          <w:color w:val="5B6775"/>
-          <w:sz w:val="20"/>
-        </w:rPr>
-        <w:t>Template {{template_version}} | จัดทำเมื่อ {{generated_at}}</w:t>
-      </w:r>
     </w:p>
     <w:tbl>
       <w:tblPr>

</xml_diff>

<commit_message>
9/9 IOC Database + Superuser editor
</commit_message>
<xml_diff>
--- a/apps/incidents/report_templates/report_template_v2.docx
+++ b/apps/incidents/report_templates/report_template_v2.docx
@@ -2567,6 +2567,116 @@
                 <w:color w:val="404040"/>
                 <w:sz w:val="28"/>
               </w:rPr>
+              <w:t>Domain</w:t>
+            </w:r>
+          </w:p>
+        </w:tc>
+        <w:tc>
+          <w:tcPr>
+            <w:tcW w:type="dxa" w:w="6192"/>
+            <w:vAlign w:val="center"/>
+            <w:tcMar>
+              <w:top w:w="60" w:type="dxa"/>
+              <w:start w:w="120" w:type="dxa"/>
+              <w:bottom w:w="60" w:type="dxa"/>
+              <w:end w:w="120" w:type="dxa"/>
+            </w:tcMar>
+          </w:tcPr>
+          <w:p>
+            <w:pPr>
+              <w:spacing w:after="0" w:before="0"/>
+            </w:pPr>
+            <w:r>
+              <w:rPr>
+                <w:rFonts w:ascii="TH Sarabun New" w:hAnsi="TH Sarabun New" w:cs="TH Sarabun New"/>
+                <w:b w:val="0"/>
+                <w:color w:val="404040"/>
+                <w:sz w:val="28"/>
+              </w:rPr>
+              <w:t>{{ioc_domain}}</w:t>
+            </w:r>
+          </w:p>
+        </w:tc>
+      </w:tr>
+      <w:tr>
+        <w:tc>
+          <w:tcPr>
+            <w:tcW w:type="dxa" w:w="3312"/>
+            <w:vAlign w:val="center"/>
+            <w:tcMar>
+              <w:top w:w="60" w:type="dxa"/>
+              <w:start w:w="120" w:type="dxa"/>
+              <w:bottom w:w="60" w:type="dxa"/>
+              <w:end w:w="120" w:type="dxa"/>
+            </w:tcMar>
+            <w:shd w:val="clear" w:fill="F2F2F2"/>
+          </w:tcPr>
+          <w:p>
+            <w:pPr>
+              <w:spacing w:after="0" w:before="0"/>
+            </w:pPr>
+            <w:r>
+              <w:rPr>
+                <w:rFonts w:ascii="TH Sarabun New" w:hAnsi="TH Sarabun New" w:cs="TH Sarabun New"/>
+                <w:b/>
+                <w:color w:val="404040"/>
+                <w:sz w:val="28"/>
+              </w:rPr>
+              <w:t>URL</w:t>
+            </w:r>
+          </w:p>
+        </w:tc>
+        <w:tc>
+          <w:tcPr>
+            <w:tcW w:type="dxa" w:w="6192"/>
+            <w:vAlign w:val="center"/>
+            <w:tcMar>
+              <w:top w:w="60" w:type="dxa"/>
+              <w:start w:w="120" w:type="dxa"/>
+              <w:bottom w:w="60" w:type="dxa"/>
+              <w:end w:w="120" w:type="dxa"/>
+            </w:tcMar>
+          </w:tcPr>
+          <w:p>
+            <w:pPr>
+              <w:spacing w:after="0" w:before="0"/>
+            </w:pPr>
+            <w:r>
+              <w:rPr>
+                <w:rFonts w:ascii="TH Sarabun New" w:hAnsi="TH Sarabun New" w:cs="TH Sarabun New"/>
+                <w:b w:val="0"/>
+                <w:color w:val="404040"/>
+                <w:sz w:val="28"/>
+              </w:rPr>
+              <w:t>{{ioc_url}}</w:t>
+            </w:r>
+          </w:p>
+        </w:tc>
+      </w:tr>
+      <w:tr>
+        <w:tc>
+          <w:tcPr>
+            <w:tcW w:type="dxa" w:w="3312"/>
+            <w:vAlign w:val="center"/>
+            <w:tcMar>
+              <w:top w:w="60" w:type="dxa"/>
+              <w:start w:w="120" w:type="dxa"/>
+              <w:bottom w:w="60" w:type="dxa"/>
+              <w:end w:w="120" w:type="dxa"/>
+            </w:tcMar>
+            <w:shd w:val="clear" w:fill="F2F2F2"/>
+          </w:tcPr>
+          <w:p>
+            <w:pPr>
+              <w:spacing w:after="0" w:before="0"/>
+            </w:pPr>
+            <w:r>
+              <w:rPr>
+                <w:rFonts w:ascii="TH Sarabun New" w:hAnsi="TH Sarabun New" w:cs="TH Sarabun New"/>
+                <w:b/>
+                <w:color w:val="404040"/>
+                <w:sz w:val="28"/>
+              </w:rPr>
               <w:t>IP</w:t>
             </w:r>
           </w:p>

</xml_diff>

<commit_message>
11/9 Report improvement Part 2 + Manager Decision UI.
</commit_message>
<xml_diff>
--- a/apps/incidents/report_templates/report_template_v2.docx
+++ b/apps/incidents/report_templates/report_template_v2.docx
@@ -112,7 +112,7 @@
                 <w:rFonts w:ascii="TH Sarabun New" w:hAnsi="TH Sarabun New" w:cs="TH Sarabun New"/>
                 <w:b/>
                 <w:color w:val="1F2933"/>
-                <w:sz w:val="30"/>
+                <w:sz w:val="34"/>
               </w:rPr>
               <w:t>1. ข้อมูลทั่วไป (General Information)</w:t>
             </w:r>
@@ -145,9 +145,9 @@
             <w:tcW w:type="dxa" w:w="3312"/>
             <w:vAlign w:val="center"/>
             <w:tcMar>
-              <w:top w:w="60" w:type="dxa"/>
+              <w:top w:w="20" w:type="dxa"/>
               <w:start w:w="120" w:type="dxa"/>
-              <w:bottom w:w="60" w:type="dxa"/>
+              <w:bottom w:w="20" w:type="dxa"/>
               <w:end w:w="120" w:type="dxa"/>
             </w:tcMar>
             <w:shd w:val="clear" w:fill="F2F2F2"/>
@@ -161,7 +161,7 @@
                 <w:rFonts w:ascii="TH Sarabun New" w:hAnsi="TH Sarabun New" w:cs="TH Sarabun New"/>
                 <w:b/>
                 <w:color w:val="404040"/>
-                <w:sz w:val="28"/>
+                <w:sz w:val="32"/>
               </w:rPr>
               <w:t>1.1 หมายเลข Incident</w:t>
             </w:r>
@@ -172,9 +172,9 @@
             <w:tcW w:type="dxa" w:w="6192"/>
             <w:vAlign w:val="center"/>
             <w:tcMar>
-              <w:top w:w="60" w:type="dxa"/>
+              <w:top w:w="20" w:type="dxa"/>
               <w:start w:w="120" w:type="dxa"/>
-              <w:bottom w:w="60" w:type="dxa"/>
+              <w:bottom w:w="20" w:type="dxa"/>
               <w:end w:w="120" w:type="dxa"/>
             </w:tcMar>
           </w:tcPr>
@@ -187,7 +187,7 @@
                 <w:rFonts w:ascii="TH Sarabun New" w:hAnsi="TH Sarabun New" w:cs="TH Sarabun New"/>
                 <w:b w:val="0"/>
                 <w:color w:val="404040"/>
-                <w:sz w:val="28"/>
+                <w:sz w:val="32"/>
               </w:rPr>
               <w:t>{{ticket_id}}</w:t>
             </w:r>
@@ -200,9 +200,9 @@
             <w:tcW w:type="dxa" w:w="3312"/>
             <w:vAlign w:val="center"/>
             <w:tcMar>
-              <w:top w:w="60" w:type="dxa"/>
+              <w:top w:w="20" w:type="dxa"/>
               <w:start w:w="120" w:type="dxa"/>
-              <w:bottom w:w="60" w:type="dxa"/>
+              <w:bottom w:w="20" w:type="dxa"/>
               <w:end w:w="120" w:type="dxa"/>
             </w:tcMar>
             <w:shd w:val="clear" w:fill="F2F2F2"/>
@@ -216,7 +216,7 @@
                 <w:rFonts w:ascii="TH Sarabun New" w:hAnsi="TH Sarabun New" w:cs="TH Sarabun New"/>
                 <w:b/>
                 <w:color w:val="404040"/>
-                <w:sz w:val="28"/>
+                <w:sz w:val="32"/>
               </w:rPr>
               <w:t>1.2 วันที่ เวลา ที่พบเหตุ</w:t>
             </w:r>
@@ -227,9 +227,9 @@
             <w:tcW w:type="dxa" w:w="6192"/>
             <w:vAlign w:val="center"/>
             <w:tcMar>
-              <w:top w:w="60" w:type="dxa"/>
+              <w:top w:w="20" w:type="dxa"/>
               <w:start w:w="120" w:type="dxa"/>
-              <w:bottom w:w="60" w:type="dxa"/>
+              <w:bottom w:w="20" w:type="dxa"/>
               <w:end w:w="120" w:type="dxa"/>
             </w:tcMar>
           </w:tcPr>
@@ -242,7 +242,7 @@
                 <w:rFonts w:ascii="TH Sarabun New" w:hAnsi="TH Sarabun New" w:cs="TH Sarabun New"/>
                 <w:b w:val="0"/>
                 <w:color w:val="404040"/>
-                <w:sz w:val="28"/>
+                <w:sz w:val="32"/>
               </w:rPr>
               <w:t>{{incident_datetime}}</w:t>
             </w:r>
@@ -255,9 +255,9 @@
             <w:tcW w:type="dxa" w:w="3312"/>
             <w:vAlign w:val="center"/>
             <w:tcMar>
-              <w:top w:w="60" w:type="dxa"/>
+              <w:top w:w="20" w:type="dxa"/>
               <w:start w:w="120" w:type="dxa"/>
-              <w:bottom w:w="60" w:type="dxa"/>
+              <w:bottom w:w="20" w:type="dxa"/>
               <w:end w:w="120" w:type="dxa"/>
             </w:tcMar>
             <w:shd w:val="clear" w:fill="F2F2F2"/>
@@ -271,7 +271,7 @@
                 <w:rFonts w:ascii="TH Sarabun New" w:hAnsi="TH Sarabun New" w:cs="TH Sarabun New"/>
                 <w:b/>
                 <w:color w:val="404040"/>
-                <w:sz w:val="28"/>
+                <w:sz w:val="32"/>
               </w:rPr>
               <w:t>1.3 วันที่ เวลา ที่เกิดเหตุ</w:t>
             </w:r>
@@ -282,9 +282,9 @@
             <w:tcW w:type="dxa" w:w="6192"/>
             <w:vAlign w:val="center"/>
             <w:tcMar>
-              <w:top w:w="60" w:type="dxa"/>
+              <w:top w:w="20" w:type="dxa"/>
               <w:start w:w="120" w:type="dxa"/>
-              <w:bottom w:w="60" w:type="dxa"/>
+              <w:bottom w:w="20" w:type="dxa"/>
               <w:end w:w="120" w:type="dxa"/>
             </w:tcMar>
           </w:tcPr>
@@ -297,7 +297,7 @@
                 <w:rFonts w:ascii="TH Sarabun New" w:hAnsi="TH Sarabun New" w:cs="TH Sarabun New"/>
                 <w:b w:val="0"/>
                 <w:color w:val="404040"/>
-                <w:sz w:val="28"/>
+                <w:sz w:val="32"/>
               </w:rPr>
               <w:t>{{event_occurred_at}}</w:t>
             </w:r>
@@ -310,9 +310,9 @@
             <w:tcW w:type="dxa" w:w="3312"/>
             <w:vAlign w:val="center"/>
             <w:tcMar>
-              <w:top w:w="60" w:type="dxa"/>
+              <w:top w:w="20" w:type="dxa"/>
               <w:start w:w="120" w:type="dxa"/>
-              <w:bottom w:w="60" w:type="dxa"/>
+              <w:bottom w:w="20" w:type="dxa"/>
               <w:end w:w="120" w:type="dxa"/>
             </w:tcMar>
             <w:shd w:val="clear" w:fill="F2F2F2"/>
@@ -326,7 +326,7 @@
                 <w:rFonts w:ascii="TH Sarabun New" w:hAnsi="TH Sarabun New" w:cs="TH Sarabun New"/>
                 <w:b/>
                 <w:color w:val="404040"/>
-                <w:sz w:val="28"/>
+                <w:sz w:val="32"/>
               </w:rPr>
               <w:t>1.4 ชื่อ incident/event</w:t>
             </w:r>
@@ -337,9 +337,9 @@
             <w:tcW w:type="dxa" w:w="6192"/>
             <w:vAlign w:val="center"/>
             <w:tcMar>
-              <w:top w:w="60" w:type="dxa"/>
+              <w:top w:w="20" w:type="dxa"/>
               <w:start w:w="120" w:type="dxa"/>
-              <w:bottom w:w="60" w:type="dxa"/>
+              <w:bottom w:w="20" w:type="dxa"/>
               <w:end w:w="120" w:type="dxa"/>
             </w:tcMar>
           </w:tcPr>
@@ -352,7 +352,7 @@
                 <w:rFonts w:ascii="TH Sarabun New" w:hAnsi="TH Sarabun New" w:cs="TH Sarabun New"/>
                 <w:b w:val="0"/>
                 <w:color w:val="404040"/>
-                <w:sz w:val="28"/>
+                <w:sz w:val="32"/>
               </w:rPr>
               <w:t>{{incident_name}}</w:t>
             </w:r>
@@ -365,9 +365,9 @@
             <w:tcW w:type="dxa" w:w="3312"/>
             <w:vAlign w:val="center"/>
             <w:tcMar>
-              <w:top w:w="60" w:type="dxa"/>
+              <w:top w:w="20" w:type="dxa"/>
               <w:start w:w="120" w:type="dxa"/>
-              <w:bottom w:w="60" w:type="dxa"/>
+              <w:bottom w:w="20" w:type="dxa"/>
               <w:end w:w="120" w:type="dxa"/>
             </w:tcMar>
             <w:shd w:val="clear" w:fill="F2F2F2"/>
@@ -381,7 +381,7 @@
                 <w:rFonts w:ascii="TH Sarabun New" w:hAnsi="TH Sarabun New" w:cs="TH Sarabun New"/>
                 <w:b/>
                 <w:color w:val="404040"/>
-                <w:sz w:val="28"/>
+                <w:sz w:val="32"/>
               </w:rPr>
               <w:t>1.5 ประเภท: event หรือ incident</w:t>
             </w:r>
@@ -392,9 +392,9 @@
             <w:tcW w:type="dxa" w:w="6192"/>
             <w:vAlign w:val="center"/>
             <w:tcMar>
-              <w:top w:w="60" w:type="dxa"/>
+              <w:top w:w="20" w:type="dxa"/>
               <w:start w:w="120" w:type="dxa"/>
-              <w:bottom w:w="60" w:type="dxa"/>
+              <w:bottom w:w="20" w:type="dxa"/>
               <w:end w:w="120" w:type="dxa"/>
             </w:tcMar>
           </w:tcPr>
@@ -407,7 +407,7 @@
                 <w:rFonts w:ascii="DejaVu Sans" w:hAnsi="DejaVu Sans" w:cs="DejaVu Sans"/>
                 <w:b w:val="0"/>
                 <w:color w:val="404040"/>
-                <w:sz w:val="28"/>
+                <w:sz w:val="32"/>
               </w:rPr>
               <w:t>{{chk_class_event}}</w:t>
             </w:r>
@@ -416,7 +416,7 @@
                 <w:rFonts w:ascii="TH Sarabun New" w:hAnsi="TH Sarabun New" w:cs="TH Sarabun New"/>
                 <w:b w:val="0"/>
                 <w:color w:val="404040"/>
-                <w:sz w:val="28"/>
+                <w:sz w:val="32"/>
               </w:rPr>
               <w:t xml:space="preserve"> Event</w:t>
             </w:r>
@@ -425,7 +425,7 @@
                 <w:rFonts w:ascii="TH Sarabun New" w:hAnsi="TH Sarabun New" w:cs="TH Sarabun New"/>
                 <w:b w:val="0"/>
                 <w:color w:val="404040"/>
-                <w:sz w:val="28"/>
+                <w:sz w:val="32"/>
               </w:rPr>
               <w:t xml:space="preserve">   </w:t>
             </w:r>
@@ -434,7 +434,7 @@
                 <w:rFonts w:ascii="DejaVu Sans" w:hAnsi="DejaVu Sans" w:cs="DejaVu Sans"/>
                 <w:b w:val="0"/>
                 <w:color w:val="404040"/>
-                <w:sz w:val="28"/>
+                <w:sz w:val="32"/>
               </w:rPr>
               <w:t>{{chk_class_incident}}</w:t>
             </w:r>
@@ -443,7 +443,7 @@
                 <w:rFonts w:ascii="TH Sarabun New" w:hAnsi="TH Sarabun New" w:cs="TH Sarabun New"/>
                 <w:b w:val="0"/>
                 <w:color w:val="404040"/>
-                <w:sz w:val="28"/>
+                <w:sz w:val="32"/>
               </w:rPr>
               <w:t xml:space="preserve"> Incident</w:t>
             </w:r>
@@ -456,9 +456,9 @@
             <w:tcW w:type="dxa" w:w="3312"/>
             <w:vAlign w:val="center"/>
             <w:tcMar>
-              <w:top w:w="60" w:type="dxa"/>
+              <w:top w:w="20" w:type="dxa"/>
               <w:start w:w="120" w:type="dxa"/>
-              <w:bottom w:w="60" w:type="dxa"/>
+              <w:bottom w:w="20" w:type="dxa"/>
               <w:end w:w="120" w:type="dxa"/>
             </w:tcMar>
             <w:shd w:val="clear" w:fill="F2F2F2"/>
@@ -472,7 +472,7 @@
                 <w:rFonts w:ascii="TH Sarabun New" w:hAnsi="TH Sarabun New" w:cs="TH Sarabun New"/>
                 <w:b/>
                 <w:color w:val="404040"/>
-                <w:sz w:val="28"/>
+                <w:sz w:val="32"/>
               </w:rPr>
               <w:t>1.6 ระดับความสำคัญ</w:t>
             </w:r>
@@ -483,9 +483,9 @@
             <w:tcW w:type="dxa" w:w="6192"/>
             <w:vAlign w:val="center"/>
             <w:tcMar>
-              <w:top w:w="60" w:type="dxa"/>
+              <w:top w:w="20" w:type="dxa"/>
               <w:start w:w="120" w:type="dxa"/>
-              <w:bottom w:w="60" w:type="dxa"/>
+              <w:bottom w:w="20" w:type="dxa"/>
               <w:end w:w="120" w:type="dxa"/>
             </w:tcMar>
           </w:tcPr>
@@ -498,7 +498,7 @@
                 <w:rFonts w:ascii="DejaVu Sans" w:hAnsi="DejaVu Sans" w:cs="DejaVu Sans"/>
                 <w:b w:val="0"/>
                 <w:color w:val="404040"/>
-                <w:sz w:val="28"/>
+                <w:sz w:val="32"/>
               </w:rPr>
               <w:t>{{chk_imp_general}}</w:t>
             </w:r>
@@ -507,7 +507,7 @@
                 <w:rFonts w:ascii="TH Sarabun New" w:hAnsi="TH Sarabun New" w:cs="TH Sarabun New"/>
                 <w:b w:val="0"/>
                 <w:color w:val="404040"/>
-                <w:sz w:val="28"/>
+                <w:sz w:val="32"/>
               </w:rPr>
               <w:t xml:space="preserve"> ปกติทั่วไป</w:t>
             </w:r>
@@ -516,7 +516,7 @@
                 <w:rFonts w:ascii="TH Sarabun New" w:hAnsi="TH Sarabun New" w:cs="TH Sarabun New"/>
                 <w:b w:val="0"/>
                 <w:color w:val="404040"/>
-                <w:sz w:val="28"/>
+                <w:sz w:val="32"/>
               </w:rPr>
               <w:t xml:space="preserve">   </w:t>
             </w:r>
@@ -525,7 +525,7 @@
                 <w:rFonts w:ascii="DejaVu Sans" w:hAnsi="DejaVu Sans" w:cs="DejaVu Sans"/>
                 <w:b w:val="0"/>
                 <w:color w:val="404040"/>
-                <w:sz w:val="28"/>
+                <w:sz w:val="32"/>
               </w:rPr>
               <w:t>{{chk_imp_normal}}</w:t>
             </w:r>
@@ -534,7 +534,7 @@
                 <w:rFonts w:ascii="TH Sarabun New" w:hAnsi="TH Sarabun New" w:cs="TH Sarabun New"/>
                 <w:b w:val="0"/>
                 <w:color w:val="404040"/>
-                <w:sz w:val="28"/>
+                <w:sz w:val="32"/>
               </w:rPr>
               <w:t xml:space="preserve"> สำคัญ</w:t>
             </w:r>
@@ -543,7 +543,7 @@
                 <w:rFonts w:ascii="TH Sarabun New" w:hAnsi="TH Sarabun New" w:cs="TH Sarabun New"/>
                 <w:b w:val="0"/>
                 <w:color w:val="404040"/>
-                <w:sz w:val="28"/>
+                <w:sz w:val="32"/>
               </w:rPr>
               <w:t xml:space="preserve">   </w:t>
             </w:r>
@@ -552,7 +552,7 @@
                 <w:rFonts w:ascii="DejaVu Sans" w:hAnsi="DejaVu Sans" w:cs="DejaVu Sans"/>
                 <w:b w:val="0"/>
                 <w:color w:val="404040"/>
-                <w:sz w:val="28"/>
+                <w:sz w:val="32"/>
               </w:rPr>
               <w:t>{{chk_imp_high}}</w:t>
             </w:r>
@@ -561,7 +561,7 @@
                 <w:rFonts w:ascii="TH Sarabun New" w:hAnsi="TH Sarabun New" w:cs="TH Sarabun New"/>
                 <w:b w:val="0"/>
                 <w:color w:val="404040"/>
-                <w:sz w:val="28"/>
+                <w:sz w:val="32"/>
               </w:rPr>
               <w:t xml:space="preserve"> สำคัญมาก</w:t>
             </w:r>
@@ -574,9 +574,9 @@
             <w:tcW w:type="dxa" w:w="3312"/>
             <w:vAlign w:val="center"/>
             <w:tcMar>
-              <w:top w:w="60" w:type="dxa"/>
+              <w:top w:w="20" w:type="dxa"/>
               <w:start w:w="120" w:type="dxa"/>
-              <w:bottom w:w="60" w:type="dxa"/>
+              <w:bottom w:w="20" w:type="dxa"/>
               <w:end w:w="120" w:type="dxa"/>
             </w:tcMar>
             <w:shd w:val="clear" w:fill="F2F2F2"/>
@@ -590,7 +590,7 @@
                 <w:rFonts w:ascii="TH Sarabun New" w:hAnsi="TH Sarabun New" w:cs="TH Sarabun New"/>
                 <w:b/>
                 <w:color w:val="404040"/>
-                <w:sz w:val="28"/>
+                <w:sz w:val="32"/>
               </w:rPr>
               <w:t>1.7 ระดับความรุนแรง (อ้างอิงตามระบบ SIEM)</w:t>
             </w:r>
@@ -601,9 +601,9 @@
             <w:tcW w:type="dxa" w:w="6192"/>
             <w:vAlign w:val="center"/>
             <w:tcMar>
-              <w:top w:w="60" w:type="dxa"/>
+              <w:top w:w="20" w:type="dxa"/>
               <w:start w:w="120" w:type="dxa"/>
-              <w:bottom w:w="60" w:type="dxa"/>
+              <w:bottom w:w="20" w:type="dxa"/>
               <w:end w:w="120" w:type="dxa"/>
             </w:tcMar>
           </w:tcPr>
@@ -616,7 +616,7 @@
                 <w:rFonts w:ascii="DejaVu Sans" w:hAnsi="DejaVu Sans" w:cs="DejaVu Sans"/>
                 <w:b w:val="0"/>
                 <w:color w:val="404040"/>
-                <w:sz w:val="28"/>
+                <w:sz w:val="32"/>
               </w:rPr>
               <w:t>{{chk_sev_low}}</w:t>
             </w:r>
@@ -625,7 +625,7 @@
                 <w:rFonts w:ascii="TH Sarabun New" w:hAnsi="TH Sarabun New" w:cs="TH Sarabun New"/>
                 <w:b w:val="0"/>
                 <w:color w:val="404040"/>
-                <w:sz w:val="28"/>
+                <w:sz w:val="32"/>
               </w:rPr>
               <w:t xml:space="preserve"> Low</w:t>
             </w:r>
@@ -634,7 +634,7 @@
                 <w:rFonts w:ascii="TH Sarabun New" w:hAnsi="TH Sarabun New" w:cs="TH Sarabun New"/>
                 <w:b w:val="0"/>
                 <w:color w:val="404040"/>
-                <w:sz w:val="28"/>
+                <w:sz w:val="32"/>
               </w:rPr>
               <w:t xml:space="preserve">   </w:t>
             </w:r>
@@ -643,7 +643,7 @@
                 <w:rFonts w:ascii="DejaVu Sans" w:hAnsi="DejaVu Sans" w:cs="DejaVu Sans"/>
                 <w:b w:val="0"/>
                 <w:color w:val="404040"/>
-                <w:sz w:val="28"/>
+                <w:sz w:val="32"/>
               </w:rPr>
               <w:t>{{chk_sev_medium}}</w:t>
             </w:r>
@@ -652,7 +652,7 @@
                 <w:rFonts w:ascii="TH Sarabun New" w:hAnsi="TH Sarabun New" w:cs="TH Sarabun New"/>
                 <w:b w:val="0"/>
                 <w:color w:val="404040"/>
-                <w:sz w:val="28"/>
+                <w:sz w:val="32"/>
               </w:rPr>
               <w:t xml:space="preserve"> Medium</w:t>
             </w:r>
@@ -661,7 +661,7 @@
                 <w:rFonts w:ascii="TH Sarabun New" w:hAnsi="TH Sarabun New" w:cs="TH Sarabun New"/>
                 <w:b w:val="0"/>
                 <w:color w:val="404040"/>
-                <w:sz w:val="28"/>
+                <w:sz w:val="32"/>
               </w:rPr>
               <w:t xml:space="preserve">   </w:t>
             </w:r>
@@ -670,7 +670,7 @@
                 <w:rFonts w:ascii="DejaVu Sans" w:hAnsi="DejaVu Sans" w:cs="DejaVu Sans"/>
                 <w:b w:val="0"/>
                 <w:color w:val="404040"/>
-                <w:sz w:val="28"/>
+                <w:sz w:val="32"/>
               </w:rPr>
               <w:t>{{chk_sev_high}}</w:t>
             </w:r>
@@ -679,7 +679,7 @@
                 <w:rFonts w:ascii="TH Sarabun New" w:hAnsi="TH Sarabun New" w:cs="TH Sarabun New"/>
                 <w:b w:val="0"/>
                 <w:color w:val="404040"/>
-                <w:sz w:val="28"/>
+                <w:sz w:val="32"/>
               </w:rPr>
               <w:t xml:space="preserve"> High</w:t>
             </w:r>
@@ -688,7 +688,7 @@
                 <w:rFonts w:ascii="TH Sarabun New" w:hAnsi="TH Sarabun New" w:cs="TH Sarabun New"/>
                 <w:b w:val="0"/>
                 <w:color w:val="404040"/>
-                <w:sz w:val="28"/>
+                <w:sz w:val="32"/>
               </w:rPr>
               <w:t xml:space="preserve">   </w:t>
             </w:r>
@@ -697,7 +697,7 @@
                 <w:rFonts w:ascii="DejaVu Sans" w:hAnsi="DejaVu Sans" w:cs="DejaVu Sans"/>
                 <w:b w:val="0"/>
                 <w:color w:val="404040"/>
-                <w:sz w:val="28"/>
+                <w:sz w:val="32"/>
               </w:rPr>
               <w:t>{{chk_sev_critical}}</w:t>
             </w:r>
@@ -706,7 +706,7 @@
                 <w:rFonts w:ascii="TH Sarabun New" w:hAnsi="TH Sarabun New" w:cs="TH Sarabun New"/>
                 <w:b w:val="0"/>
                 <w:color w:val="404040"/>
-                <w:sz w:val="28"/>
+                <w:sz w:val="32"/>
               </w:rPr>
               <w:t xml:space="preserve"> Critical</w:t>
             </w:r>
@@ -719,9 +719,9 @@
             <w:tcW w:type="dxa" w:w="3312"/>
             <w:vAlign w:val="center"/>
             <w:tcMar>
-              <w:top w:w="60" w:type="dxa"/>
+              <w:top w:w="20" w:type="dxa"/>
               <w:start w:w="120" w:type="dxa"/>
-              <w:bottom w:w="60" w:type="dxa"/>
+              <w:bottom w:w="20" w:type="dxa"/>
               <w:end w:w="120" w:type="dxa"/>
             </w:tcMar>
             <w:shd w:val="clear" w:fill="F2F2F2"/>
@@ -735,7 +735,7 @@
                 <w:rFonts w:ascii="TH Sarabun New" w:hAnsi="TH Sarabun New" w:cs="TH Sarabun New"/>
                 <w:b/>
                 <w:color w:val="404040"/>
-                <w:sz w:val="28"/>
+                <w:sz w:val="32"/>
               </w:rPr>
               <w:t>1.8 ระดับความรุนแรง (อ้างอิงตาม สกมช.)</w:t>
             </w:r>
@@ -746,9 +746,9 @@
             <w:tcW w:type="dxa" w:w="6192"/>
             <w:vAlign w:val="center"/>
             <w:tcMar>
-              <w:top w:w="60" w:type="dxa"/>
+              <w:top w:w="20" w:type="dxa"/>
               <w:start w:w="120" w:type="dxa"/>
-              <w:bottom w:w="60" w:type="dxa"/>
+              <w:bottom w:w="20" w:type="dxa"/>
               <w:end w:w="120" w:type="dxa"/>
             </w:tcMar>
           </w:tcPr>
@@ -761,7 +761,7 @@
                 <w:rFonts w:ascii="DejaVu Sans" w:hAnsi="DejaVu Sans" w:cs="DejaVu Sans"/>
                 <w:b w:val="0"/>
                 <w:color w:val="404040"/>
-                <w:sz w:val="28"/>
+                <w:sz w:val="32"/>
               </w:rPr>
               <w:t>{{chk_ncsa_nonsevere}}</w:t>
             </w:r>
@@ -770,7 +770,7 @@
                 <w:rFonts w:ascii="TH Sarabun New" w:hAnsi="TH Sarabun New" w:cs="TH Sarabun New"/>
                 <w:b w:val="0"/>
                 <w:color w:val="404040"/>
-                <w:sz w:val="28"/>
+                <w:sz w:val="32"/>
               </w:rPr>
               <w:t xml:space="preserve"> ไม่ร้ายแรง</w:t>
             </w:r>
@@ -779,7 +779,7 @@
                 <w:rFonts w:ascii="TH Sarabun New" w:hAnsi="TH Sarabun New" w:cs="TH Sarabun New"/>
                 <w:b w:val="0"/>
                 <w:color w:val="404040"/>
-                <w:sz w:val="28"/>
+                <w:sz w:val="32"/>
               </w:rPr>
               <w:t xml:space="preserve">   </w:t>
             </w:r>
@@ -788,7 +788,7 @@
                 <w:rFonts w:ascii="DejaVu Sans" w:hAnsi="DejaVu Sans" w:cs="DejaVu Sans"/>
                 <w:b w:val="0"/>
                 <w:color w:val="404040"/>
-                <w:sz w:val="28"/>
+                <w:sz w:val="32"/>
               </w:rPr>
               <w:t>{{chk_ncsa_severe}}</w:t>
             </w:r>
@@ -797,7 +797,7 @@
                 <w:rFonts w:ascii="TH Sarabun New" w:hAnsi="TH Sarabun New" w:cs="TH Sarabun New"/>
                 <w:b w:val="0"/>
                 <w:color w:val="404040"/>
-                <w:sz w:val="28"/>
+                <w:sz w:val="32"/>
               </w:rPr>
               <w:t xml:space="preserve"> ร้ายแรง</w:t>
             </w:r>
@@ -806,7 +806,7 @@
                 <w:rFonts w:ascii="TH Sarabun New" w:hAnsi="TH Sarabun New" w:cs="TH Sarabun New"/>
                 <w:b w:val="0"/>
                 <w:color w:val="404040"/>
-                <w:sz w:val="28"/>
+                <w:sz w:val="32"/>
               </w:rPr>
               <w:t xml:space="preserve">   </w:t>
             </w:r>
@@ -815,7 +815,7 @@
                 <w:rFonts w:ascii="DejaVu Sans" w:hAnsi="DejaVu Sans" w:cs="DejaVu Sans"/>
                 <w:b w:val="0"/>
                 <w:color w:val="404040"/>
-                <w:sz w:val="28"/>
+                <w:sz w:val="32"/>
               </w:rPr>
               <w:t>{{chk_ncsa_critical}}</w:t>
             </w:r>
@@ -824,7 +824,7 @@
                 <w:rFonts w:ascii="TH Sarabun New" w:hAnsi="TH Sarabun New" w:cs="TH Sarabun New"/>
                 <w:b w:val="0"/>
                 <w:color w:val="404040"/>
-                <w:sz w:val="28"/>
+                <w:sz w:val="32"/>
               </w:rPr>
               <w:t xml:space="preserve"> วิกฤต</w:t>
             </w:r>
@@ -837,9 +837,9 @@
             <w:tcW w:type="dxa" w:w="3312"/>
             <w:vAlign w:val="center"/>
             <w:tcMar>
-              <w:top w:w="60" w:type="dxa"/>
+              <w:top w:w="20" w:type="dxa"/>
               <w:start w:w="120" w:type="dxa"/>
-              <w:bottom w:w="60" w:type="dxa"/>
+              <w:bottom w:w="20" w:type="dxa"/>
               <w:end w:w="120" w:type="dxa"/>
             </w:tcMar>
             <w:shd w:val="clear" w:fill="F2F2F2"/>
@@ -853,7 +853,7 @@
                 <w:rFonts w:ascii="TH Sarabun New" w:hAnsi="TH Sarabun New" w:cs="TH Sarabun New"/>
                 <w:b/>
                 <w:color w:val="404040"/>
-                <w:sz w:val="28"/>
+                <w:sz w:val="32"/>
               </w:rPr>
               <w:t>1.9 *หมวดหมู่ของภัยคุกคามทางไซเบอร์ (Category)</w:t>
             </w:r>
@@ -864,9 +864,9 @@
             <w:tcW w:type="dxa" w:w="6192"/>
             <w:vAlign w:val="center"/>
             <w:tcMar>
-              <w:top w:w="60" w:type="dxa"/>
+              <w:top w:w="20" w:type="dxa"/>
               <w:start w:w="120" w:type="dxa"/>
-              <w:bottom w:w="60" w:type="dxa"/>
+              <w:bottom w:w="20" w:type="dxa"/>
               <w:end w:w="120" w:type="dxa"/>
             </w:tcMar>
           </w:tcPr>
@@ -879,7 +879,7 @@
                 <w:rFonts w:ascii="TH Sarabun New" w:hAnsi="TH Sarabun New" w:cs="TH Sarabun New"/>
                 <w:b w:val="0"/>
                 <w:color w:val="404040"/>
-                <w:sz w:val="28"/>
+                <w:sz w:val="32"/>
               </w:rPr>
               <w:t>{{category}}</w:t>
             </w:r>
@@ -892,9 +892,9 @@
             <w:tcW w:type="dxa" w:w="3312"/>
             <w:vAlign w:val="center"/>
             <w:tcMar>
-              <w:top w:w="60" w:type="dxa"/>
+              <w:top w:w="20" w:type="dxa"/>
               <w:start w:w="120" w:type="dxa"/>
-              <w:bottom w:w="60" w:type="dxa"/>
+              <w:bottom w:w="20" w:type="dxa"/>
               <w:end w:w="120" w:type="dxa"/>
             </w:tcMar>
             <w:shd w:val="clear" w:fill="F2F2F2"/>
@@ -908,7 +908,7 @@
                 <w:rFonts w:ascii="TH Sarabun New" w:hAnsi="TH Sarabun New" w:cs="TH Sarabun New"/>
                 <w:b/>
                 <w:color w:val="404040"/>
-                <w:sz w:val="28"/>
+                <w:sz w:val="32"/>
               </w:rPr>
               <w:t>1.10 ทรัพย์สินที่ได้รับผลกระทบ</w:t>
             </w:r>
@@ -919,9 +919,9 @@
             <w:tcW w:type="dxa" w:w="6192"/>
             <w:vAlign w:val="center"/>
             <w:tcMar>
-              <w:top w:w="60" w:type="dxa"/>
+              <w:top w:w="20" w:type="dxa"/>
               <w:start w:w="120" w:type="dxa"/>
-              <w:bottom w:w="60" w:type="dxa"/>
+              <w:bottom w:w="20" w:type="dxa"/>
               <w:end w:w="120" w:type="dxa"/>
             </w:tcMar>
           </w:tcPr>
@@ -934,7 +934,7 @@
                 <w:rFonts w:ascii="TH Sarabun New" w:hAnsi="TH Sarabun New" w:cs="TH Sarabun New"/>
                 <w:b w:val="0"/>
                 <w:color w:val="404040"/>
-                <w:sz w:val="28"/>
+                <w:sz w:val="32"/>
               </w:rPr>
               <w:t>{{host_ip}}</w:t>
             </w:r>
@@ -947,9 +947,9 @@
             <w:tcW w:type="dxa" w:w="3312"/>
             <w:vAlign w:val="center"/>
             <w:tcMar>
-              <w:top w:w="60" w:type="dxa"/>
+              <w:top w:w="20" w:type="dxa"/>
               <w:start w:w="120" w:type="dxa"/>
-              <w:bottom w:w="60" w:type="dxa"/>
+              <w:bottom w:w="20" w:type="dxa"/>
               <w:end w:w="120" w:type="dxa"/>
             </w:tcMar>
             <w:shd w:val="clear" w:fill="F2F2F2"/>
@@ -963,7 +963,7 @@
                 <w:rFonts w:ascii="TH Sarabun New" w:hAnsi="TH Sarabun New" w:cs="TH Sarabun New"/>
                 <w:b/>
                 <w:color w:val="404040"/>
-                <w:sz w:val="28"/>
+                <w:sz w:val="32"/>
               </w:rPr>
               <w:t>1.11 ประเภททรัพย์สินที่ได้รับผลกระทบ</w:t>
             </w:r>
@@ -974,9 +974,9 @@
             <w:tcW w:type="dxa" w:w="6192"/>
             <w:vAlign w:val="center"/>
             <w:tcMar>
-              <w:top w:w="60" w:type="dxa"/>
+              <w:top w:w="20" w:type="dxa"/>
               <w:start w:w="120" w:type="dxa"/>
-              <w:bottom w:w="60" w:type="dxa"/>
+              <w:bottom w:w="20" w:type="dxa"/>
               <w:end w:w="120" w:type="dxa"/>
             </w:tcMar>
           </w:tcPr>
@@ -989,7 +989,7 @@
                 <w:rFonts w:ascii="DejaVu Sans" w:hAnsi="DejaVu Sans" w:cs="DejaVu Sans"/>
                 <w:b w:val="0"/>
                 <w:color w:val="404040"/>
-                <w:sz w:val="28"/>
+                <w:sz w:val="32"/>
               </w:rPr>
               <w:t>{{chk_asset_computer}}</w:t>
             </w:r>
@@ -998,7 +998,7 @@
                 <w:rFonts w:ascii="TH Sarabun New" w:hAnsi="TH Sarabun New" w:cs="TH Sarabun New"/>
                 <w:b w:val="0"/>
                 <w:color w:val="404040"/>
-                <w:sz w:val="28"/>
+                <w:sz w:val="32"/>
               </w:rPr>
               <w:t xml:space="preserve"> Computer</w:t>
             </w:r>
@@ -1007,7 +1007,7 @@
                 <w:rFonts w:ascii="TH Sarabun New" w:hAnsi="TH Sarabun New" w:cs="TH Sarabun New"/>
                 <w:b w:val="0"/>
                 <w:color w:val="404040"/>
-                <w:sz w:val="28"/>
+                <w:sz w:val="32"/>
               </w:rPr>
               <w:t xml:space="preserve">   </w:t>
             </w:r>
@@ -1016,7 +1016,7 @@
                 <w:rFonts w:ascii="DejaVu Sans" w:hAnsi="DejaVu Sans" w:cs="DejaVu Sans"/>
                 <w:b w:val="0"/>
                 <w:color w:val="404040"/>
-                <w:sz w:val="28"/>
+                <w:sz w:val="32"/>
               </w:rPr>
               <w:t>{{chk_asset_server}}</w:t>
             </w:r>
@@ -1025,7 +1025,7 @@
                 <w:rFonts w:ascii="TH Sarabun New" w:hAnsi="TH Sarabun New" w:cs="TH Sarabun New"/>
                 <w:b w:val="0"/>
                 <w:color w:val="404040"/>
-                <w:sz w:val="28"/>
+                <w:sz w:val="32"/>
               </w:rPr>
               <w:t xml:space="preserve"> Server</w:t>
             </w:r>
@@ -1034,7 +1034,7 @@
                 <w:rFonts w:ascii="TH Sarabun New" w:hAnsi="TH Sarabun New" w:cs="TH Sarabun New"/>
                 <w:b w:val="0"/>
                 <w:color w:val="404040"/>
-                <w:sz w:val="28"/>
+                <w:sz w:val="32"/>
               </w:rPr>
               <w:t xml:space="preserve">   </w:t>
             </w:r>
@@ -1043,7 +1043,7 @@
                 <w:rFonts w:ascii="DejaVu Sans" w:hAnsi="DejaVu Sans" w:cs="DejaVu Sans"/>
                 <w:b w:val="0"/>
                 <w:color w:val="404040"/>
-                <w:sz w:val="28"/>
+                <w:sz w:val="32"/>
               </w:rPr>
               <w:t>{{chk_asset_network}}</w:t>
             </w:r>
@@ -1052,7 +1052,7 @@
                 <w:rFonts w:ascii="TH Sarabun New" w:hAnsi="TH Sarabun New" w:cs="TH Sarabun New"/>
                 <w:b w:val="0"/>
                 <w:color w:val="404040"/>
-                <w:sz w:val="28"/>
+                <w:sz w:val="32"/>
               </w:rPr>
               <w:t xml:space="preserve"> Network Device</w:t>
             </w:r>
@@ -1065,9 +1065,9 @@
             <w:tcW w:type="dxa" w:w="3312"/>
             <w:vAlign w:val="center"/>
             <w:tcMar>
-              <w:top w:w="60" w:type="dxa"/>
+              <w:top w:w="20" w:type="dxa"/>
               <w:start w:w="120" w:type="dxa"/>
-              <w:bottom w:w="60" w:type="dxa"/>
+              <w:bottom w:w="20" w:type="dxa"/>
               <w:end w:w="120" w:type="dxa"/>
             </w:tcMar>
             <w:shd w:val="clear" w:fill="F2F2F2"/>
@@ -1081,7 +1081,7 @@
                 <w:rFonts w:ascii="TH Sarabun New" w:hAnsi="TH Sarabun New" w:cs="TH Sarabun New"/>
                 <w:b/>
                 <w:color w:val="404040"/>
-                <w:sz w:val="28"/>
+                <w:sz w:val="32"/>
               </w:rPr>
               <w:t>1.12 ส่วนงานเจ้าของหรือผู้ดูแลทรัพย์สิน</w:t>
             </w:r>
@@ -1092,9 +1092,9 @@
             <w:tcW w:type="dxa" w:w="6192"/>
             <w:vAlign w:val="center"/>
             <w:tcMar>
-              <w:top w:w="60" w:type="dxa"/>
+              <w:top w:w="20" w:type="dxa"/>
               <w:start w:w="120" w:type="dxa"/>
-              <w:bottom w:w="60" w:type="dxa"/>
+              <w:bottom w:w="20" w:type="dxa"/>
               <w:end w:w="120" w:type="dxa"/>
             </w:tcMar>
           </w:tcPr>
@@ -1107,7 +1107,7 @@
                 <w:rFonts w:ascii="TH Sarabun New" w:hAnsi="TH Sarabun New" w:cs="TH Sarabun New"/>
                 <w:b w:val="0"/>
                 <w:color w:val="404040"/>
-                <w:sz w:val="28"/>
+                <w:sz w:val="32"/>
               </w:rPr>
               <w:t>{{asset_owner}}</w:t>
             </w:r>
@@ -1120,9 +1120,9 @@
             <w:tcW w:type="dxa" w:w="3312"/>
             <w:vAlign w:val="center"/>
             <w:tcMar>
-              <w:top w:w="60" w:type="dxa"/>
+              <w:top w:w="20" w:type="dxa"/>
               <w:start w:w="120" w:type="dxa"/>
-              <w:bottom w:w="60" w:type="dxa"/>
+              <w:bottom w:w="20" w:type="dxa"/>
               <w:end w:w="120" w:type="dxa"/>
             </w:tcMar>
             <w:shd w:val="clear" w:fill="F2F2F2"/>
@@ -1136,9 +1136,9 @@
                 <w:rFonts w:ascii="TH Sarabun New" w:hAnsi="TH Sarabun New" w:cs="TH Sarabun New"/>
                 <w:b/>
                 <w:color w:val="404040"/>
-                <w:sz w:val="28"/>
+                <w:sz w:val="32"/>
               </w:rPr>
-              <w:t>1.13 สถานะปัจจุบัน</w:t>
+              <w:t>1.13 รายละเอียด</w:t>
             </w:r>
           </w:p>
         </w:tc>
@@ -1147,9 +1147,9 @@
             <w:tcW w:type="dxa" w:w="6192"/>
             <w:vAlign w:val="center"/>
             <w:tcMar>
-              <w:top w:w="60" w:type="dxa"/>
+              <w:top w:w="20" w:type="dxa"/>
               <w:start w:w="120" w:type="dxa"/>
-              <w:bottom w:w="60" w:type="dxa"/>
+              <w:bottom w:w="20" w:type="dxa"/>
               <w:end w:w="120" w:type="dxa"/>
             </w:tcMar>
           </w:tcPr>
@@ -1162,9 +1162,9 @@
                 <w:rFonts w:ascii="TH Sarabun New" w:hAnsi="TH Sarabun New" w:cs="TH Sarabun New"/>
                 <w:b w:val="0"/>
                 <w:color w:val="404040"/>
-                <w:sz w:val="28"/>
+                <w:sz w:val="32"/>
               </w:rPr>
-              <w:t>{{status}}</w:t>
+              <w:t>{{incident_description}}</w:t>
             </w:r>
           </w:p>
         </w:tc>
@@ -1175,9 +1175,9 @@
             <w:tcW w:type="dxa" w:w="3312"/>
             <w:vAlign w:val="center"/>
             <w:tcMar>
-              <w:top w:w="60" w:type="dxa"/>
+              <w:top w:w="20" w:type="dxa"/>
               <w:start w:w="120" w:type="dxa"/>
-              <w:bottom w:w="60" w:type="dxa"/>
+              <w:bottom w:w="20" w:type="dxa"/>
               <w:end w:w="120" w:type="dxa"/>
             </w:tcMar>
             <w:shd w:val="clear" w:fill="F2F2F2"/>
@@ -1191,9 +1191,9 @@
                 <w:rFonts w:ascii="TH Sarabun New" w:hAnsi="TH Sarabun New" w:cs="TH Sarabun New"/>
                 <w:b/>
                 <w:color w:val="404040"/>
-                <w:sz w:val="28"/>
+                <w:sz w:val="32"/>
               </w:rPr>
-              <w:t>1.14 เรื่องที่ดำเนินการแล้ว</w:t>
+              <w:t>1.14 สถานะปัจจุบัน</w:t>
             </w:r>
           </w:p>
         </w:tc>
@@ -1202,9 +1202,9 @@
             <w:tcW w:type="dxa" w:w="6192"/>
             <w:vAlign w:val="center"/>
             <w:tcMar>
-              <w:top w:w="60" w:type="dxa"/>
+              <w:top w:w="20" w:type="dxa"/>
               <w:start w:w="120" w:type="dxa"/>
-              <w:bottom w:w="60" w:type="dxa"/>
+              <w:bottom w:w="20" w:type="dxa"/>
               <w:end w:w="120" w:type="dxa"/>
             </w:tcMar>
           </w:tcPr>
@@ -1217,9 +1217,9 @@
                 <w:rFonts w:ascii="TH Sarabun New" w:hAnsi="TH Sarabun New" w:cs="TH Sarabun New"/>
                 <w:b w:val="0"/>
                 <w:color w:val="404040"/>
-                <w:sz w:val="28"/>
+                <w:sz w:val="32"/>
               </w:rPr>
-              <w:t>{{actions_taken_summary}}</w:t>
+              <w:t>{{status}}</w:t>
             </w:r>
           </w:p>
         </w:tc>
@@ -1230,9 +1230,9 @@
             <w:tcW w:type="dxa" w:w="3312"/>
             <w:vAlign w:val="center"/>
             <w:tcMar>
-              <w:top w:w="60" w:type="dxa"/>
+              <w:top w:w="20" w:type="dxa"/>
               <w:start w:w="120" w:type="dxa"/>
-              <w:bottom w:w="60" w:type="dxa"/>
+              <w:bottom w:w="20" w:type="dxa"/>
               <w:end w:w="120" w:type="dxa"/>
             </w:tcMar>
             <w:shd w:val="clear" w:fill="F2F2F2"/>
@@ -1246,9 +1246,9 @@
                 <w:rFonts w:ascii="TH Sarabun New" w:hAnsi="TH Sarabun New" w:cs="TH Sarabun New"/>
                 <w:b/>
                 <w:color w:val="404040"/>
-                <w:sz w:val="28"/>
+                <w:sz w:val="32"/>
               </w:rPr>
-              <w:t>1.15 การที่จะดำเนินการลำดับถัดไป</w:t>
+              <w:t>1.15 เรื่องที่ดำเนินการแล้ว</w:t>
             </w:r>
           </w:p>
         </w:tc>
@@ -1257,9 +1257,9 @@
             <w:tcW w:type="dxa" w:w="6192"/>
             <w:vAlign w:val="center"/>
             <w:tcMar>
-              <w:top w:w="60" w:type="dxa"/>
+              <w:top w:w="20" w:type="dxa"/>
               <w:start w:w="120" w:type="dxa"/>
-              <w:bottom w:w="60" w:type="dxa"/>
+              <w:bottom w:w="20" w:type="dxa"/>
               <w:end w:w="120" w:type="dxa"/>
             </w:tcMar>
           </w:tcPr>
@@ -1272,9 +1272,9 @@
                 <w:rFonts w:ascii="TH Sarabun New" w:hAnsi="TH Sarabun New" w:cs="TH Sarabun New"/>
                 <w:b w:val="0"/>
                 <w:color w:val="404040"/>
-                <w:sz w:val="28"/>
+                <w:sz w:val="32"/>
               </w:rPr>
-              <w:t>{{next_steps_summary}}</w:t>
+              <w:t>{{actions_taken_summary}}</w:t>
             </w:r>
           </w:p>
         </w:tc>
@@ -1285,9 +1285,9 @@
             <w:tcW w:type="dxa" w:w="3312"/>
             <w:vAlign w:val="center"/>
             <w:tcMar>
-              <w:top w:w="60" w:type="dxa"/>
+              <w:top w:w="20" w:type="dxa"/>
               <w:start w:w="120" w:type="dxa"/>
-              <w:bottom w:w="60" w:type="dxa"/>
+              <w:bottom w:w="20" w:type="dxa"/>
               <w:end w:w="120" w:type="dxa"/>
             </w:tcMar>
             <w:shd w:val="clear" w:fill="F2F2F2"/>
@@ -1301,9 +1301,9 @@
                 <w:rFonts w:ascii="TH Sarabun New" w:hAnsi="TH Sarabun New" w:cs="TH Sarabun New"/>
                 <w:b/>
                 <w:color w:val="404040"/>
-                <w:sz w:val="28"/>
+                <w:sz w:val="32"/>
               </w:rPr>
-              <w:t>1.16 ผู้รายงาน</w:t>
+              <w:t>1.16 การที่จะดำเนินการลำดับถัดไป</w:t>
             </w:r>
           </w:p>
         </w:tc>
@@ -1312,9 +1312,9 @@
             <w:tcW w:type="dxa" w:w="6192"/>
             <w:vAlign w:val="center"/>
             <w:tcMar>
-              <w:top w:w="60" w:type="dxa"/>
+              <w:top w:w="20" w:type="dxa"/>
               <w:start w:w="120" w:type="dxa"/>
-              <w:bottom w:w="60" w:type="dxa"/>
+              <w:bottom w:w="20" w:type="dxa"/>
               <w:end w:w="120" w:type="dxa"/>
             </w:tcMar>
           </w:tcPr>
@@ -1327,9 +1327,9 @@
                 <w:rFonts w:ascii="TH Sarabun New" w:hAnsi="TH Sarabun New" w:cs="TH Sarabun New"/>
                 <w:b w:val="0"/>
                 <w:color w:val="404040"/>
-                <w:sz w:val="28"/>
+                <w:sz w:val="32"/>
               </w:rPr>
-              <w:t>{{reporter}}</w:t>
+              <w:t>{{next_steps_summary}}</w:t>
             </w:r>
           </w:p>
         </w:tc>
@@ -1340,9 +1340,9 @@
             <w:tcW w:type="dxa" w:w="3312"/>
             <w:vAlign w:val="center"/>
             <w:tcMar>
-              <w:top w:w="60" w:type="dxa"/>
+              <w:top w:w="20" w:type="dxa"/>
               <w:start w:w="120" w:type="dxa"/>
-              <w:bottom w:w="60" w:type="dxa"/>
+              <w:bottom w:w="20" w:type="dxa"/>
               <w:end w:w="120" w:type="dxa"/>
             </w:tcMar>
             <w:shd w:val="clear" w:fill="F2F2F2"/>
@@ -1356,9 +1356,9 @@
                 <w:rFonts w:ascii="TH Sarabun New" w:hAnsi="TH Sarabun New" w:cs="TH Sarabun New"/>
                 <w:b/>
                 <w:color w:val="404040"/>
-                <w:sz w:val="28"/>
+                <w:sz w:val="32"/>
               </w:rPr>
-              <w:t>1.17 แหล่งข้อมูล</w:t>
+              <w:t>1.17 ผู้รายงาน</w:t>
             </w:r>
           </w:p>
         </w:tc>
@@ -1367,9 +1367,9 @@
             <w:tcW w:type="dxa" w:w="6192"/>
             <w:vAlign w:val="center"/>
             <w:tcMar>
-              <w:top w:w="60" w:type="dxa"/>
+              <w:top w:w="20" w:type="dxa"/>
               <w:start w:w="120" w:type="dxa"/>
-              <w:bottom w:w="60" w:type="dxa"/>
+              <w:bottom w:w="20" w:type="dxa"/>
               <w:end w:w="120" w:type="dxa"/>
             </w:tcMar>
           </w:tcPr>
@@ -1382,7 +1382,62 @@
                 <w:rFonts w:ascii="TH Sarabun New" w:hAnsi="TH Sarabun New" w:cs="TH Sarabun New"/>
                 <w:b w:val="0"/>
                 <w:color w:val="404040"/>
-                <w:sz w:val="28"/>
+                <w:sz w:val="32"/>
+              </w:rPr>
+              <w:t>{{reporter}}</w:t>
+            </w:r>
+          </w:p>
+        </w:tc>
+      </w:tr>
+      <w:tr>
+        <w:tc>
+          <w:tcPr>
+            <w:tcW w:type="dxa" w:w="3312"/>
+            <w:vAlign w:val="center"/>
+            <w:tcMar>
+              <w:top w:w="20" w:type="dxa"/>
+              <w:start w:w="120" w:type="dxa"/>
+              <w:bottom w:w="20" w:type="dxa"/>
+              <w:end w:w="120" w:type="dxa"/>
+            </w:tcMar>
+            <w:shd w:val="clear" w:fill="F2F2F2"/>
+          </w:tcPr>
+          <w:p>
+            <w:pPr>
+              <w:spacing w:after="0" w:before="0"/>
+            </w:pPr>
+            <w:r>
+              <w:rPr>
+                <w:rFonts w:ascii="TH Sarabun New" w:hAnsi="TH Sarabun New" w:cs="TH Sarabun New"/>
+                <w:b/>
+                <w:color w:val="404040"/>
+                <w:sz w:val="32"/>
+              </w:rPr>
+              <w:t>1.18 แหล่งข้อมูล</w:t>
+            </w:r>
+          </w:p>
+        </w:tc>
+        <w:tc>
+          <w:tcPr>
+            <w:tcW w:type="dxa" w:w="6192"/>
+            <w:vAlign w:val="center"/>
+            <w:tcMar>
+              <w:top w:w="20" w:type="dxa"/>
+              <w:start w:w="120" w:type="dxa"/>
+              <w:bottom w:w="20" w:type="dxa"/>
+              <w:end w:w="120" w:type="dxa"/>
+            </w:tcMar>
+          </w:tcPr>
+          <w:p>
+            <w:pPr>
+              <w:spacing w:after="0" w:before="0"/>
+            </w:pPr>
+            <w:r>
+              <w:rPr>
+                <w:rFonts w:ascii="TH Sarabun New" w:hAnsi="TH Sarabun New" w:cs="TH Sarabun New"/>
+                <w:b w:val="0"/>
+                <w:color w:val="404040"/>
+                <w:sz w:val="32"/>
               </w:rPr>
               <w:t>{{log_source}}</w:t>
             </w:r>
@@ -1436,7 +1491,7 @@
                 <w:rFonts w:ascii="TH Sarabun New" w:hAnsi="TH Sarabun New" w:cs="TH Sarabun New"/>
                 <w:b/>
                 <w:color w:val="1F2933"/>
-                <w:sz w:val="30"/>
+                <w:sz w:val="34"/>
               </w:rPr>
               <w:t>2. รายละเอียดเหตุการณ์ (Incident Description)</w:t>
             </w:r>
@@ -1468,9 +1523,9 @@
             <w:tcW w:type="dxa" w:w="9504"/>
             <w:vAlign w:val="center"/>
             <w:tcMar>
-              <w:top w:w="100" w:type="dxa"/>
+              <w:top w:w="40" w:type="dxa"/>
               <w:start w:w="120" w:type="dxa"/>
-              <w:bottom w:w="100" w:type="dxa"/>
+              <w:bottom w:w="40" w:type="dxa"/>
               <w:end w:w="120" w:type="dxa"/>
             </w:tcMar>
           </w:tcPr>
@@ -1483,7 +1538,7 @@
                 <w:rFonts w:ascii="TH Sarabun New" w:hAnsi="TH Sarabun New" w:cs="TH Sarabun New"/>
                 <w:b w:val="0"/>
                 <w:color w:val="404040"/>
-                <w:sz w:val="28"/>
+                <w:sz w:val="32"/>
               </w:rPr>
               <w:t>{{incident_description}}</w:t>
             </w:r>
@@ -1537,7 +1592,7 @@
                 <w:rFonts w:ascii="TH Sarabun New" w:hAnsi="TH Sarabun New" w:cs="TH Sarabun New"/>
                 <w:b/>
                 <w:color w:val="1F2933"/>
-                <w:sz w:val="30"/>
+                <w:sz w:val="34"/>
               </w:rPr>
               <w:t>3. Scope ทรัพย์สินที่ได้รับผลกระทบ</w:t>
             </w:r>
@@ -1570,9 +1625,9 @@
             <w:tcW w:type="dxa" w:w="3312"/>
             <w:vAlign w:val="center"/>
             <w:tcMar>
-              <w:top w:w="60" w:type="dxa"/>
+              <w:top w:w="20" w:type="dxa"/>
               <w:start w:w="120" w:type="dxa"/>
-              <w:bottom w:w="60" w:type="dxa"/>
+              <w:bottom w:w="20" w:type="dxa"/>
               <w:end w:w="120" w:type="dxa"/>
             </w:tcMar>
             <w:shd w:val="clear" w:fill="F2F2F2"/>
@@ -1586,7 +1641,7 @@
                 <w:rFonts w:ascii="TH Sarabun New" w:hAnsi="TH Sarabun New" w:cs="TH Sarabun New"/>
                 <w:b/>
                 <w:color w:val="404040"/>
-                <w:sz w:val="28"/>
+                <w:sz w:val="32"/>
               </w:rPr>
               <w:t>ระบบ/บริการ</w:t>
             </w:r>
@@ -1597,9 +1652,9 @@
             <w:tcW w:type="dxa" w:w="6192"/>
             <w:vAlign w:val="center"/>
             <w:tcMar>
-              <w:top w:w="60" w:type="dxa"/>
+              <w:top w:w="20" w:type="dxa"/>
               <w:start w:w="120" w:type="dxa"/>
-              <w:bottom w:w="60" w:type="dxa"/>
+              <w:bottom w:w="20" w:type="dxa"/>
               <w:end w:w="120" w:type="dxa"/>
             </w:tcMar>
           </w:tcPr>
@@ -1612,7 +1667,7 @@
                 <w:rFonts w:ascii="TH Sarabun New" w:hAnsi="TH Sarabun New" w:cs="TH Sarabun New"/>
                 <w:b w:val="0"/>
                 <w:color w:val="404040"/>
-                <w:sz w:val="28"/>
+                <w:sz w:val="32"/>
               </w:rPr>
               <w:t>{{system_name}}</w:t>
             </w:r>
@@ -1625,9 +1680,9 @@
             <w:tcW w:type="dxa" w:w="3312"/>
             <w:vAlign w:val="center"/>
             <w:tcMar>
-              <w:top w:w="60" w:type="dxa"/>
+              <w:top w:w="20" w:type="dxa"/>
               <w:start w:w="120" w:type="dxa"/>
-              <w:bottom w:w="60" w:type="dxa"/>
+              <w:bottom w:w="20" w:type="dxa"/>
               <w:end w:w="120" w:type="dxa"/>
             </w:tcMar>
             <w:shd w:val="clear" w:fill="F2F2F2"/>
@@ -1641,7 +1696,7 @@
                 <w:rFonts w:ascii="TH Sarabun New" w:hAnsi="TH Sarabun New" w:cs="TH Sarabun New"/>
                 <w:b/>
                 <w:color w:val="404040"/>
-                <w:sz w:val="28"/>
+                <w:sz w:val="32"/>
               </w:rPr>
               <w:t>หน่วยงานเจ้าของทรัพย์สิน</w:t>
             </w:r>
@@ -1652,9 +1707,9 @@
             <w:tcW w:type="dxa" w:w="6192"/>
             <w:vAlign w:val="center"/>
             <w:tcMar>
-              <w:top w:w="60" w:type="dxa"/>
+              <w:top w:w="20" w:type="dxa"/>
               <w:start w:w="120" w:type="dxa"/>
-              <w:bottom w:w="60" w:type="dxa"/>
+              <w:bottom w:w="20" w:type="dxa"/>
               <w:end w:w="120" w:type="dxa"/>
             </w:tcMar>
           </w:tcPr>
@@ -1667,7 +1722,7 @@
                 <w:rFonts w:ascii="TH Sarabun New" w:hAnsi="TH Sarabun New" w:cs="TH Sarabun New"/>
                 <w:b w:val="0"/>
                 <w:color w:val="404040"/>
-                <w:sz w:val="28"/>
+                <w:sz w:val="32"/>
               </w:rPr>
               <w:t>{{asset_owner}}</w:t>
             </w:r>
@@ -1680,9 +1735,9 @@
             <w:tcW w:type="dxa" w:w="3312"/>
             <w:vAlign w:val="center"/>
             <w:tcMar>
-              <w:top w:w="60" w:type="dxa"/>
+              <w:top w:w="20" w:type="dxa"/>
               <w:start w:w="120" w:type="dxa"/>
-              <w:bottom w:w="60" w:type="dxa"/>
+              <w:bottom w:w="20" w:type="dxa"/>
               <w:end w:w="120" w:type="dxa"/>
             </w:tcMar>
             <w:shd w:val="clear" w:fill="F2F2F2"/>
@@ -1696,7 +1751,7 @@
                 <w:rFonts w:ascii="TH Sarabun New" w:hAnsi="TH Sarabun New" w:cs="TH Sarabun New"/>
                 <w:b/>
                 <w:color w:val="404040"/>
-                <w:sz w:val="28"/>
+                <w:sz w:val="32"/>
               </w:rPr>
               <w:t>ชื่อเจ้าของทรัพย์สิน</w:t>
             </w:r>
@@ -1707,9 +1762,9 @@
             <w:tcW w:type="dxa" w:w="6192"/>
             <w:vAlign w:val="center"/>
             <w:tcMar>
-              <w:top w:w="60" w:type="dxa"/>
+              <w:top w:w="20" w:type="dxa"/>
               <w:start w:w="120" w:type="dxa"/>
-              <w:bottom w:w="60" w:type="dxa"/>
+              <w:bottom w:w="20" w:type="dxa"/>
               <w:end w:w="120" w:type="dxa"/>
             </w:tcMar>
           </w:tcPr>
@@ -1722,7 +1777,7 @@
                 <w:rFonts w:ascii="TH Sarabun New" w:hAnsi="TH Sarabun New" w:cs="TH Sarabun New"/>
                 <w:b w:val="0"/>
                 <w:color w:val="404040"/>
-                <w:sz w:val="28"/>
+                <w:sz w:val="32"/>
               </w:rPr>
               <w:t>{{asset_owner_name}}</w:t>
             </w:r>
@@ -1735,9 +1790,9 @@
             <w:tcW w:type="dxa" w:w="3312"/>
             <w:vAlign w:val="center"/>
             <w:tcMar>
-              <w:top w:w="60" w:type="dxa"/>
+              <w:top w:w="20" w:type="dxa"/>
               <w:start w:w="120" w:type="dxa"/>
-              <w:bottom w:w="60" w:type="dxa"/>
+              <w:bottom w:w="20" w:type="dxa"/>
               <w:end w:w="120" w:type="dxa"/>
             </w:tcMar>
             <w:shd w:val="clear" w:fill="F2F2F2"/>
@@ -1751,7 +1806,7 @@
                 <w:rFonts w:ascii="TH Sarabun New" w:hAnsi="TH Sarabun New" w:cs="TH Sarabun New"/>
                 <w:b/>
                 <w:color w:val="404040"/>
-                <w:sz w:val="28"/>
+                <w:sz w:val="32"/>
               </w:rPr>
               <w:t>Host Name</w:t>
             </w:r>
@@ -1762,9 +1817,9 @@
             <w:tcW w:type="dxa" w:w="6192"/>
             <w:vAlign w:val="center"/>
             <w:tcMar>
-              <w:top w:w="60" w:type="dxa"/>
+              <w:top w:w="20" w:type="dxa"/>
               <w:start w:w="120" w:type="dxa"/>
-              <w:bottom w:w="60" w:type="dxa"/>
+              <w:bottom w:w="20" w:type="dxa"/>
               <w:end w:w="120" w:type="dxa"/>
             </w:tcMar>
           </w:tcPr>
@@ -1777,7 +1832,7 @@
                 <w:rFonts w:ascii="TH Sarabun New" w:hAnsi="TH Sarabun New" w:cs="TH Sarabun New"/>
                 <w:b w:val="0"/>
                 <w:color w:val="404040"/>
-                <w:sz w:val="28"/>
+                <w:sz w:val="32"/>
               </w:rPr>
               <w:t>{{host_name}}</w:t>
             </w:r>
@@ -1790,9 +1845,9 @@
             <w:tcW w:type="dxa" w:w="3312"/>
             <w:vAlign w:val="center"/>
             <w:tcMar>
-              <w:top w:w="60" w:type="dxa"/>
+              <w:top w:w="20" w:type="dxa"/>
               <w:start w:w="120" w:type="dxa"/>
-              <w:bottom w:w="60" w:type="dxa"/>
+              <w:bottom w:w="20" w:type="dxa"/>
               <w:end w:w="120" w:type="dxa"/>
             </w:tcMar>
             <w:shd w:val="clear" w:fill="F2F2F2"/>
@@ -1806,7 +1861,7 @@
                 <w:rFonts w:ascii="TH Sarabun New" w:hAnsi="TH Sarabun New" w:cs="TH Sarabun New"/>
                 <w:b/>
                 <w:color w:val="404040"/>
-                <w:sz w:val="28"/>
+                <w:sz w:val="32"/>
               </w:rPr>
               <w:t>IP Address</w:t>
             </w:r>
@@ -1817,9 +1872,9 @@
             <w:tcW w:type="dxa" w:w="6192"/>
             <w:vAlign w:val="center"/>
             <w:tcMar>
-              <w:top w:w="60" w:type="dxa"/>
+              <w:top w:w="20" w:type="dxa"/>
               <w:start w:w="120" w:type="dxa"/>
-              <w:bottom w:w="60" w:type="dxa"/>
+              <w:bottom w:w="20" w:type="dxa"/>
               <w:end w:w="120" w:type="dxa"/>
             </w:tcMar>
           </w:tcPr>
@@ -1832,7 +1887,7 @@
                 <w:rFonts w:ascii="TH Sarabun New" w:hAnsi="TH Sarabun New" w:cs="TH Sarabun New"/>
                 <w:b w:val="0"/>
                 <w:color w:val="404040"/>
-                <w:sz w:val="28"/>
+                <w:sz w:val="32"/>
               </w:rPr>
               <w:t>{{ip_address}}</w:t>
             </w:r>
@@ -1845,9 +1900,9 @@
             <w:tcW w:type="dxa" w:w="3312"/>
             <w:vAlign w:val="center"/>
             <w:tcMar>
-              <w:top w:w="60" w:type="dxa"/>
+              <w:top w:w="20" w:type="dxa"/>
               <w:start w:w="120" w:type="dxa"/>
-              <w:bottom w:w="60" w:type="dxa"/>
+              <w:bottom w:w="20" w:type="dxa"/>
               <w:end w:w="120" w:type="dxa"/>
             </w:tcMar>
             <w:shd w:val="clear" w:fill="F2F2F2"/>
@@ -1861,7 +1916,7 @@
                 <w:rFonts w:ascii="TH Sarabun New" w:hAnsi="TH Sarabun New" w:cs="TH Sarabun New"/>
                 <w:b/>
                 <w:color w:val="404040"/>
-                <w:sz w:val="28"/>
+                <w:sz w:val="32"/>
               </w:rPr>
               <w:t>Operating System</w:t>
             </w:r>
@@ -1872,9 +1927,9 @@
             <w:tcW w:type="dxa" w:w="6192"/>
             <w:vAlign w:val="center"/>
             <w:tcMar>
-              <w:top w:w="60" w:type="dxa"/>
+              <w:top w:w="20" w:type="dxa"/>
               <w:start w:w="120" w:type="dxa"/>
-              <w:bottom w:w="60" w:type="dxa"/>
+              <w:bottom w:w="20" w:type="dxa"/>
               <w:end w:w="120" w:type="dxa"/>
             </w:tcMar>
           </w:tcPr>
@@ -1887,7 +1942,7 @@
                 <w:rFonts w:ascii="TH Sarabun New" w:hAnsi="TH Sarabun New" w:cs="TH Sarabun New"/>
                 <w:b w:val="0"/>
                 <w:color w:val="404040"/>
-                <w:sz w:val="28"/>
+                <w:sz w:val="32"/>
               </w:rPr>
               <w:t>{{operating_system}}</w:t>
             </w:r>
@@ -1900,9 +1955,9 @@
             <w:tcW w:type="dxa" w:w="3312"/>
             <w:vAlign w:val="center"/>
             <w:tcMar>
-              <w:top w:w="60" w:type="dxa"/>
+              <w:top w:w="20" w:type="dxa"/>
               <w:start w:w="120" w:type="dxa"/>
-              <w:bottom w:w="60" w:type="dxa"/>
+              <w:bottom w:w="20" w:type="dxa"/>
               <w:end w:w="120" w:type="dxa"/>
             </w:tcMar>
             <w:shd w:val="clear" w:fill="F2F2F2"/>
@@ -1916,7 +1971,7 @@
                 <w:rFonts w:ascii="TH Sarabun New" w:hAnsi="TH Sarabun New" w:cs="TH Sarabun New"/>
                 <w:b/>
                 <w:color w:val="404040"/>
-                <w:sz w:val="28"/>
+                <w:sz w:val="32"/>
               </w:rPr>
               <w:t>ประเภทของทรัพย์สิน</w:t>
             </w:r>
@@ -1927,9 +1982,9 @@
             <w:tcW w:type="dxa" w:w="6192"/>
             <w:vAlign w:val="center"/>
             <w:tcMar>
-              <w:top w:w="60" w:type="dxa"/>
+              <w:top w:w="20" w:type="dxa"/>
               <w:start w:w="120" w:type="dxa"/>
-              <w:bottom w:w="60" w:type="dxa"/>
+              <w:bottom w:w="20" w:type="dxa"/>
               <w:end w:w="120" w:type="dxa"/>
             </w:tcMar>
           </w:tcPr>
@@ -1942,7 +1997,7 @@
                 <w:rFonts w:ascii="DejaVu Sans" w:hAnsi="DejaVu Sans" w:cs="DejaVu Sans"/>
                 <w:b w:val="0"/>
                 <w:color w:val="404040"/>
-                <w:sz w:val="28"/>
+                <w:sz w:val="32"/>
               </w:rPr>
               <w:t>{{chk_asset_computer}}</w:t>
             </w:r>
@@ -1951,7 +2006,7 @@
                 <w:rFonts w:ascii="TH Sarabun New" w:hAnsi="TH Sarabun New" w:cs="TH Sarabun New"/>
                 <w:b w:val="0"/>
                 <w:color w:val="404040"/>
-                <w:sz w:val="28"/>
+                <w:sz w:val="32"/>
               </w:rPr>
               <w:t xml:space="preserve"> Computer</w:t>
             </w:r>
@@ -1960,7 +2015,7 @@
                 <w:rFonts w:ascii="TH Sarabun New" w:hAnsi="TH Sarabun New" w:cs="TH Sarabun New"/>
                 <w:b w:val="0"/>
                 <w:color w:val="404040"/>
-                <w:sz w:val="28"/>
+                <w:sz w:val="32"/>
               </w:rPr>
               <w:t xml:space="preserve">   </w:t>
             </w:r>
@@ -1969,7 +2024,7 @@
                 <w:rFonts w:ascii="DejaVu Sans" w:hAnsi="DejaVu Sans" w:cs="DejaVu Sans"/>
                 <w:b w:val="0"/>
                 <w:color w:val="404040"/>
-                <w:sz w:val="28"/>
+                <w:sz w:val="32"/>
               </w:rPr>
               <w:t>{{chk_asset_server}}</w:t>
             </w:r>
@@ -1978,7 +2033,7 @@
                 <w:rFonts w:ascii="TH Sarabun New" w:hAnsi="TH Sarabun New" w:cs="TH Sarabun New"/>
                 <w:b w:val="0"/>
                 <w:color w:val="404040"/>
-                <w:sz w:val="28"/>
+                <w:sz w:val="32"/>
               </w:rPr>
               <w:t xml:space="preserve"> Server</w:t>
             </w:r>
@@ -1987,7 +2042,7 @@
                 <w:rFonts w:ascii="TH Sarabun New" w:hAnsi="TH Sarabun New" w:cs="TH Sarabun New"/>
                 <w:b w:val="0"/>
                 <w:color w:val="404040"/>
-                <w:sz w:val="28"/>
+                <w:sz w:val="32"/>
               </w:rPr>
               <w:t xml:space="preserve">   </w:t>
             </w:r>
@@ -1996,7 +2051,7 @@
                 <w:rFonts w:ascii="DejaVu Sans" w:hAnsi="DejaVu Sans" w:cs="DejaVu Sans"/>
                 <w:b w:val="0"/>
                 <w:color w:val="404040"/>
-                <w:sz w:val="28"/>
+                <w:sz w:val="32"/>
               </w:rPr>
               <w:t>{{chk_asset_network}}</w:t>
             </w:r>
@@ -2005,7 +2060,7 @@
                 <w:rFonts w:ascii="TH Sarabun New" w:hAnsi="TH Sarabun New" w:cs="TH Sarabun New"/>
                 <w:b w:val="0"/>
                 <w:color w:val="404040"/>
-                <w:sz w:val="28"/>
+                <w:sz w:val="32"/>
               </w:rPr>
               <w:t xml:space="preserve"> Network Device</w:t>
             </w:r>
@@ -2014,7 +2069,7 @@
                 <w:rFonts w:ascii="TH Sarabun New" w:hAnsi="TH Sarabun New" w:cs="TH Sarabun New"/>
                 <w:b w:val="0"/>
                 <w:color w:val="404040"/>
-                <w:sz w:val="28"/>
+                <w:sz w:val="32"/>
               </w:rPr>
               <w:t xml:space="preserve">   </w:t>
             </w:r>
@@ -2023,7 +2078,7 @@
                 <w:rFonts w:ascii="DejaVu Sans" w:hAnsi="DejaVu Sans" w:cs="DejaVu Sans"/>
                 <w:b w:val="0"/>
                 <w:color w:val="404040"/>
-                <w:sz w:val="28"/>
+                <w:sz w:val="32"/>
               </w:rPr>
               <w:t>{{chk_asset_unknown}}</w:t>
             </w:r>
@@ -2032,7 +2087,7 @@
                 <w:rFonts w:ascii="TH Sarabun New" w:hAnsi="TH Sarabun New" w:cs="TH Sarabun New"/>
                 <w:b w:val="0"/>
                 <w:color w:val="404040"/>
-                <w:sz w:val="28"/>
+                <w:sz w:val="32"/>
               </w:rPr>
               <w:t xml:space="preserve"> ไม่ทราบ</w:t>
             </w:r>
@@ -2045,9 +2100,9 @@
             <w:tcW w:type="dxa" w:w="3312"/>
             <w:vAlign w:val="center"/>
             <w:tcMar>
-              <w:top w:w="60" w:type="dxa"/>
+              <w:top w:w="20" w:type="dxa"/>
               <w:start w:w="120" w:type="dxa"/>
-              <w:bottom w:w="60" w:type="dxa"/>
+              <w:bottom w:w="20" w:type="dxa"/>
               <w:end w:w="120" w:type="dxa"/>
             </w:tcMar>
             <w:shd w:val="clear" w:fill="F2F2F2"/>
@@ -2061,7 +2116,7 @@
                 <w:rFonts w:ascii="TH Sarabun New" w:hAnsi="TH Sarabun New" w:cs="TH Sarabun New"/>
                 <w:b/>
                 <w:color w:val="404040"/>
-                <w:sz w:val="28"/>
+                <w:sz w:val="32"/>
               </w:rPr>
               <w:t>มีการกระจายไปยังจุดอื่น</w:t>
             </w:r>
@@ -2072,9 +2127,9 @@
             <w:tcW w:type="dxa" w:w="6192"/>
             <w:vAlign w:val="center"/>
             <w:tcMar>
-              <w:top w:w="60" w:type="dxa"/>
+              <w:top w:w="20" w:type="dxa"/>
               <w:start w:w="120" w:type="dxa"/>
-              <w:bottom w:w="60" w:type="dxa"/>
+              <w:bottom w:w="20" w:type="dxa"/>
               <w:end w:w="120" w:type="dxa"/>
             </w:tcMar>
           </w:tcPr>
@@ -2087,7 +2142,7 @@
                 <w:rFonts w:ascii="DejaVu Sans" w:hAnsi="DejaVu Sans" w:cs="DejaVu Sans"/>
                 <w:b w:val="0"/>
                 <w:color w:val="404040"/>
-                <w:sz w:val="28"/>
+                <w:sz w:val="32"/>
               </w:rPr>
               <w:t>{{chk_spread_yes}}</w:t>
             </w:r>
@@ -2096,7 +2151,7 @@
                 <w:rFonts w:ascii="TH Sarabun New" w:hAnsi="TH Sarabun New" w:cs="TH Sarabun New"/>
                 <w:b w:val="0"/>
                 <w:color w:val="404040"/>
-                <w:sz w:val="28"/>
+                <w:sz w:val="32"/>
               </w:rPr>
               <w:t xml:space="preserve"> ใช่</w:t>
             </w:r>
@@ -2105,7 +2160,7 @@
                 <w:rFonts w:ascii="TH Sarabun New" w:hAnsi="TH Sarabun New" w:cs="TH Sarabun New"/>
                 <w:b w:val="0"/>
                 <w:color w:val="404040"/>
-                <w:sz w:val="28"/>
+                <w:sz w:val="32"/>
               </w:rPr>
               <w:t xml:space="preserve">   </w:t>
             </w:r>
@@ -2114,7 +2169,7 @@
                 <w:rFonts w:ascii="DejaVu Sans" w:hAnsi="DejaVu Sans" w:cs="DejaVu Sans"/>
                 <w:b w:val="0"/>
                 <w:color w:val="404040"/>
-                <w:sz w:val="28"/>
+                <w:sz w:val="32"/>
               </w:rPr>
               <w:t>{{chk_spread_no}}</w:t>
             </w:r>
@@ -2123,7 +2178,7 @@
                 <w:rFonts w:ascii="TH Sarabun New" w:hAnsi="TH Sarabun New" w:cs="TH Sarabun New"/>
                 <w:b w:val="0"/>
                 <w:color w:val="404040"/>
-                <w:sz w:val="28"/>
+                <w:sz w:val="32"/>
               </w:rPr>
               <w:t xml:space="preserve"> ไม่ใช่</w:t>
             </w:r>
@@ -2177,7 +2232,7 @@
                 <w:rFonts w:ascii="TH Sarabun New" w:hAnsi="TH Sarabun New" w:cs="TH Sarabun New"/>
                 <w:b/>
                 <w:color w:val="1F2933"/>
-                <w:sz w:val="30"/>
+                <w:sz w:val="34"/>
               </w:rPr>
               <w:t>4. Indicators of Compromise หรือหลักฐานที่พบ</w:t>
             </w:r>
@@ -2210,9 +2265,9 @@
             <w:tcW w:type="dxa" w:w="3312"/>
             <w:vAlign w:val="center"/>
             <w:tcMar>
-              <w:top w:w="60" w:type="dxa"/>
+              <w:top w:w="20" w:type="dxa"/>
               <w:start w:w="120" w:type="dxa"/>
-              <w:bottom w:w="60" w:type="dxa"/>
+              <w:bottom w:w="20" w:type="dxa"/>
               <w:end w:w="120" w:type="dxa"/>
             </w:tcMar>
             <w:shd w:val="clear" w:fill="F2F2F2"/>
@@ -2226,9 +2281,9 @@
                 <w:rFonts w:ascii="TH Sarabun New" w:hAnsi="TH Sarabun New" w:cs="TH Sarabun New"/>
                 <w:b/>
                 <w:color w:val="404040"/>
-                <w:sz w:val="28"/>
+                <w:sz w:val="32"/>
               </w:rPr>
-              <w:t>Process/File Path</w:t>
+              <w:t>File Name</w:t>
             </w:r>
           </w:p>
         </w:tc>
@@ -2237,9 +2292,9 @@
             <w:tcW w:type="dxa" w:w="6192"/>
             <w:vAlign w:val="center"/>
             <w:tcMar>
-              <w:top w:w="60" w:type="dxa"/>
+              <w:top w:w="20" w:type="dxa"/>
               <w:start w:w="120" w:type="dxa"/>
-              <w:bottom w:w="60" w:type="dxa"/>
+              <w:bottom w:w="20" w:type="dxa"/>
               <w:end w:w="120" w:type="dxa"/>
             </w:tcMar>
           </w:tcPr>
@@ -2252,9 +2307,9 @@
                 <w:rFonts w:ascii="TH Sarabun New" w:hAnsi="TH Sarabun New" w:cs="TH Sarabun New"/>
                 <w:b w:val="0"/>
                 <w:color w:val="404040"/>
-                <w:sz w:val="28"/>
+                <w:sz w:val="32"/>
               </w:rPr>
-              <w:t>{{ioc_process}}</w:t>
+              <w:t>{{ioc_file_name}}</w:t>
             </w:r>
           </w:p>
         </w:tc>
@@ -2265,9 +2320,9 @@
             <w:tcW w:type="dxa" w:w="3312"/>
             <w:vAlign w:val="center"/>
             <w:tcMar>
-              <w:top w:w="60" w:type="dxa"/>
+              <w:top w:w="20" w:type="dxa"/>
               <w:start w:w="120" w:type="dxa"/>
-              <w:bottom w:w="60" w:type="dxa"/>
+              <w:bottom w:w="20" w:type="dxa"/>
               <w:end w:w="120" w:type="dxa"/>
             </w:tcMar>
             <w:shd w:val="clear" w:fill="F2F2F2"/>
@@ -2281,9 +2336,9 @@
                 <w:rFonts w:ascii="TH Sarabun New" w:hAnsi="TH Sarabun New" w:cs="TH Sarabun New"/>
                 <w:b/>
                 <w:color w:val="404040"/>
-                <w:sz w:val="28"/>
+                <w:sz w:val="32"/>
               </w:rPr>
-              <w:t>คำสั่ง</w:t>
+              <w:t>Process/File Path</w:t>
             </w:r>
           </w:p>
         </w:tc>
@@ -2292,9 +2347,9 @@
             <w:tcW w:type="dxa" w:w="6192"/>
             <w:vAlign w:val="center"/>
             <w:tcMar>
-              <w:top w:w="60" w:type="dxa"/>
+              <w:top w:w="20" w:type="dxa"/>
               <w:start w:w="120" w:type="dxa"/>
-              <w:bottom w:w="60" w:type="dxa"/>
+              <w:bottom w:w="20" w:type="dxa"/>
               <w:end w:w="120" w:type="dxa"/>
             </w:tcMar>
           </w:tcPr>
@@ -2307,9 +2362,9 @@
                 <w:rFonts w:ascii="TH Sarabun New" w:hAnsi="TH Sarabun New" w:cs="TH Sarabun New"/>
                 <w:b w:val="0"/>
                 <w:color w:val="404040"/>
-                <w:sz w:val="28"/>
+                <w:sz w:val="32"/>
               </w:rPr>
-              <w:t>{{ioc_command}}</w:t>
+              <w:t>{{ioc_process}}</w:t>
             </w:r>
           </w:p>
         </w:tc>
@@ -2320,9 +2375,9 @@
             <w:tcW w:type="dxa" w:w="3312"/>
             <w:vAlign w:val="center"/>
             <w:tcMar>
-              <w:top w:w="60" w:type="dxa"/>
+              <w:top w:w="20" w:type="dxa"/>
               <w:start w:w="120" w:type="dxa"/>
-              <w:bottom w:w="60" w:type="dxa"/>
+              <w:bottom w:w="20" w:type="dxa"/>
               <w:end w:w="120" w:type="dxa"/>
             </w:tcMar>
             <w:shd w:val="clear" w:fill="F2F2F2"/>
@@ -2336,9 +2391,9 @@
                 <w:rFonts w:ascii="TH Sarabun New" w:hAnsi="TH Sarabun New" w:cs="TH Sarabun New"/>
                 <w:b/>
                 <w:color w:val="404040"/>
-                <w:sz w:val="28"/>
+                <w:sz w:val="32"/>
               </w:rPr>
-              <w:t>Hash</w:t>
+              <w:t>คำสั่ง</w:t>
             </w:r>
           </w:p>
         </w:tc>
@@ -2347,9 +2402,9 @@
             <w:tcW w:type="dxa" w:w="6192"/>
             <w:vAlign w:val="center"/>
             <w:tcMar>
-              <w:top w:w="60" w:type="dxa"/>
+              <w:top w:w="20" w:type="dxa"/>
               <w:start w:w="120" w:type="dxa"/>
-              <w:bottom w:w="60" w:type="dxa"/>
+              <w:bottom w:w="20" w:type="dxa"/>
               <w:end w:w="120" w:type="dxa"/>
             </w:tcMar>
           </w:tcPr>
@@ -2362,9 +2417,9 @@
                 <w:rFonts w:ascii="TH Sarabun New" w:hAnsi="TH Sarabun New" w:cs="TH Sarabun New"/>
                 <w:b w:val="0"/>
                 <w:color w:val="404040"/>
-                <w:sz w:val="28"/>
+                <w:sz w:val="32"/>
               </w:rPr>
-              <w:t>{{ioc_hash}}</w:t>
+              <w:t>{{ioc_command}}</w:t>
             </w:r>
           </w:p>
         </w:tc>
@@ -2375,9 +2430,9 @@
             <w:tcW w:type="dxa" w:w="3312"/>
             <w:vAlign w:val="center"/>
             <w:tcMar>
-              <w:top w:w="60" w:type="dxa"/>
+              <w:top w:w="20" w:type="dxa"/>
               <w:start w:w="120" w:type="dxa"/>
-              <w:bottom w:w="60" w:type="dxa"/>
+              <w:bottom w:w="20" w:type="dxa"/>
               <w:end w:w="120" w:type="dxa"/>
             </w:tcMar>
             <w:shd w:val="clear" w:fill="F2F2F2"/>
@@ -2391,9 +2446,9 @@
                 <w:rFonts w:ascii="TH Sarabun New" w:hAnsi="TH Sarabun New" w:cs="TH Sarabun New"/>
                 <w:b/>
                 <w:color w:val="404040"/>
-                <w:sz w:val="28"/>
+                <w:sz w:val="32"/>
               </w:rPr>
-              <w:t>Domain</w:t>
+              <w:t>Hash</w:t>
             </w:r>
           </w:p>
         </w:tc>
@@ -2402,9 +2457,9 @@
             <w:tcW w:type="dxa" w:w="6192"/>
             <w:vAlign w:val="center"/>
             <w:tcMar>
-              <w:top w:w="60" w:type="dxa"/>
+              <w:top w:w="20" w:type="dxa"/>
               <w:start w:w="120" w:type="dxa"/>
-              <w:bottom w:w="60" w:type="dxa"/>
+              <w:bottom w:w="20" w:type="dxa"/>
               <w:end w:w="120" w:type="dxa"/>
             </w:tcMar>
           </w:tcPr>
@@ -2417,9 +2472,9 @@
                 <w:rFonts w:ascii="TH Sarabun New" w:hAnsi="TH Sarabun New" w:cs="TH Sarabun New"/>
                 <w:b w:val="0"/>
                 <w:color w:val="404040"/>
-                <w:sz w:val="28"/>
+                <w:sz w:val="32"/>
               </w:rPr>
-              <w:t>{{ioc_domain}}</w:t>
+              <w:t>{{ioc_hash}}</w:t>
             </w:r>
           </w:p>
         </w:tc>
@@ -2430,9 +2485,9 @@
             <w:tcW w:type="dxa" w:w="3312"/>
             <w:vAlign w:val="center"/>
             <w:tcMar>
-              <w:top w:w="60" w:type="dxa"/>
+              <w:top w:w="20" w:type="dxa"/>
               <w:start w:w="120" w:type="dxa"/>
-              <w:bottom w:w="60" w:type="dxa"/>
+              <w:bottom w:w="20" w:type="dxa"/>
               <w:end w:w="120" w:type="dxa"/>
             </w:tcMar>
             <w:shd w:val="clear" w:fill="F2F2F2"/>
@@ -2446,9 +2501,9 @@
                 <w:rFonts w:ascii="TH Sarabun New" w:hAnsi="TH Sarabun New" w:cs="TH Sarabun New"/>
                 <w:b/>
                 <w:color w:val="404040"/>
-                <w:sz w:val="28"/>
+                <w:sz w:val="32"/>
               </w:rPr>
-              <w:t>URL</w:t>
+              <w:t>Domain</w:t>
             </w:r>
           </w:p>
         </w:tc>
@@ -2457,9 +2512,9 @@
             <w:tcW w:type="dxa" w:w="6192"/>
             <w:vAlign w:val="center"/>
             <w:tcMar>
-              <w:top w:w="60" w:type="dxa"/>
+              <w:top w:w="20" w:type="dxa"/>
               <w:start w:w="120" w:type="dxa"/>
-              <w:bottom w:w="60" w:type="dxa"/>
+              <w:bottom w:w="20" w:type="dxa"/>
               <w:end w:w="120" w:type="dxa"/>
             </w:tcMar>
           </w:tcPr>
@@ -2472,9 +2527,9 @@
                 <w:rFonts w:ascii="TH Sarabun New" w:hAnsi="TH Sarabun New" w:cs="TH Sarabun New"/>
                 <w:b w:val="0"/>
                 <w:color w:val="404040"/>
-                <w:sz w:val="28"/>
+                <w:sz w:val="32"/>
               </w:rPr>
-              <w:t>{{ioc_url}}</w:t>
+              <w:t>{{ioc_domain}}</w:t>
             </w:r>
           </w:p>
         </w:tc>
@@ -2485,9 +2540,9 @@
             <w:tcW w:type="dxa" w:w="3312"/>
             <w:vAlign w:val="center"/>
             <w:tcMar>
-              <w:top w:w="60" w:type="dxa"/>
+              <w:top w:w="20" w:type="dxa"/>
               <w:start w:w="120" w:type="dxa"/>
-              <w:bottom w:w="60" w:type="dxa"/>
+              <w:bottom w:w="20" w:type="dxa"/>
               <w:end w:w="120" w:type="dxa"/>
             </w:tcMar>
             <w:shd w:val="clear" w:fill="F2F2F2"/>
@@ -2501,9 +2556,9 @@
                 <w:rFonts w:ascii="TH Sarabun New" w:hAnsi="TH Sarabun New" w:cs="TH Sarabun New"/>
                 <w:b/>
                 <w:color w:val="404040"/>
-                <w:sz w:val="28"/>
+                <w:sz w:val="32"/>
               </w:rPr>
-              <w:t>IP</w:t>
+              <w:t>URL</w:t>
             </w:r>
           </w:p>
         </w:tc>
@@ -2512,9 +2567,9 @@
             <w:tcW w:type="dxa" w:w="6192"/>
             <w:vAlign w:val="center"/>
             <w:tcMar>
-              <w:top w:w="60" w:type="dxa"/>
+              <w:top w:w="20" w:type="dxa"/>
               <w:start w:w="120" w:type="dxa"/>
-              <w:bottom w:w="60" w:type="dxa"/>
+              <w:bottom w:w="20" w:type="dxa"/>
               <w:end w:w="120" w:type="dxa"/>
             </w:tcMar>
           </w:tcPr>
@@ -2527,9 +2582,9 @@
                 <w:rFonts w:ascii="TH Sarabun New" w:hAnsi="TH Sarabun New" w:cs="TH Sarabun New"/>
                 <w:b w:val="0"/>
                 <w:color w:val="404040"/>
-                <w:sz w:val="28"/>
+                <w:sz w:val="32"/>
               </w:rPr>
-              <w:t>{{ioc_ip}}</w:t>
+              <w:t>{{ioc_url}}</w:t>
             </w:r>
           </w:p>
         </w:tc>
@@ -2540,9 +2595,9 @@
             <w:tcW w:type="dxa" w:w="3312"/>
             <w:vAlign w:val="center"/>
             <w:tcMar>
-              <w:top w:w="60" w:type="dxa"/>
+              <w:top w:w="20" w:type="dxa"/>
               <w:start w:w="120" w:type="dxa"/>
-              <w:bottom w:w="60" w:type="dxa"/>
+              <w:bottom w:w="20" w:type="dxa"/>
               <w:end w:w="120" w:type="dxa"/>
             </w:tcMar>
             <w:shd w:val="clear" w:fill="F2F2F2"/>
@@ -2556,9 +2611,9 @@
                 <w:rFonts w:ascii="TH Sarabun New" w:hAnsi="TH Sarabun New" w:cs="TH Sarabun New"/>
                 <w:b/>
                 <w:color w:val="404040"/>
-                <w:sz w:val="28"/>
+                <w:sz w:val="32"/>
               </w:rPr>
-              <w:t>User</w:t>
+              <w:t>IP</w:t>
             </w:r>
           </w:p>
         </w:tc>
@@ -2567,9 +2622,9 @@
             <w:tcW w:type="dxa" w:w="6192"/>
             <w:vAlign w:val="center"/>
             <w:tcMar>
-              <w:top w:w="60" w:type="dxa"/>
+              <w:top w:w="20" w:type="dxa"/>
               <w:start w:w="120" w:type="dxa"/>
-              <w:bottom w:w="60" w:type="dxa"/>
+              <w:bottom w:w="20" w:type="dxa"/>
               <w:end w:w="120" w:type="dxa"/>
             </w:tcMar>
           </w:tcPr>
@@ -2582,7 +2637,62 @@
                 <w:rFonts w:ascii="TH Sarabun New" w:hAnsi="TH Sarabun New" w:cs="TH Sarabun New"/>
                 <w:b w:val="0"/>
                 <w:color w:val="404040"/>
-                <w:sz w:val="28"/>
+                <w:sz w:val="32"/>
+              </w:rPr>
+              <w:t>{{ioc_ip}}</w:t>
+            </w:r>
+          </w:p>
+        </w:tc>
+      </w:tr>
+      <w:tr>
+        <w:tc>
+          <w:tcPr>
+            <w:tcW w:type="dxa" w:w="3312"/>
+            <w:vAlign w:val="center"/>
+            <w:tcMar>
+              <w:top w:w="20" w:type="dxa"/>
+              <w:start w:w="120" w:type="dxa"/>
+              <w:bottom w:w="20" w:type="dxa"/>
+              <w:end w:w="120" w:type="dxa"/>
+            </w:tcMar>
+            <w:shd w:val="clear" w:fill="F2F2F2"/>
+          </w:tcPr>
+          <w:p>
+            <w:pPr>
+              <w:spacing w:after="0" w:before="0"/>
+            </w:pPr>
+            <w:r>
+              <w:rPr>
+                <w:rFonts w:ascii="TH Sarabun New" w:hAnsi="TH Sarabun New" w:cs="TH Sarabun New"/>
+                <w:b/>
+                <w:color w:val="404040"/>
+                <w:sz w:val="32"/>
+              </w:rPr>
+              <w:t>User</w:t>
+            </w:r>
+          </w:p>
+        </w:tc>
+        <w:tc>
+          <w:tcPr>
+            <w:tcW w:type="dxa" w:w="6192"/>
+            <w:vAlign w:val="center"/>
+            <w:tcMar>
+              <w:top w:w="20" w:type="dxa"/>
+              <w:start w:w="120" w:type="dxa"/>
+              <w:bottom w:w="20" w:type="dxa"/>
+              <w:end w:w="120" w:type="dxa"/>
+            </w:tcMar>
+          </w:tcPr>
+          <w:p>
+            <w:pPr>
+              <w:spacing w:after="0" w:before="0"/>
+            </w:pPr>
+            <w:r>
+              <w:rPr>
+                <w:rFonts w:ascii="TH Sarabun New" w:hAnsi="TH Sarabun New" w:cs="TH Sarabun New"/>
+                <w:b w:val="0"/>
+                <w:color w:val="404040"/>
+                <w:sz w:val="32"/>
               </w:rPr>
               <w:t>{{ioc_user}}</w:t>
             </w:r>
@@ -2636,7 +2746,7 @@
                 <w:rFonts w:ascii="TH Sarabun New" w:hAnsi="TH Sarabun New" w:cs="TH Sarabun New"/>
                 <w:b/>
                 <w:color w:val="1F2933"/>
-                <w:sz w:val="30"/>
+                <w:sz w:val="34"/>
               </w:rPr>
               <w:t>5. Evidence / Log</w:t>
             </w:r>
@@ -2668,9 +2778,9 @@
             <w:tcW w:type="dxa" w:w="9504"/>
             <w:vAlign w:val="center"/>
             <w:tcMar>
-              <w:top w:w="100" w:type="dxa"/>
+              <w:top w:w="40" w:type="dxa"/>
               <w:start w:w="120" w:type="dxa"/>
-              <w:bottom w:w="100" w:type="dxa"/>
+              <w:bottom w:w="40" w:type="dxa"/>
               <w:end w:w="120" w:type="dxa"/>
             </w:tcMar>
           </w:tcPr>
@@ -2683,7 +2793,7 @@
                 <w:rFonts w:ascii="TH Sarabun New" w:hAnsi="TH Sarabun New" w:cs="TH Sarabun New"/>
                 <w:b w:val="0"/>
                 <w:color w:val="404040"/>
-                <w:sz w:val="28"/>
+                <w:sz w:val="32"/>
               </w:rPr>
               <w:t>{{evidence_log}}</w:t>
             </w:r>
@@ -2737,7 +2847,7 @@
                 <w:rFonts w:ascii="TH Sarabun New" w:hAnsi="TH Sarabun New" w:cs="TH Sarabun New"/>
                 <w:b/>
                 <w:color w:val="1F2933"/>
-                <w:sz w:val="30"/>
+                <w:sz w:val="34"/>
               </w:rPr>
               <w:t>6. สิ่งที่ต้องดำเนินการ (Containment)</w:t>
             </w:r>
@@ -2769,9 +2879,9 @@
             <w:tcW w:type="dxa" w:w="9504"/>
             <w:vAlign w:val="center"/>
             <w:tcMar>
-              <w:top w:w="100" w:type="dxa"/>
+              <w:top w:w="40" w:type="dxa"/>
               <w:start w:w="120" w:type="dxa"/>
-              <w:bottom w:w="100" w:type="dxa"/>
+              <w:bottom w:w="40" w:type="dxa"/>
               <w:end w:w="120" w:type="dxa"/>
             </w:tcMar>
           </w:tcPr>
@@ -2784,7 +2894,7 @@
                 <w:rFonts w:ascii="TH Sarabun New" w:hAnsi="TH Sarabun New" w:cs="TH Sarabun New"/>
                 <w:b w:val="0"/>
                 <w:color w:val="404040"/>
-                <w:sz w:val="28"/>
+                <w:sz w:val="32"/>
               </w:rPr>
               <w:t>{{action_required}}</w:t>
             </w:r>
@@ -2838,7 +2948,7 @@
                 <w:rFonts w:ascii="TH Sarabun New" w:hAnsi="TH Sarabun New" w:cs="TH Sarabun New"/>
                 <w:b/>
                 <w:color w:val="1F2933"/>
-                <w:sz w:val="30"/>
+                <w:sz w:val="34"/>
               </w:rPr>
               <w:t>7. ข้อควรระวังในการดำเนินการ</w:t>
             </w:r>
@@ -2870,9 +2980,9 @@
             <w:tcW w:type="dxa" w:w="9504"/>
             <w:vAlign w:val="center"/>
             <w:tcMar>
-              <w:top w:w="100" w:type="dxa"/>
+              <w:top w:w="40" w:type="dxa"/>
               <w:start w:w="120" w:type="dxa"/>
-              <w:bottom w:w="100" w:type="dxa"/>
+              <w:bottom w:w="40" w:type="dxa"/>
               <w:end w:w="120" w:type="dxa"/>
             </w:tcMar>
           </w:tcPr>
@@ -2885,7 +2995,7 @@
                 <w:rFonts w:ascii="TH Sarabun New" w:hAnsi="TH Sarabun New" w:cs="TH Sarabun New"/>
                 <w:b w:val="0"/>
                 <w:color w:val="404040"/>
-                <w:sz w:val="28"/>
+                <w:sz w:val="32"/>
               </w:rPr>
               <w:t>{{action_precautions}}</w:t>
             </w:r>
@@ -2939,7 +3049,7 @@
                 <w:rFonts w:ascii="TH Sarabun New" w:hAnsi="TH Sarabun New" w:cs="TH Sarabun New"/>
                 <w:b/>
                 <w:color w:val="1F2933"/>
-                <w:sz w:val="30"/>
+                <w:sz w:val="34"/>
               </w:rPr>
               <w:t>8. สรุปผลการดำเนินการแก้ไข</w:t>
             </w:r>
@@ -2971,9 +3081,9 @@
             <w:tcW w:type="dxa" w:w="9504"/>
             <w:vAlign w:val="center"/>
             <w:tcMar>
-              <w:top w:w="90" w:type="dxa"/>
+              <w:top w:w="40" w:type="dxa"/>
               <w:start w:w="120" w:type="dxa"/>
-              <w:bottom w:w="90" w:type="dxa"/>
+              <w:bottom w:w="40" w:type="dxa"/>
               <w:end w:w="120" w:type="dxa"/>
             </w:tcMar>
           </w:tcPr>
@@ -2983,10 +3093,330 @@
             </w:pPr>
             <w:r>
               <w:rPr>
+                <w:rFonts w:ascii="DejaVu Sans" w:hAnsi="DejaVu Sans" w:cs="DejaVu Sans"/>
+                <w:b w:val="0"/>
+                <w:color w:val="404040"/>
+                <w:sz w:val="32"/>
+              </w:rPr>
+              <w:t>{{chk_rem_isolate}}</w:t>
+            </w:r>
+            <w:r>
+              <w:rPr>
+                <w:rFonts w:ascii="TH Sarabun New" w:hAnsi="TH Sarabun New" w:cs="TH Sarabun New"/>
+                <w:b w:val="0"/>
+                <w:color w:val="404040"/>
+                <w:sz w:val="32"/>
+              </w:rPr>
+              <w:t xml:space="preserve"> Isolate เครื่อง – แยกเครื่องที่ได้รับผลกระทบออกจากเครือข่าย</w:t>
+            </w:r>
+          </w:p>
+          <w:p>
+            <w:r>
+              <w:rPr>
+                <w:rFonts w:ascii="DejaVu Sans" w:hAnsi="DejaVu Sans" w:cs="DejaVu Sans"/>
+                <w:b w:val="0"/>
+                <w:color w:val="404040"/>
+                <w:sz w:val="32"/>
+              </w:rPr>
+              <w:t>{{chk_rem_close_service}}</w:t>
+            </w:r>
+            <w:r>
+              <w:rPr>
+                <w:rFonts w:ascii="TH Sarabun New" w:hAnsi="TH Sarabun New" w:cs="TH Sarabun New"/>
+                <w:b w:val="0"/>
+                <w:color w:val="404040"/>
+                <w:sz w:val="32"/>
+              </w:rPr>
+              <w:t xml:space="preserve"> Close Service ที่ไม่จำเป็น – ปิดบริการหรือพอร์ตที่เปิดเผยและมีความเสี่ยง</w:t>
+            </w:r>
+          </w:p>
+          <w:p>
+            <w:r>
+              <w:rPr>
+                <w:rFonts w:ascii="DejaVu Sans" w:hAnsi="DejaVu Sans" w:cs="DejaVu Sans"/>
+                <w:b w:val="0"/>
+                <w:color w:val="404040"/>
+                <w:sz w:val="32"/>
+              </w:rPr>
+              <w:t>{{chk_rem_block_ioc}}</w:t>
+            </w:r>
+            <w:r>
+              <w:rPr>
+                <w:rFonts w:ascii="TH Sarabun New" w:hAnsi="TH Sarabun New" w:cs="TH Sarabun New"/>
+                <w:b w:val="0"/>
+                <w:color w:val="404040"/>
+                <w:sz w:val="32"/>
+              </w:rPr>
+              <w:t xml:space="preserve"> Block IoC – บล็อกตัวบ่งชี้การโจมตี (IP, Domain, URL, Hash)</w:t>
+            </w:r>
+          </w:p>
+          <w:p>
+            <w:r>
+              <w:rPr>
+                <w:rFonts w:ascii="DejaVu Sans" w:hAnsi="DejaVu Sans" w:cs="DejaVu Sans"/>
+                <w:b w:val="0"/>
+                <w:color w:val="404040"/>
+                <w:sz w:val="32"/>
+              </w:rPr>
+              <w:t>{{chk_rem_dump_memory}}</w:t>
+            </w:r>
+            <w:r>
+              <w:rPr>
+                <w:rFonts w:ascii="TH Sarabun New" w:hAnsi="TH Sarabun New" w:cs="TH Sarabun New"/>
+                <w:b w:val="0"/>
+                <w:color w:val="404040"/>
+                <w:sz w:val="32"/>
+              </w:rPr>
+              <w:t xml:space="preserve"> Dump memory ของเครื่อง Server</w:t>
+            </w:r>
+          </w:p>
+          <w:p>
+            <w:r>
+              <w:rPr>
+                <w:rFonts w:ascii="DejaVu Sans" w:hAnsi="DejaVu Sans" w:cs="DejaVu Sans"/>
+                <w:b w:val="0"/>
+                <w:color w:val="404040"/>
+                <w:sz w:val="32"/>
+              </w:rPr>
+              <w:t>{{chk_rem_collect_logs}}</w:t>
+            </w:r>
+            <w:r>
+              <w:rPr>
+                <w:rFonts w:ascii="TH Sarabun New" w:hAnsi="TH Sarabun New" w:cs="TH Sarabun New"/>
+                <w:b w:val="0"/>
+                <w:color w:val="404040"/>
+                <w:sz w:val="32"/>
+              </w:rPr>
+              <w:t xml:space="preserve"> รวบรวม Event Logs เพื่อส่งต่อ ปปกก.</w:t>
+            </w:r>
+          </w:p>
+          <w:p>
+            <w:r>
+              <w:rPr>
+                <w:rFonts w:ascii="DejaVu Sans" w:hAnsi="DejaVu Sans" w:cs="DejaVu Sans"/>
+                <w:b w:val="0"/>
+                <w:color w:val="404040"/>
+                <w:sz w:val="32"/>
+              </w:rPr>
+              <w:t>{{chk_rem_disable_account}}</w:t>
+            </w:r>
+            <w:r>
+              <w:rPr>
+                <w:rFonts w:ascii="TH Sarabun New" w:hAnsi="TH Sarabun New" w:cs="TH Sarabun New"/>
+                <w:b w:val="0"/>
+                <w:color w:val="404040"/>
+                <w:sz w:val="32"/>
+              </w:rPr>
+              <w:t xml:space="preserve"> Disable/Reset Account – ปิดการใช้งานหรือรีเซ็ตรหัสผ่านบัญชีที่ได้รับผลกระทบ</w:t>
+            </w:r>
+          </w:p>
+          <w:p>
+            <w:r>
+              <w:rPr>
+                <w:rFonts w:ascii="DejaVu Sans" w:hAnsi="DejaVu Sans" w:cs="DejaVu Sans"/>
+                <w:b w:val="0"/>
+                <w:color w:val="404040"/>
+                <w:sz w:val="32"/>
+              </w:rPr>
+              <w:t>{{chk_rem_change_password}}</w:t>
+            </w:r>
+            <w:r>
+              <w:rPr>
+                <w:rFonts w:ascii="TH Sarabun New" w:hAnsi="TH Sarabun New" w:cs="TH Sarabun New"/>
+                <w:b w:val="0"/>
+                <w:color w:val="404040"/>
+                <w:sz w:val="32"/>
+              </w:rPr>
+              <w:t xml:space="preserve"> เปลี่ยนรหัสผ่าน</w:t>
+            </w:r>
+          </w:p>
+          <w:p>
+            <w:r>
+              <w:rPr>
+                <w:rFonts w:ascii="DejaVu Sans" w:hAnsi="DejaVu Sans" w:cs="DejaVu Sans"/>
+                <w:b w:val="0"/>
+                <w:color w:val="404040"/>
+                <w:sz w:val="32"/>
+              </w:rPr>
+              <w:t>{{chk_rem_remove_malware}}</w:t>
+            </w:r>
+            <w:r>
+              <w:rPr>
+                <w:rFonts w:ascii="TH Sarabun New" w:hAnsi="TH Sarabun New" w:cs="TH Sarabun New"/>
+                <w:b w:val="0"/>
+                <w:color w:val="404040"/>
+                <w:sz w:val="32"/>
+              </w:rPr>
+              <w:t xml:space="preserve"> Remove Malware – กำจัดมัลแวร์ออกจากระบบ</w:t>
+            </w:r>
+          </w:p>
+          <w:p>
+            <w:r>
+              <w:rPr>
+                <w:rFonts w:ascii="DejaVu Sans" w:hAnsi="DejaVu Sans" w:cs="DejaVu Sans"/>
+                <w:b w:val="0"/>
+                <w:color w:val="404040"/>
+                <w:sz w:val="32"/>
+              </w:rPr>
+              <w:t>{{chk_rem_delete_files}}</w:t>
+            </w:r>
+            <w:r>
+              <w:rPr>
+                <w:rFonts w:ascii="TH Sarabun New" w:hAnsi="TH Sarabun New" w:cs="TH Sarabun New"/>
+                <w:b w:val="0"/>
+                <w:color w:val="404040"/>
+                <w:sz w:val="32"/>
+              </w:rPr>
+              <w:t xml:space="preserve"> ลบไฟล์ และ Path ที่ต้องสงสัย</w:t>
+            </w:r>
+          </w:p>
+          <w:p>
+            <w:r>
+              <w:rPr>
+                <w:rFonts w:ascii="DejaVu Sans" w:hAnsi="DejaVu Sans" w:cs="DejaVu Sans"/>
+                <w:b w:val="0"/>
+                <w:color w:val="404040"/>
+                <w:sz w:val="32"/>
+              </w:rPr>
+              <w:t>{{chk_rem_patch}}</w:t>
+            </w:r>
+            <w:r>
+              <w:rPr>
+                <w:rFonts w:ascii="TH Sarabun New" w:hAnsi="TH Sarabun New" w:cs="TH Sarabun New"/>
+                <w:b w:val="0"/>
+                <w:color w:val="404040"/>
+                <w:sz w:val="32"/>
+              </w:rPr>
+              <w:t xml:space="preserve"> Patch Vulnerability – ติดตั้งแพตช์แก้ไขช่องโหว่ที่เกี่ยวข้อง</w:t>
+            </w:r>
+          </w:p>
+          <w:p>
+            <w:r>
+              <w:rPr>
+                <w:rFonts w:ascii="DejaVu Sans" w:hAnsi="DejaVu Sans" w:cs="DejaVu Sans"/>
+                <w:b w:val="0"/>
+                <w:color w:val="404040"/>
+                <w:sz w:val="32"/>
+              </w:rPr>
+              <w:t>{{chk_rem_update_os}}</w:t>
+            </w:r>
+            <w:r>
+              <w:rPr>
+                <w:rFonts w:ascii="TH Sarabun New" w:hAnsi="TH Sarabun New" w:cs="TH Sarabun New"/>
+                <w:b w:val="0"/>
+                <w:color w:val="404040"/>
+                <w:sz w:val="32"/>
+              </w:rPr>
+              <w:t xml:space="preserve"> Update Software/OS – อัปเดตซอฟต์แวร์หรือระบบปฏิบัติการให้เป็นเวอร์ชันล่าสุด</w:t>
+            </w:r>
+          </w:p>
+          <w:p>
+            <w:r>
+              <w:rPr>
+                <w:rFonts w:ascii="DejaVu Sans" w:hAnsi="DejaVu Sans" w:cs="DejaVu Sans"/>
+                <w:b w:val="0"/>
+                <w:color w:val="404040"/>
+                <w:sz w:val="32"/>
+              </w:rPr>
+              <w:t>{{chk_rem_harden}}</w:t>
+            </w:r>
+            <w:r>
+              <w:rPr>
+                <w:rFonts w:ascii="TH Sarabun New" w:hAnsi="TH Sarabun New" w:cs="TH Sarabun New"/>
+                <w:b w:val="0"/>
+                <w:color w:val="404040"/>
+                <w:sz w:val="32"/>
+              </w:rPr>
+              <w:t xml:space="preserve"> Harden Configuration – ปรับแต่งการตั้งค่าความปลอดภัยของระบบให้รัดกุมมากขึ้น</w:t>
+            </w:r>
+          </w:p>
+          <w:p>
+            <w:r>
+              <w:rPr>
+                <w:rFonts w:ascii="DejaVu Sans" w:hAnsi="DejaVu Sans" w:cs="DejaVu Sans"/>
+                <w:b w:val="0"/>
+                <w:color w:val="404040"/>
+                <w:sz w:val="32"/>
+              </w:rPr>
+              <w:t>{{chk_rem_verify_threat}}</w:t>
+            </w:r>
+            <w:r>
+              <w:rPr>
+                <w:rFonts w:ascii="TH Sarabun New" w:hAnsi="TH Sarabun New" w:cs="TH Sarabun New"/>
+                <w:b w:val="0"/>
+                <w:color w:val="404040"/>
+                <w:sz w:val="32"/>
+              </w:rPr>
+              <w:t xml:space="preserve"> ตรวจสอบการทำงานของภัยคุกคามยังทำงานอยู่หรือไม่</w:t>
+            </w:r>
+          </w:p>
+          <w:p>
+            <w:r>
+              <w:rPr>
+                <w:rFonts w:ascii="DejaVu Sans" w:hAnsi="DejaVu Sans" w:cs="DejaVu Sans"/>
+                <w:b w:val="0"/>
+                <w:color w:val="404040"/>
+                <w:sz w:val="32"/>
+              </w:rPr>
+              <w:t>{{chk_rem_sysmon}}</w:t>
+            </w:r>
+            <w:r>
+              <w:rPr>
+                <w:rFonts w:ascii="TH Sarabun New" w:hAnsi="TH Sarabun New" w:cs="TH Sarabun New"/>
+                <w:b w:val="0"/>
+                <w:color w:val="404040"/>
+                <w:sz w:val="32"/>
+              </w:rPr>
+              <w:t xml:space="preserve"> ติดตั้ง Sysmon</w:t>
+            </w:r>
+          </w:p>
+          <w:p>
+            <w:r>
+              <w:rPr>
+                <w:rFonts w:ascii="DejaVu Sans" w:hAnsi="DejaVu Sans" w:cs="DejaVu Sans"/>
+                <w:b w:val="0"/>
+                <w:color w:val="404040"/>
+                <w:sz w:val="32"/>
+              </w:rPr>
+              <w:t>{{chk_rem_wazuh_agent}}</w:t>
+            </w:r>
+            <w:r>
+              <w:rPr>
+                <w:rFonts w:ascii="TH Sarabun New" w:hAnsi="TH Sarabun New" w:cs="TH Sarabun New"/>
+                <w:b w:val="0"/>
+                <w:color w:val="404040"/>
+                <w:sz w:val="32"/>
+              </w:rPr>
+              <w:t xml:space="preserve"> ติดตั้ง Agent Wazuh</w:t>
+            </w:r>
+          </w:p>
+          <w:p>
+            <w:r>
+              <w:rPr>
+                <w:rFonts w:ascii="DejaVu Sans" w:hAnsi="DejaVu Sans" w:cs="DejaVu Sans"/>
+                <w:b w:val="0"/>
+                <w:color w:val="404040"/>
+                <w:sz w:val="32"/>
+              </w:rPr>
+              <w:t xml:space="preserve">☐ </w:t>
+            </w:r>
+            <w:r>
+              <w:rPr>
+                <w:rFonts w:ascii="TH Sarabun New" w:hAnsi="TH Sarabun New" w:cs="TH Sarabun New"/>
+                <w:b w:val="0"/>
+                <w:color w:val="404040"/>
+                <w:sz w:val="32"/>
+              </w:rPr>
+              <w:t>อื่นๆ ระบุ  {{remediation_other}}</w:t>
+            </w:r>
+          </w:p>
+          <w:p>
+            <w:r>
+              <w:rPr>
                 <w:rFonts w:ascii="TH Sarabun New" w:hAnsi="TH Sarabun New" w:cs="TH Sarabun New"/>
                 <w:b/>
                 <w:color w:val="404040"/>
-                <w:sz w:val="28"/>
+                <w:sz w:val="32"/>
               </w:rPr>
               <w:t>ผลการตรวจสอบ / Investigation Findings:</w:t>
             </w:r>
@@ -2997,7 +3427,7 @@
                 <w:rFonts w:ascii="TH Sarabun New" w:hAnsi="TH Sarabun New" w:cs="TH Sarabun New"/>
                 <w:b w:val="0"/>
                 <w:color w:val="404040"/>
-                <w:sz w:val="28"/>
+                <w:sz w:val="32"/>
               </w:rPr>
               <w:t>{{remediation_summary}}</w:t>
             </w:r>
@@ -3008,7 +3438,7 @@
                 <w:rFonts w:ascii="TH Sarabun New" w:hAnsi="TH Sarabun New" w:cs="TH Sarabun New"/>
                 <w:b/>
                 <w:color w:val="404040"/>
-                <w:sz w:val="28"/>
+                <w:sz w:val="32"/>
               </w:rPr>
               <w:t>มาตรการควบคุม / Countermeasure:</w:t>
             </w:r>
@@ -3019,7 +3449,7 @@
                 <w:rFonts w:ascii="TH Sarabun New" w:hAnsi="TH Sarabun New" w:cs="TH Sarabun New"/>
                 <w:b w:val="0"/>
                 <w:color w:val="404040"/>
-                <w:sz w:val="28"/>
+                <w:sz w:val="32"/>
               </w:rPr>
               <w:t>{{containment_report}}</w:t>
             </w:r>
@@ -3065,9 +3495,9 @@
             <w:tcW w:type="dxa" w:w="4752"/>
             <w:vAlign w:val="center"/>
             <w:tcMar>
-              <w:top w:w="60" w:type="dxa"/>
+              <w:top w:w="20" w:type="dxa"/>
               <w:start w:w="120" w:type="dxa"/>
-              <w:bottom w:w="60" w:type="dxa"/>
+              <w:bottom w:w="20" w:type="dxa"/>
               <w:end w:w="120" w:type="dxa"/>
             </w:tcMar>
           </w:tcPr>
@@ -3081,7 +3511,7 @@
                 <w:rFonts w:ascii="TH Sarabun New" w:hAnsi="TH Sarabun New" w:cs="TH Sarabun New"/>
                 <w:b w:val="0"/>
                 <w:color w:val="404040"/>
-                <w:sz w:val="28"/>
+                <w:sz w:val="32"/>
               </w:rPr>
               <w:t>..........................................</w:t>
             </w:r>
@@ -3096,7 +3526,7 @@
                 <w:rFonts w:ascii="TH Sarabun New" w:hAnsi="TH Sarabun New" w:cs="TH Sarabun New"/>
                 <w:b w:val="0"/>
                 <w:color w:val="404040"/>
-                <w:sz w:val="28"/>
+                <w:sz w:val="32"/>
               </w:rPr>
               <w:t>{{signoff_admin}}</w:t>
             </w:r>
@@ -3111,7 +3541,7 @@
                 <w:rFonts w:ascii="TH Sarabun New" w:hAnsi="TH Sarabun New" w:cs="TH Sarabun New"/>
                 <w:b w:val="0"/>
                 <w:color w:val="404040"/>
-                <w:sz w:val="28"/>
+                <w:sz w:val="32"/>
               </w:rPr>
               <w:t>( ผู้ดำเนินการแก้ไข )</w:t>
             </w:r>
@@ -3126,7 +3556,7 @@
                 <w:rFonts w:ascii="TH Sarabun New" w:hAnsi="TH Sarabun New" w:cs="TH Sarabun New"/>
                 <w:b w:val="0"/>
                 <w:color w:val="404040"/>
-                <w:sz w:val="28"/>
+                <w:sz w:val="32"/>
               </w:rPr>
               <w:t>วันที่ .......... / .......... / ..........</w:t>
             </w:r>
@@ -3137,9 +3567,9 @@
             <w:tcW w:type="dxa" w:w="4752"/>
             <w:vAlign w:val="center"/>
             <w:tcMar>
-              <w:top w:w="60" w:type="dxa"/>
+              <w:top w:w="20" w:type="dxa"/>
               <w:start w:w="120" w:type="dxa"/>
-              <w:bottom w:w="60" w:type="dxa"/>
+              <w:bottom w:w="20" w:type="dxa"/>
               <w:end w:w="120" w:type="dxa"/>
             </w:tcMar>
           </w:tcPr>
@@ -3153,7 +3583,7 @@
                 <w:rFonts w:ascii="TH Sarabun New" w:hAnsi="TH Sarabun New" w:cs="TH Sarabun New"/>
                 <w:b w:val="0"/>
                 <w:color w:val="404040"/>
-                <w:sz w:val="28"/>
+                <w:sz w:val="32"/>
               </w:rPr>
               <w:t>..........................................</w:t>
             </w:r>
@@ -3168,7 +3598,7 @@
                 <w:rFonts w:ascii="TH Sarabun New" w:hAnsi="TH Sarabun New" w:cs="TH Sarabun New"/>
                 <w:b w:val="0"/>
                 <w:color w:val="404040"/>
-                <w:sz w:val="28"/>
+                <w:sz w:val="32"/>
               </w:rPr>
               <w:t>{{signoff_approver}}</w:t>
             </w:r>
@@ -3183,7 +3613,7 @@
                 <w:rFonts w:ascii="TH Sarabun New" w:hAnsi="TH Sarabun New" w:cs="TH Sarabun New"/>
                 <w:b w:val="0"/>
                 <w:color w:val="404040"/>
-                <w:sz w:val="28"/>
+                <w:sz w:val="32"/>
               </w:rPr>
               <w:t>( ผู้อนุมัติ )</w:t>
             </w:r>
@@ -3198,7 +3628,7 @@
                 <w:rFonts w:ascii="TH Sarabun New" w:hAnsi="TH Sarabun New" w:cs="TH Sarabun New"/>
                 <w:b w:val="0"/>
                 <w:color w:val="404040"/>
-                <w:sz w:val="28"/>
+                <w:sz w:val="32"/>
               </w:rPr>
               <w:t>วันที่ .......... / .......... / ..........</w:t>
             </w:r>
@@ -3224,7 +3654,7 @@
           <w:rFonts w:ascii="TH Sarabun New" w:hAnsi="TH Sarabun New" w:cs="TH Sarabun New"/>
           <w:b/>
           <w:color w:val="1F2933"/>
-          <w:sz w:val="30"/>
+          <w:sz w:val="34"/>
         </w:rPr>
         <w:t>*หมวดหมู่ของภัยคุกคามทางไซเบอร์</w:t>
       </w:r>
@@ -3235,7 +3665,7 @@
           <w:rFonts w:ascii="TH Sarabun New" w:hAnsi="TH Sarabun New" w:cs="TH Sarabun New"/>
           <w:b w:val="0"/>
           <w:color w:val="404040"/>
-          <w:sz w:val="26"/>
+          <w:sz w:val="30"/>
         </w:rPr>
         <w:t>อ้างอิงตาม ภาคผนวก ท้ายประกาศคณะกรรมการการรักษาความมั่นคงปลอดภัยไซเบอร์แห่งชาติ เรื่อง ลักษณะภัยคุกคามทางไซเบอร์ มาตรการป้องกัน รับมือ ประเมิน ปราบปราม และระงับภัยคุกคามทางไซเบอร์แต่ละระดับ พ.ศ. 2564</w:t>
       </w:r>
@@ -3246,7 +3676,7 @@
           <w:rFonts w:ascii="TH Sarabun New" w:hAnsi="TH Sarabun New" w:cs="TH Sarabun New"/>
           <w:b/>
           <w:color w:val="404040"/>
-          <w:sz w:val="28"/>
+          <w:sz w:val="32"/>
         </w:rPr>
         <w:t>ข้อ ๑ การจำแนกหมวดหมู่ของภัยคุกคามทางไซเบอร์</w:t>
       </w:r>
@@ -3276,9 +3706,9 @@
             <w:tcW w:type="dxa" w:w="1440"/>
             <w:vAlign w:val="center"/>
             <w:tcMar>
-              <w:top w:w="60" w:type="dxa"/>
+              <w:top w:w="20" w:type="dxa"/>
               <w:start w:w="120" w:type="dxa"/>
-              <w:bottom w:w="60" w:type="dxa"/>
+              <w:bottom w:w="20" w:type="dxa"/>
               <w:end w:w="120" w:type="dxa"/>
             </w:tcMar>
             <w:shd w:val="clear" w:fill="F2F2F2"/>
@@ -3292,7 +3722,7 @@
                 <w:rFonts w:ascii="TH Sarabun New" w:hAnsi="TH Sarabun New" w:cs="TH Sarabun New"/>
                 <w:b/>
                 <w:color w:val="404040"/>
-                <w:sz w:val="28"/>
+                <w:sz w:val="32"/>
               </w:rPr>
               <w:t>หมวดหมู่</w:t>
             </w:r>
@@ -3303,9 +3733,9 @@
             <w:tcW w:type="dxa" w:w="8064"/>
             <w:vAlign w:val="center"/>
             <w:tcMar>
-              <w:top w:w="60" w:type="dxa"/>
+              <w:top w:w="20" w:type="dxa"/>
               <w:start w:w="120" w:type="dxa"/>
-              <w:bottom w:w="60" w:type="dxa"/>
+              <w:bottom w:w="20" w:type="dxa"/>
               <w:end w:w="120" w:type="dxa"/>
             </w:tcMar>
             <w:shd w:val="clear" w:fill="F2F2F2"/>
@@ -3319,7 +3749,7 @@
                 <w:rFonts w:ascii="TH Sarabun New" w:hAnsi="TH Sarabun New" w:cs="TH Sarabun New"/>
                 <w:b/>
                 <w:color w:val="404040"/>
-                <w:sz w:val="28"/>
+                <w:sz w:val="32"/>
               </w:rPr>
               <w:t>คำอธิบาย</w:t>
             </w:r>
@@ -3332,9 +3762,9 @@
             <w:tcW w:type="dxa" w:w="1440"/>
             <w:vAlign w:val="center"/>
             <w:tcMar>
-              <w:top w:w="60" w:type="dxa"/>
+              <w:top w:w="20" w:type="dxa"/>
               <w:start w:w="120" w:type="dxa"/>
-              <w:bottom w:w="60" w:type="dxa"/>
+              <w:bottom w:w="20" w:type="dxa"/>
               <w:end w:w="120" w:type="dxa"/>
             </w:tcMar>
           </w:tcPr>
@@ -3348,7 +3778,7 @@
                 <w:rFonts w:ascii="TH Sarabun New" w:hAnsi="TH Sarabun New" w:cs="TH Sarabun New"/>
                 <w:b w:val="0"/>
                 <w:color w:val="404040"/>
-                <w:sz w:val="28"/>
+                <w:sz w:val="32"/>
               </w:rPr>
               <w:t>๐</w:t>
             </w:r>
@@ -3359,9 +3789,9 @@
             <w:tcW w:type="dxa" w:w="8064"/>
             <w:vAlign w:val="center"/>
             <w:tcMar>
-              <w:top w:w="60" w:type="dxa"/>
+              <w:top w:w="20" w:type="dxa"/>
               <w:start w:w="120" w:type="dxa"/>
-              <w:bottom w:w="60" w:type="dxa"/>
+              <w:bottom w:w="20" w:type="dxa"/>
               <w:end w:w="120" w:type="dxa"/>
             </w:tcMar>
           </w:tcPr>
@@ -3374,7 +3804,7 @@
                 <w:rFonts w:ascii="TH Sarabun New" w:hAnsi="TH Sarabun New" w:cs="TH Sarabun New"/>
                 <w:b w:val="0"/>
                 <w:color w:val="404040"/>
-                <w:sz w:val="28"/>
+                <w:sz w:val="32"/>
               </w:rPr>
               <w:t>เหตุการณ์จำลอง และ การฝึกจู่โจม ของหน่วยงาน (Training and Exercises)</w:t>
             </w:r>
@@ -3387,9 +3817,9 @@
             <w:tcW w:type="dxa" w:w="1440"/>
             <w:vAlign w:val="center"/>
             <w:tcMar>
-              <w:top w:w="60" w:type="dxa"/>
+              <w:top w:w="20" w:type="dxa"/>
               <w:start w:w="120" w:type="dxa"/>
-              <w:bottom w:w="60" w:type="dxa"/>
+              <w:bottom w:w="20" w:type="dxa"/>
               <w:end w:w="120" w:type="dxa"/>
             </w:tcMar>
           </w:tcPr>
@@ -3403,7 +3833,7 @@
                 <w:rFonts w:ascii="TH Sarabun New" w:hAnsi="TH Sarabun New" w:cs="TH Sarabun New"/>
                 <w:b w:val="0"/>
                 <w:color w:val="404040"/>
-                <w:sz w:val="28"/>
+                <w:sz w:val="32"/>
               </w:rPr>
               <w:t>๑</w:t>
             </w:r>
@@ -3414,9 +3844,9 @@
             <w:tcW w:type="dxa" w:w="8064"/>
             <w:vAlign w:val="center"/>
             <w:tcMar>
-              <w:top w:w="60" w:type="dxa"/>
+              <w:top w:w="20" w:type="dxa"/>
               <w:start w:w="120" w:type="dxa"/>
-              <w:bottom w:w="60" w:type="dxa"/>
+              <w:bottom w:w="20" w:type="dxa"/>
               <w:end w:w="120" w:type="dxa"/>
             </w:tcMar>
           </w:tcPr>
@@ -3429,7 +3859,7 @@
                 <w:rFonts w:ascii="TH Sarabun New" w:hAnsi="TH Sarabun New" w:cs="TH Sarabun New"/>
                 <w:b w:val="0"/>
                 <w:color w:val="404040"/>
-                <w:sz w:val="28"/>
+                <w:sz w:val="32"/>
               </w:rPr>
               <w:t>การพยายามเข้าถึงระบบที่ไม่สำเร็จ (Unsuccessful Activity Attempt)</w:t>
             </w:r>
@@ -3442,9 +3872,9 @@
             <w:tcW w:type="dxa" w:w="1440"/>
             <w:vAlign w:val="center"/>
             <w:tcMar>
-              <w:top w:w="60" w:type="dxa"/>
+              <w:top w:w="20" w:type="dxa"/>
               <w:start w:w="120" w:type="dxa"/>
-              <w:bottom w:w="60" w:type="dxa"/>
+              <w:bottom w:w="20" w:type="dxa"/>
               <w:end w:w="120" w:type="dxa"/>
             </w:tcMar>
           </w:tcPr>
@@ -3458,7 +3888,7 @@
                 <w:rFonts w:ascii="TH Sarabun New" w:hAnsi="TH Sarabun New" w:cs="TH Sarabun New"/>
                 <w:b w:val="0"/>
                 <w:color w:val="404040"/>
-                <w:sz w:val="28"/>
+                <w:sz w:val="32"/>
               </w:rPr>
               <w:t>๒</w:t>
             </w:r>
@@ -3469,9 +3899,9 @@
             <w:tcW w:type="dxa" w:w="8064"/>
             <w:vAlign w:val="center"/>
             <w:tcMar>
-              <w:top w:w="60" w:type="dxa"/>
+              <w:top w:w="20" w:type="dxa"/>
               <w:start w:w="120" w:type="dxa"/>
-              <w:bottom w:w="60" w:type="dxa"/>
+              <w:bottom w:w="20" w:type="dxa"/>
               <w:end w:w="120" w:type="dxa"/>
             </w:tcMar>
           </w:tcPr>
@@ -3484,7 +3914,7 @@
                 <w:rFonts w:ascii="TH Sarabun New" w:hAnsi="TH Sarabun New" w:cs="TH Sarabun New"/>
                 <w:b w:val="0"/>
                 <w:color w:val="404040"/>
-                <w:sz w:val="28"/>
+                <w:sz w:val="32"/>
               </w:rPr>
               <w:t>การพยายามบุกรุกเพื่อสำรวจข้อมูลองค์กรเพื่อโจมตี (Reconnaissance)</w:t>
             </w:r>
@@ -3497,9 +3927,9 @@
             <w:tcW w:type="dxa" w:w="1440"/>
             <w:vAlign w:val="center"/>
             <w:tcMar>
-              <w:top w:w="60" w:type="dxa"/>
+              <w:top w:w="20" w:type="dxa"/>
               <w:start w:w="120" w:type="dxa"/>
-              <w:bottom w:w="60" w:type="dxa"/>
+              <w:bottom w:w="20" w:type="dxa"/>
               <w:end w:w="120" w:type="dxa"/>
             </w:tcMar>
           </w:tcPr>
@@ -3513,7 +3943,7 @@
                 <w:rFonts w:ascii="TH Sarabun New" w:hAnsi="TH Sarabun New" w:cs="TH Sarabun New"/>
                 <w:b w:val="0"/>
                 <w:color w:val="404040"/>
-                <w:sz w:val="28"/>
+                <w:sz w:val="32"/>
               </w:rPr>
               <w:t>๓</w:t>
             </w:r>
@@ -3524,9 +3954,9 @@
             <w:tcW w:type="dxa" w:w="8064"/>
             <w:vAlign w:val="center"/>
             <w:tcMar>
-              <w:top w:w="60" w:type="dxa"/>
+              <w:top w:w="20" w:type="dxa"/>
               <w:start w:w="120" w:type="dxa"/>
-              <w:bottom w:w="60" w:type="dxa"/>
+              <w:bottom w:w="20" w:type="dxa"/>
               <w:end w:w="120" w:type="dxa"/>
             </w:tcMar>
           </w:tcPr>
@@ -3539,7 +3969,7 @@
                 <w:rFonts w:ascii="TH Sarabun New" w:hAnsi="TH Sarabun New" w:cs="TH Sarabun New"/>
                 <w:b w:val="0"/>
                 <w:color w:val="404040"/>
-                <w:sz w:val="28"/>
+                <w:sz w:val="32"/>
               </w:rPr>
               <w:t>การดำเนินการที่ไม่เป็นไปตามมาตรฐานความปลอดภัยที่หน่วยงานกำหนด (Non-Compliance Activity)</w:t>
             </w:r>
@@ -3552,9 +3982,9 @@
             <w:tcW w:type="dxa" w:w="1440"/>
             <w:vAlign w:val="center"/>
             <w:tcMar>
-              <w:top w:w="60" w:type="dxa"/>
+              <w:top w:w="20" w:type="dxa"/>
               <w:start w:w="120" w:type="dxa"/>
-              <w:bottom w:w="60" w:type="dxa"/>
+              <w:bottom w:w="20" w:type="dxa"/>
               <w:end w:w="120" w:type="dxa"/>
             </w:tcMar>
           </w:tcPr>
@@ -3568,7 +3998,7 @@
                 <w:rFonts w:ascii="TH Sarabun New" w:hAnsi="TH Sarabun New" w:cs="TH Sarabun New"/>
                 <w:b w:val="0"/>
                 <w:color w:val="404040"/>
-                <w:sz w:val="28"/>
+                <w:sz w:val="32"/>
               </w:rPr>
               <w:t>๔</w:t>
             </w:r>
@@ -3579,9 +4009,9 @@
             <w:tcW w:type="dxa" w:w="8064"/>
             <w:vAlign w:val="center"/>
             <w:tcMar>
-              <w:top w:w="60" w:type="dxa"/>
+              <w:top w:w="20" w:type="dxa"/>
               <w:start w:w="120" w:type="dxa"/>
-              <w:bottom w:w="60" w:type="dxa"/>
+              <w:bottom w:w="20" w:type="dxa"/>
               <w:end w:w="120" w:type="dxa"/>
             </w:tcMar>
           </w:tcPr>
@@ -3594,7 +4024,7 @@
                 <w:rFonts w:ascii="TH Sarabun New" w:hAnsi="TH Sarabun New" w:cs="TH Sarabun New"/>
                 <w:b w:val="0"/>
                 <w:color w:val="404040"/>
-                <w:sz w:val="28"/>
+                <w:sz w:val="32"/>
               </w:rPr>
               <w:t>การบุกรุกโดยการใช้มัลแวร์ (Malicious Logic)</w:t>
             </w:r>
@@ -3607,9 +4037,9 @@
             <w:tcW w:type="dxa" w:w="1440"/>
             <w:vAlign w:val="center"/>
             <w:tcMar>
-              <w:top w:w="60" w:type="dxa"/>
+              <w:top w:w="20" w:type="dxa"/>
               <w:start w:w="120" w:type="dxa"/>
-              <w:bottom w:w="60" w:type="dxa"/>
+              <w:bottom w:w="20" w:type="dxa"/>
               <w:end w:w="120" w:type="dxa"/>
             </w:tcMar>
           </w:tcPr>
@@ -3623,7 +4053,7 @@
                 <w:rFonts w:ascii="TH Sarabun New" w:hAnsi="TH Sarabun New" w:cs="TH Sarabun New"/>
                 <w:b w:val="0"/>
                 <w:color w:val="404040"/>
-                <w:sz w:val="28"/>
+                <w:sz w:val="32"/>
               </w:rPr>
               <w:t>๕</w:t>
             </w:r>
@@ -3634,9 +4064,9 @@
             <w:tcW w:type="dxa" w:w="8064"/>
             <w:vAlign w:val="center"/>
             <w:tcMar>
-              <w:top w:w="60" w:type="dxa"/>
+              <w:top w:w="20" w:type="dxa"/>
               <w:start w:w="120" w:type="dxa"/>
-              <w:bottom w:w="60" w:type="dxa"/>
+              <w:bottom w:w="20" w:type="dxa"/>
               <w:end w:w="120" w:type="dxa"/>
             </w:tcMar>
           </w:tcPr>
@@ -3649,7 +4079,7 @@
                 <w:rFonts w:ascii="TH Sarabun New" w:hAnsi="TH Sarabun New" w:cs="TH Sarabun New"/>
                 <w:b w:val="0"/>
                 <w:color w:val="404040"/>
-                <w:sz w:val="28"/>
+                <w:sz w:val="32"/>
               </w:rPr>
               <w:t>การบุกรุกในระดับผู้ใช้งาน (User Level Intrusion)</w:t>
             </w:r>
@@ -3662,9 +4092,9 @@
             <w:tcW w:type="dxa" w:w="1440"/>
             <w:vAlign w:val="center"/>
             <w:tcMar>
-              <w:top w:w="60" w:type="dxa"/>
+              <w:top w:w="20" w:type="dxa"/>
               <w:start w:w="120" w:type="dxa"/>
-              <w:bottom w:w="60" w:type="dxa"/>
+              <w:bottom w:w="20" w:type="dxa"/>
               <w:end w:w="120" w:type="dxa"/>
             </w:tcMar>
           </w:tcPr>
@@ -3678,7 +4108,7 @@
                 <w:rFonts w:ascii="TH Sarabun New" w:hAnsi="TH Sarabun New" w:cs="TH Sarabun New"/>
                 <w:b w:val="0"/>
                 <w:color w:val="404040"/>
-                <w:sz w:val="28"/>
+                <w:sz w:val="32"/>
               </w:rPr>
               <w:t>๖</w:t>
             </w:r>
@@ -3689,9 +4119,9 @@
             <w:tcW w:type="dxa" w:w="8064"/>
             <w:vAlign w:val="center"/>
             <w:tcMar>
-              <w:top w:w="60" w:type="dxa"/>
+              <w:top w:w="20" w:type="dxa"/>
               <w:start w:w="120" w:type="dxa"/>
-              <w:bottom w:w="60" w:type="dxa"/>
+              <w:bottom w:w="20" w:type="dxa"/>
               <w:end w:w="120" w:type="dxa"/>
             </w:tcMar>
           </w:tcPr>
@@ -3704,7 +4134,7 @@
                 <w:rFonts w:ascii="TH Sarabun New" w:hAnsi="TH Sarabun New" w:cs="TH Sarabun New"/>
                 <w:b w:val="0"/>
                 <w:color w:val="404040"/>
-                <w:sz w:val="28"/>
+                <w:sz w:val="32"/>
               </w:rPr>
               <w:t>การบุกรุกในระดับผู้ควบคุมระบบ (Root Level Intrusion)</w:t>
             </w:r>
@@ -3717,9 +4147,9 @@
             <w:tcW w:type="dxa" w:w="1440"/>
             <w:vAlign w:val="center"/>
             <w:tcMar>
-              <w:top w:w="60" w:type="dxa"/>
+              <w:top w:w="20" w:type="dxa"/>
               <w:start w:w="120" w:type="dxa"/>
-              <w:bottom w:w="60" w:type="dxa"/>
+              <w:bottom w:w="20" w:type="dxa"/>
               <w:end w:w="120" w:type="dxa"/>
             </w:tcMar>
           </w:tcPr>
@@ -3733,7 +4163,7 @@
                 <w:rFonts w:ascii="TH Sarabun New" w:hAnsi="TH Sarabun New" w:cs="TH Sarabun New"/>
                 <w:b w:val="0"/>
                 <w:color w:val="404040"/>
-                <w:sz w:val="28"/>
+                <w:sz w:val="32"/>
               </w:rPr>
               <w:t>๗</w:t>
             </w:r>
@@ -3744,9 +4174,9 @@
             <w:tcW w:type="dxa" w:w="8064"/>
             <w:vAlign w:val="center"/>
             <w:tcMar>
-              <w:top w:w="60" w:type="dxa"/>
+              <w:top w:w="20" w:type="dxa"/>
               <w:start w:w="120" w:type="dxa"/>
-              <w:bottom w:w="60" w:type="dxa"/>
+              <w:bottom w:w="20" w:type="dxa"/>
               <w:end w:w="120" w:type="dxa"/>
             </w:tcMar>
           </w:tcPr>
@@ -3759,7 +4189,7 @@
                 <w:rFonts w:ascii="TH Sarabun New" w:hAnsi="TH Sarabun New" w:cs="TH Sarabun New"/>
                 <w:b w:val="0"/>
                 <w:color w:val="404040"/>
-                <w:sz w:val="28"/>
+                <w:sz w:val="32"/>
               </w:rPr>
               <w:t>การบุกรุกที่ทำให้ไม่สามารถเข้าใช้บริการได้ (Denial of Service)</w:t>
             </w:r>
@@ -3772,9 +4202,9 @@
             <w:tcW w:type="dxa" w:w="1440"/>
             <w:vAlign w:val="center"/>
             <w:tcMar>
-              <w:top w:w="60" w:type="dxa"/>
+              <w:top w:w="20" w:type="dxa"/>
               <w:start w:w="120" w:type="dxa"/>
-              <w:bottom w:w="60" w:type="dxa"/>
+              <w:bottom w:w="20" w:type="dxa"/>
               <w:end w:w="120" w:type="dxa"/>
             </w:tcMar>
           </w:tcPr>
@@ -3788,7 +4218,7 @@
                 <w:rFonts w:ascii="TH Sarabun New" w:hAnsi="TH Sarabun New" w:cs="TH Sarabun New"/>
                 <w:b w:val="0"/>
                 <w:color w:val="404040"/>
-                <w:sz w:val="28"/>
+                <w:sz w:val="32"/>
               </w:rPr>
               <w:t>๘</w:t>
             </w:r>
@@ -3799,9 +4229,9 @@
             <w:tcW w:type="dxa" w:w="8064"/>
             <w:vAlign w:val="center"/>
             <w:tcMar>
-              <w:top w:w="60" w:type="dxa"/>
+              <w:top w:w="20" w:type="dxa"/>
               <w:start w:w="120" w:type="dxa"/>
-              <w:bottom w:w="60" w:type="dxa"/>
+              <w:bottom w:w="20" w:type="dxa"/>
               <w:end w:w="120" w:type="dxa"/>
             </w:tcMar>
           </w:tcPr>
@@ -3814,7 +4244,7 @@
                 <w:rFonts w:ascii="TH Sarabun New" w:hAnsi="TH Sarabun New" w:cs="TH Sarabun New"/>
                 <w:b w:val="0"/>
                 <w:color w:val="404040"/>
-                <w:sz w:val="28"/>
+                <w:sz w:val="32"/>
               </w:rPr>
               <w:t>เหตุการณ์ที่อยู่ระหว่างการวิเคราะห์สอบสวน (Investigating)</w:t>
             </w:r>
@@ -3827,9 +4257,9 @@
             <w:tcW w:type="dxa" w:w="1440"/>
             <w:vAlign w:val="center"/>
             <w:tcMar>
-              <w:top w:w="60" w:type="dxa"/>
+              <w:top w:w="20" w:type="dxa"/>
               <w:start w:w="120" w:type="dxa"/>
-              <w:bottom w:w="60" w:type="dxa"/>
+              <w:bottom w:w="20" w:type="dxa"/>
               <w:end w:w="120" w:type="dxa"/>
             </w:tcMar>
           </w:tcPr>
@@ -3843,7 +4273,7 @@
                 <w:rFonts w:ascii="TH Sarabun New" w:hAnsi="TH Sarabun New" w:cs="TH Sarabun New"/>
                 <w:b w:val="0"/>
                 <w:color w:val="404040"/>
-                <w:sz w:val="28"/>
+                <w:sz w:val="32"/>
               </w:rPr>
               <w:t>๙</w:t>
             </w:r>
@@ -3854,9 +4284,9 @@
             <w:tcW w:type="dxa" w:w="8064"/>
             <w:vAlign w:val="center"/>
             <w:tcMar>
-              <w:top w:w="60" w:type="dxa"/>
+              <w:top w:w="20" w:type="dxa"/>
               <w:start w:w="120" w:type="dxa"/>
-              <w:bottom w:w="60" w:type="dxa"/>
+              <w:bottom w:w="20" w:type="dxa"/>
               <w:end w:w="120" w:type="dxa"/>
             </w:tcMar>
           </w:tcPr>
@@ -3869,7 +4299,7 @@
                 <w:rFonts w:ascii="TH Sarabun New" w:hAnsi="TH Sarabun New" w:cs="TH Sarabun New"/>
                 <w:b w:val="0"/>
                 <w:color w:val="404040"/>
-                <w:sz w:val="28"/>
+                <w:sz w:val="32"/>
               </w:rPr>
               <w:t>เหตุการณ์ผิดปกติที่ได้รับการวิเคราะห์แล้วไม่ใช่เหตุการณ์ที่เป็นภัยคุกคาม (Explained Anomaly)</w:t>
             </w:r>
@@ -4362,12 +4792,12 @@
     <w:qFormat/>
     <w:rsid w:val="00FC693F"/>
     <w:pPr>
-      <w:spacing w:after="80" w:line="264" w:lineRule="auto"/>
+      <w:spacing w:after="0" w:line="240" w:lineRule="auto"/>
     </w:pPr>
     <w:rPr>
       <w:rFonts w:ascii="TH Sarabun New" w:hAnsi="TH Sarabun New" w:cs="TH Sarabun New"/>
       <w:color w:val="404040"/>
-      <w:sz w:val="28"/>
+      <w:sz w:val="32"/>
     </w:rPr>
   </w:style>
   <w:style w:type="paragraph" w:styleId="Header">

</xml_diff>